<commit_message>
Updated lab report and started the bom a little
</commit_message>
<xml_diff>
--- a/Lab07AReport.docx
+++ b/Lab07AReport.docx
@@ -40,7 +40,105 @@
           <w:szCs w:val="24"/>
           <w:u w:val="single"/>
         </w:rPr>
-        <w:t>__Replace with your name(s)____</w:t>
+        <w:t>__</w:t>
+      </w:r>
+      <w:r>
+        <w:rPr>
+          <w:rFonts w:ascii="Times New Roman" w:eastAsia="Times New Roman" w:hAnsi="Times New Roman"/>
+          <w:color w:val="000000"/>
+          <w:sz w:val="24"/>
+          <w:szCs w:val="24"/>
+          <w:u w:val="single"/>
+        </w:rPr>
+        <w:t xml:space="preserve">Jonathan </w:t>
+      </w:r>
+      <w:proofErr w:type="gramStart"/>
+      <w:r>
+        <w:rPr>
+          <w:rFonts w:ascii="Times New Roman" w:eastAsia="Times New Roman" w:hAnsi="Times New Roman"/>
+          <w:color w:val="000000"/>
+          <w:sz w:val="24"/>
+          <w:szCs w:val="24"/>
+          <w:u w:val="single"/>
+        </w:rPr>
+        <w:t>Simon ;</w:t>
+      </w:r>
+      <w:proofErr w:type="gramEnd"/>
+      <w:r>
+        <w:rPr>
+          <w:rFonts w:ascii="Times New Roman" w:eastAsia="Times New Roman" w:hAnsi="Times New Roman"/>
+          <w:color w:val="000000"/>
+          <w:sz w:val="24"/>
+          <w:szCs w:val="24"/>
+          <w:u w:val="single"/>
+        </w:rPr>
+        <w:t xml:space="preserve"> Egan </w:t>
+      </w:r>
+      <w:proofErr w:type="gramStart"/>
+      <w:r>
+        <w:rPr>
+          <w:rFonts w:ascii="Times New Roman" w:eastAsia="Times New Roman" w:hAnsi="Times New Roman"/>
+          <w:color w:val="000000"/>
+          <w:sz w:val="24"/>
+          <w:szCs w:val="24"/>
+          <w:u w:val="single"/>
+        </w:rPr>
+        <w:t>Wang ;</w:t>
+      </w:r>
+      <w:proofErr w:type="gramEnd"/>
+      <w:r>
+        <w:rPr>
+          <w:rFonts w:ascii="Times New Roman" w:eastAsia="Times New Roman" w:hAnsi="Times New Roman"/>
+          <w:color w:val="000000"/>
+          <w:sz w:val="24"/>
+          <w:szCs w:val="24"/>
+          <w:u w:val="single"/>
+        </w:rPr>
+        <w:t xml:space="preserve"> Aleena </w:t>
+      </w:r>
+      <w:proofErr w:type="spellStart"/>
+      <w:proofErr w:type="gramStart"/>
+      <w:r>
+        <w:rPr>
+          <w:rFonts w:ascii="Times New Roman" w:eastAsia="Times New Roman" w:hAnsi="Times New Roman"/>
+          <w:color w:val="000000"/>
+          <w:sz w:val="24"/>
+          <w:szCs w:val="24"/>
+          <w:u w:val="single"/>
+        </w:rPr>
+        <w:t>Khatum</w:t>
+      </w:r>
+      <w:proofErr w:type="spellEnd"/>
+      <w:r>
+        <w:rPr>
+          <w:rFonts w:ascii="Times New Roman" w:eastAsia="Times New Roman" w:hAnsi="Times New Roman"/>
+          <w:color w:val="000000"/>
+          <w:sz w:val="24"/>
+          <w:szCs w:val="24"/>
+          <w:u w:val="single"/>
+        </w:rPr>
+        <w:t xml:space="preserve"> ;</w:t>
+      </w:r>
+      <w:proofErr w:type="gramEnd"/>
+      <w:r>
+        <w:rPr>
+          <w:rFonts w:ascii="Times New Roman" w:eastAsia="Times New Roman" w:hAnsi="Times New Roman"/>
+          <w:color w:val="000000"/>
+          <w:sz w:val="24"/>
+          <w:szCs w:val="24"/>
+          <w:u w:val="single"/>
+        </w:rPr>
+        <w:t xml:space="preserve"> Tanai</w:t>
+      </w:r>
+      <w:r>
+        <w:rPr>
+          <w:rFonts w:ascii="Times New Roman" w:eastAsia="Times New Roman" w:hAnsi="Times New Roman"/>
+          <w:color w:val="000000"/>
+          <w:sz w:val="24"/>
+          <w:szCs w:val="24"/>
+          <w:u w:val="single"/>
+        </w:rPr>
+        <w:t>____</w:t>
       </w:r>
     </w:p>
     <w:p>
@@ -75,8 +173,9 @@
           <w:sz w:val="24"/>
           <w:szCs w:val="24"/>
         </w:rPr>
-        <w:t xml:space="preserve">EID:   </w:t>
-      </w:r>
+        <w:t>EID</w:t>
+      </w:r>
+      <w:proofErr w:type="gramStart"/>
       <w:r>
         <w:rPr>
           <w:rFonts w:ascii="Times New Roman" w:eastAsia="Times New Roman" w:hAnsi="Times New Roman"/>
@@ -84,6 +183,15 @@
           <w:sz w:val="24"/>
           <w:szCs w:val="24"/>
         </w:rPr>
+        <w:t xml:space="preserve">:   </w:t>
+      </w:r>
+      <w:r>
+        <w:rPr>
+          <w:rFonts w:ascii="Times New Roman" w:eastAsia="Times New Roman" w:hAnsi="Times New Roman"/>
+          <w:color w:val="000000"/>
+          <w:sz w:val="24"/>
+          <w:szCs w:val="24"/>
+        </w:rPr>
         <w:tab/>
       </w:r>
       <w:r>
@@ -94,7 +202,60 @@
           <w:szCs w:val="24"/>
           <w:u w:val="single"/>
         </w:rPr>
-        <w:t>__Replace with your EID(s)_____</w:t>
+        <w:t>_</w:t>
+      </w:r>
+      <w:proofErr w:type="gramEnd"/>
+      <w:r>
+        <w:rPr>
+          <w:rFonts w:ascii="Times New Roman" w:eastAsia="Times New Roman" w:hAnsi="Times New Roman"/>
+          <w:color w:val="000000"/>
+          <w:sz w:val="24"/>
+          <w:szCs w:val="24"/>
+          <w:u w:val="single"/>
+        </w:rPr>
+        <w:t>_</w:t>
+      </w:r>
+      <w:r>
+        <w:rPr>
+          <w:rFonts w:ascii="Times New Roman" w:eastAsia="Times New Roman" w:hAnsi="Times New Roman"/>
+          <w:color w:val="000000"/>
+          <w:sz w:val="24"/>
+          <w:szCs w:val="24"/>
+          <w:u w:val="single"/>
+        </w:rPr>
+        <w:t>jes</w:t>
+      </w:r>
+      <w:proofErr w:type="gramStart"/>
+      <w:r>
+        <w:rPr>
+          <w:rFonts w:ascii="Times New Roman" w:eastAsia="Times New Roman" w:hAnsi="Times New Roman"/>
+          <w:color w:val="000000"/>
+          <w:sz w:val="24"/>
+          <w:szCs w:val="24"/>
+          <w:u w:val="single"/>
+        </w:rPr>
+        <w:t>7539 ;</w:t>
+      </w:r>
+      <w:proofErr w:type="gramEnd"/>
+      <w:r>
+        <w:rPr>
+          <w:rFonts w:ascii="Times New Roman" w:eastAsia="Times New Roman" w:hAnsi="Times New Roman"/>
+          <w:color w:val="000000"/>
+          <w:sz w:val="24"/>
+          <w:szCs w:val="24"/>
+          <w:u w:val="single"/>
+        </w:rPr>
+        <w:t xml:space="preserve"> </w:t>
+      </w:r>
+      <w:r>
+        <w:rPr>
+          <w:rFonts w:ascii="Times New Roman" w:eastAsia="Times New Roman" w:hAnsi="Times New Roman"/>
+          <w:color w:val="000000"/>
+          <w:sz w:val="24"/>
+          <w:szCs w:val="24"/>
+          <w:u w:val="single"/>
+        </w:rPr>
+        <w:t>_____</w:t>
       </w:r>
     </w:p>
     <w:p>
@@ -223,7 +384,25 @@
             <w:sz w:val="24"/>
             <w:szCs w:val="24"/>
           </w:rPr>
-          <w:t>team skills contract</w:t>
+          <w:t>team sk</w:t>
+        </w:r>
+        <w:r>
+          <w:rPr>
+            <w:rStyle w:val="Hyperlink"/>
+            <w:rFonts w:ascii="Times New Roman" w:eastAsia="Times New Roman" w:hAnsi="Times New Roman"/>
+            <w:sz w:val="24"/>
+            <w:szCs w:val="24"/>
+          </w:rPr>
+          <w:t>i</w:t>
+        </w:r>
+        <w:r>
+          <w:rPr>
+            <w:rStyle w:val="Hyperlink"/>
+            <w:rFonts w:ascii="Times New Roman" w:eastAsia="Times New Roman" w:hAnsi="Times New Roman"/>
+            <w:sz w:val="24"/>
+            <w:szCs w:val="24"/>
+          </w:rPr>
+          <w:t>lls contract</w:t>
         </w:r>
       </w:hyperlink>
       <w:r>
@@ -242,6 +421,14 @@
           <w:szCs w:val="24"/>
         </w:rPr>
         <w:t>(Yes/No):</w:t>
+      </w:r>
+      <w:r>
+        <w:rPr>
+          <w:rFonts w:ascii="Times New Roman" w:hAnsi="Times New Roman"/>
+          <w:color w:val="000000"/>
+          <w:szCs w:val="24"/>
+        </w:rPr>
+        <w:t xml:space="preserve"> Yes</w:t>
       </w:r>
     </w:p>
     <w:p>
@@ -348,6 +535,14 @@
         </w:rPr>
         <w:t xml:space="preserve">(Yes/No): </w:t>
       </w:r>
+      <w:r>
+        <w:rPr>
+          <w:rFonts w:ascii="Times New Roman" w:hAnsi="Times New Roman"/>
+          <w:color w:val="000000"/>
+          <w:szCs w:val="24"/>
+        </w:rPr>
+        <w:t>Yes</w:t>
+      </w:r>
     </w:p>
     <w:p>
       <w:pPr>
@@ -433,6 +628,14 @@
           <w:szCs w:val="24"/>
         </w:rPr>
         <w:t xml:space="preserve">(Yes/No): </w:t>
+      </w:r>
+      <w:r>
+        <w:rPr>
+          <w:rFonts w:ascii="Times New Roman" w:hAnsi="Times New Roman"/>
+          <w:color w:val="000000"/>
+          <w:szCs w:val="24"/>
+        </w:rPr>
+        <w:t>Yes</w:t>
       </w:r>
     </w:p>
     <w:p>
@@ -545,6 +748,14 @@
         </w:rPr>
         <w:t xml:space="preserve">(Yes/No): </w:t>
       </w:r>
+      <w:r>
+        <w:rPr>
+          <w:rFonts w:ascii="Times New Roman" w:hAnsi="Times New Roman"/>
+          <w:color w:val="000000"/>
+          <w:szCs w:val="24"/>
+        </w:rPr>
+        <w:t>Yes</w:t>
+      </w:r>
     </w:p>
     <w:p>
       <w:pPr>
@@ -856,6 +1067,87 @@
           <w:szCs w:val="24"/>
         </w:rPr>
         <w:t xml:space="preserve">Include results of unit testing. </w:t>
+      </w:r>
+    </w:p>
+    <w:p>
+      <w:pPr>
+        <w:rPr>
+          <w:rFonts w:ascii="Times New Roman" w:hAnsi="Times New Roman"/>
+          <w:color w:val="000000"/>
+          <w:szCs w:val="24"/>
+        </w:rPr>
+      </w:pPr>
+      <w:r>
+        <w:rPr>
+          <w:rFonts w:ascii="Times New Roman" w:hAnsi="Times New Roman"/>
+          <w:color w:val="000000"/>
+          <w:szCs w:val="24"/>
+        </w:rPr>
+        <w:t xml:space="preserve">All </w:t>
+      </w:r>
+      <w:r>
+        <w:rPr>
+          <w:rFonts w:ascii="Times New Roman" w:hAnsi="Times New Roman"/>
+          <w:color w:val="000000"/>
+          <w:szCs w:val="24"/>
+        </w:rPr>
+        <w:t xml:space="preserve">unit testing was done within the same project where the main file </w:t>
+      </w:r>
+      <w:r>
+        <w:rPr>
+          <w:rFonts w:ascii="Times New Roman" w:hAnsi="Times New Roman"/>
+          <w:color w:val="000000"/>
+          <w:szCs w:val="24"/>
+        </w:rPr>
+        <w:t xml:space="preserve">had different DEBUG_MODEs to select the specific component we want to test. </w:t>
+      </w:r>
+      <w:r>
+        <w:rPr>
+          <w:rFonts w:ascii="Times New Roman" w:hAnsi="Times New Roman"/>
+          <w:color w:val="000000"/>
+          <w:szCs w:val="24"/>
+        </w:rPr>
+        <w:t xml:space="preserve">Our unit testing showed a successful toggle of the water atomizer. </w:t>
+      </w:r>
+      <w:r>
+        <w:rPr>
+          <w:rFonts w:ascii="Times New Roman" w:hAnsi="Times New Roman"/>
+          <w:color w:val="000000"/>
+          <w:szCs w:val="24"/>
+        </w:rPr>
+        <w:t xml:space="preserve">The motor and barcode reader unit testing is currently in progress. The hardware is in our </w:t>
+      </w:r>
+      <w:r>
+        <w:rPr>
+          <w:rFonts w:ascii="Times New Roman" w:hAnsi="Times New Roman"/>
+          <w:color w:val="000000"/>
+          <w:szCs w:val="24"/>
+        </w:rPr>
+        <w:t>hands,</w:t>
+      </w:r>
+      <w:r>
+        <w:rPr>
+          <w:rFonts w:ascii="Times New Roman" w:hAnsi="Times New Roman"/>
+          <w:color w:val="000000"/>
+          <w:szCs w:val="24"/>
+        </w:rPr>
+        <w:t xml:space="preserve"> and we are verifying it is functional first</w:t>
+      </w:r>
+      <w:r>
+        <w:rPr>
+          <w:rFonts w:ascii="Times New Roman" w:hAnsi="Times New Roman"/>
+          <w:color w:val="000000"/>
+          <w:szCs w:val="24"/>
+        </w:rPr>
+        <w:t xml:space="preserve"> by supplying power</w:t>
+      </w:r>
+      <w:r>
+        <w:rPr>
+          <w:rFonts w:ascii="Times New Roman" w:hAnsi="Times New Roman"/>
+          <w:color w:val="000000"/>
+          <w:szCs w:val="24"/>
+        </w:rPr>
+        <w:t>.</w:t>
       </w:r>
     </w:p>
     <w:p>
@@ -1145,6 +1437,103 @@
         <w:t>?</w:t>
       </w:r>
     </w:p>
+    <w:p>
+      <w:pPr>
+        <w:rPr>
+          <w:rFonts w:ascii="Times New Roman" w:hAnsi="Times New Roman"/>
+          <w:color w:val="000000"/>
+          <w:szCs w:val="24"/>
+        </w:rPr>
+      </w:pPr>
+      <w:r>
+        <w:rPr>
+          <w:rFonts w:ascii="Times New Roman" w:hAnsi="Times New Roman"/>
+          <w:color w:val="000000"/>
+          <w:szCs w:val="24"/>
+        </w:rPr>
+        <w:t>We completely isolated the test of each component</w:t>
+      </w:r>
+      <w:r>
+        <w:rPr>
+          <w:rFonts w:ascii="Times New Roman" w:hAnsi="Times New Roman"/>
+          <w:color w:val="000000"/>
+          <w:szCs w:val="24"/>
+        </w:rPr>
+        <w:t xml:space="preserve"> by assigning different DEBUG_MODES. In each test, only the specific component’s hardware is initialized and then tested by calling its respective functions. </w:t>
+      </w:r>
+      <w:r>
+        <w:rPr>
+          <w:rFonts w:ascii="Times New Roman" w:hAnsi="Times New Roman"/>
+          <w:color w:val="000000"/>
+          <w:szCs w:val="24"/>
+        </w:rPr>
+        <w:t xml:space="preserve">To test whether the </w:t>
+      </w:r>
+      <w:r>
+        <w:rPr>
+          <w:rFonts w:ascii="Times New Roman" w:hAnsi="Times New Roman"/>
+          <w:color w:val="000000"/>
+          <w:szCs w:val="24"/>
+        </w:rPr>
+        <w:t xml:space="preserve">microcontroller </w:t>
+      </w:r>
+      <w:r>
+        <w:rPr>
+          <w:rFonts w:ascii="Times New Roman" w:hAnsi="Times New Roman"/>
+          <w:color w:val="000000"/>
+          <w:szCs w:val="24"/>
+        </w:rPr>
+        <w:t xml:space="preserve">GPIO PA1 pin </w:t>
+      </w:r>
+      <w:r>
+        <w:rPr>
+          <w:rFonts w:ascii="Times New Roman" w:hAnsi="Times New Roman"/>
+          <w:color w:val="000000"/>
+          <w:szCs w:val="24"/>
+        </w:rPr>
+        <w:t xml:space="preserve">is properly outputting the correct voltage after </w:t>
+      </w:r>
+      <w:r>
+        <w:rPr>
+          <w:rFonts w:ascii="Times New Roman" w:hAnsi="Times New Roman"/>
+          <w:color w:val="000000"/>
+          <w:szCs w:val="24"/>
+        </w:rPr>
+        <w:t xml:space="preserve">every </w:t>
+      </w:r>
+      <w:r>
+        <w:rPr>
+          <w:rFonts w:ascii="Times New Roman" w:hAnsi="Times New Roman"/>
+          <w:color w:val="000000"/>
+          <w:szCs w:val="24"/>
+        </w:rPr>
+        <w:t>5 seconds, we used a DVM to measure the output voltage.</w:t>
+      </w:r>
+      <w:r>
+        <w:rPr>
+          <w:rFonts w:ascii="Times New Roman" w:hAnsi="Times New Roman"/>
+          <w:color w:val="000000"/>
+          <w:szCs w:val="24"/>
+        </w:rPr>
+        <w:t xml:space="preserve"> The mister’s board came with an LED that showed the state it is in and aided in our debugging to understand what the board is attempting to do.</w:t>
+      </w:r>
+      <w:r>
+        <w:rPr>
+          <w:rFonts w:ascii="Times New Roman" w:hAnsi="Times New Roman"/>
+          <w:color w:val="000000"/>
+          <w:szCs w:val="24"/>
+        </w:rPr>
+        <w:t xml:space="preserve"> The DVM is not intrusive as it is just reading the voltage out of the GPIO pin</w:t>
+      </w:r>
+      <w:r>
+        <w:rPr>
+          <w:rFonts w:ascii="Times New Roman" w:hAnsi="Times New Roman"/>
+          <w:color w:val="000000"/>
+          <w:szCs w:val="24"/>
+        </w:rPr>
+        <w:t>.</w:t>
+      </w:r>
+    </w:p>
     <w:bookmarkEnd w:id="1"/>
     <w:p>
       <w:pPr>
@@ -1168,6 +1557,7 @@
           <w:sz w:val="24"/>
           <w:szCs w:val="24"/>
         </w:rPr>
+        <w:lastRenderedPageBreak/>
         <w:t>What</w:t>
       </w:r>
       <w:r>
@@ -1219,14 +1609,140 @@
     </w:p>
     <w:p>
       <w:pPr>
-        <w:pStyle w:val="ListParagraph"/>
-        <w:rPr>
-          <w:rFonts w:ascii="Times New Roman" w:hAnsi="Times New Roman"/>
-          <w:color w:val="000000"/>
-          <w:sz w:val="24"/>
-          <w:szCs w:val="24"/>
-        </w:rPr>
-      </w:pPr>
+        <w:rPr>
+          <w:rFonts w:ascii="Times New Roman" w:hAnsi="Times New Roman"/>
+          <w:color w:val="000000"/>
+          <w:szCs w:val="24"/>
+        </w:rPr>
+      </w:pPr>
+      <w:r>
+        <w:rPr>
+          <w:rFonts w:ascii="Times New Roman" w:hAnsi="Times New Roman"/>
+          <w:color w:val="000000"/>
+          <w:szCs w:val="24"/>
+        </w:rPr>
+        <w:t xml:space="preserve">Unit testing tests the individual modules </w:t>
+      </w:r>
+      <w:r>
+        <w:rPr>
+          <w:rFonts w:ascii="Times New Roman" w:hAnsi="Times New Roman"/>
+          <w:color w:val="000000"/>
+          <w:szCs w:val="24"/>
+        </w:rPr>
+        <w:t xml:space="preserve">completely isolated </w:t>
+      </w:r>
+      <w:r>
+        <w:rPr>
+          <w:rFonts w:ascii="Times New Roman" w:hAnsi="Times New Roman"/>
+          <w:color w:val="000000"/>
+          <w:szCs w:val="24"/>
+        </w:rPr>
+        <w:t>from</w:t>
+      </w:r>
+      <w:r>
+        <w:rPr>
+          <w:rFonts w:ascii="Times New Roman" w:hAnsi="Times New Roman"/>
+          <w:color w:val="000000"/>
+          <w:szCs w:val="24"/>
+        </w:rPr>
+        <w:t xml:space="preserve"> the other modules. Integration testing</w:t>
+      </w:r>
+      <w:r>
+        <w:rPr>
+          <w:rFonts w:ascii="Times New Roman" w:hAnsi="Times New Roman"/>
+          <w:color w:val="000000"/>
+          <w:szCs w:val="24"/>
+        </w:rPr>
+        <w:t xml:space="preserve"> puts all the </w:t>
+      </w:r>
+      <w:r>
+        <w:rPr>
+          <w:rFonts w:ascii="Times New Roman" w:hAnsi="Times New Roman"/>
+          <w:color w:val="000000"/>
+          <w:szCs w:val="24"/>
+        </w:rPr>
+        <w:t>modules</w:t>
+      </w:r>
+      <w:r>
+        <w:rPr>
+          <w:rFonts w:ascii="Times New Roman" w:hAnsi="Times New Roman"/>
+          <w:color w:val="000000"/>
+          <w:szCs w:val="24"/>
+        </w:rPr>
+        <w:t xml:space="preserve"> together and </w:t>
+      </w:r>
+      <w:r>
+        <w:rPr>
+          <w:rFonts w:ascii="Times New Roman" w:hAnsi="Times New Roman"/>
+          <w:color w:val="000000"/>
+          <w:szCs w:val="24"/>
+        </w:rPr>
+        <w:t>to validate</w:t>
+      </w:r>
+      <w:r>
+        <w:rPr>
+          <w:rFonts w:ascii="Times New Roman" w:hAnsi="Times New Roman"/>
+          <w:color w:val="000000"/>
+          <w:szCs w:val="24"/>
+        </w:rPr>
+        <w:t xml:space="preserve"> </w:t>
+      </w:r>
+      <w:r>
+        <w:rPr>
+          <w:rFonts w:ascii="Times New Roman" w:hAnsi="Times New Roman"/>
+          <w:color w:val="000000"/>
+          <w:szCs w:val="24"/>
+        </w:rPr>
+        <w:t>that</w:t>
+      </w:r>
+      <w:r>
+        <w:rPr>
+          <w:rFonts w:ascii="Times New Roman" w:hAnsi="Times New Roman"/>
+          <w:color w:val="000000"/>
+          <w:szCs w:val="24"/>
+        </w:rPr>
+        <w:t xml:space="preserve"> they </w:t>
+      </w:r>
+      <w:r>
+        <w:rPr>
+          <w:rFonts w:ascii="Times New Roman" w:hAnsi="Times New Roman"/>
+          <w:color w:val="000000"/>
+          <w:szCs w:val="24"/>
+        </w:rPr>
+        <w:t>can</w:t>
+      </w:r>
+      <w:r>
+        <w:rPr>
+          <w:rFonts w:ascii="Times New Roman" w:hAnsi="Times New Roman"/>
+          <w:color w:val="000000"/>
+          <w:szCs w:val="24"/>
+        </w:rPr>
+        <w:t xml:space="preserve"> coordinate their tasks at the appropriate time</w:t>
+      </w:r>
+      <w:r>
+        <w:rPr>
+          <w:rFonts w:ascii="Times New Roman" w:hAnsi="Times New Roman"/>
+          <w:color w:val="000000"/>
+          <w:szCs w:val="24"/>
+        </w:rPr>
+        <w:t xml:space="preserve">. Functional testing tests if </w:t>
+      </w:r>
+      <w:r>
+        <w:rPr>
+          <w:rFonts w:ascii="Times New Roman" w:hAnsi="Times New Roman"/>
+          <w:color w:val="000000"/>
+          <w:szCs w:val="24"/>
+        </w:rPr>
+        <w:t>all</w:t>
+      </w:r>
+      <w:r>
+        <w:rPr>
+          <w:rFonts w:ascii="Times New Roman" w:hAnsi="Times New Roman"/>
+          <w:color w:val="000000"/>
+          <w:szCs w:val="24"/>
+        </w:rPr>
+        <w:t xml:space="preserve"> their outputs when working together are all valid and expected outputs.</w:t>
+      </w:r>
     </w:p>
     <w:sectPr>
       <w:headerReference w:type="even" r:id="rId9"/>

</xml_diff>

<commit_message>
current chart added into report
</commit_message>
<xml_diff>
--- a/Lab07AReport.docx
+++ b/Lab07AReport.docx
@@ -384,25 +384,7 @@
             <w:sz w:val="24"/>
             <w:szCs w:val="24"/>
           </w:rPr>
-          <w:t>team sk</w:t>
-        </w:r>
-        <w:r>
-          <w:rPr>
-            <w:rStyle w:val="Hyperlink"/>
-            <w:rFonts w:ascii="Times New Roman" w:eastAsia="Times New Roman" w:hAnsi="Times New Roman"/>
-            <w:sz w:val="24"/>
-            <w:szCs w:val="24"/>
-          </w:rPr>
-          <w:t>i</w:t>
-        </w:r>
-        <w:r>
-          <w:rPr>
-            <w:rStyle w:val="Hyperlink"/>
-            <w:rFonts w:ascii="Times New Roman" w:eastAsia="Times New Roman" w:hAnsi="Times New Roman"/>
-            <w:sz w:val="24"/>
-            <w:szCs w:val="24"/>
-          </w:rPr>
-          <w:t>lls contract</w:t>
+          <w:t>team skills contract</w:t>
         </w:r>
       </w:hyperlink>
       <w:r>
@@ -872,20 +854,12 @@
       <w:pPr>
         <w:rPr>
           <w:rFonts w:ascii="Times New Roman" w:hAnsi="Times New Roman"/>
-          <w:color w:val="000000"/>
-          <w:szCs w:val="24"/>
-        </w:rPr>
-      </w:pPr>
-      <w:r>
-        <w:rPr>
-          <w:rFonts w:ascii="Times New Roman" w:hAnsi="Times New Roman"/>
           <w:b/>
           <w:bCs/>
           <w:color w:val="000000"/>
           <w:szCs w:val="24"/>
         </w:rPr>
-        <w:t xml:space="preserve">Deliverable </w:t>
-      </w:r>
+      </w:pPr>
       <w:r>
         <w:rPr>
           <w:rFonts w:ascii="Times New Roman" w:hAnsi="Times New Roman"/>
@@ -894,6 +868,36 @@
           <w:color w:val="000000"/>
           <w:szCs w:val="24"/>
         </w:rPr>
+        <w:br w:type="page"/>
+      </w:r>
+    </w:p>
+    <w:p>
+      <w:pPr>
+        <w:rPr>
+          <w:rFonts w:ascii="Times New Roman" w:hAnsi="Times New Roman"/>
+          <w:color w:val="000000"/>
+          <w:szCs w:val="24"/>
+        </w:rPr>
+      </w:pPr>
+      <w:r>
+        <w:rPr>
+          <w:rFonts w:ascii="Times New Roman" w:hAnsi="Times New Roman"/>
+          <w:b/>
+          <w:bCs/>
+          <w:color w:val="000000"/>
+          <w:szCs w:val="24"/>
+        </w:rPr>
+        <w:lastRenderedPageBreak/>
+        <w:t xml:space="preserve">Deliverable </w:t>
+      </w:r>
+      <w:r>
+        <w:rPr>
+          <w:rFonts w:ascii="Times New Roman" w:hAnsi="Times New Roman"/>
+          <w:b/>
+          <w:bCs/>
+          <w:color w:val="000000"/>
+          <w:szCs w:val="24"/>
+        </w:rPr>
         <w:t>5</w:t>
       </w:r>
       <w:r>
@@ -912,6 +916,4411 @@
         </w:rPr>
         <w:t xml:space="preserve">List the needed supply voltages and estimated current for each voltage (show how these were determined). </w:t>
       </w:r>
+    </w:p>
+    <w:tbl>
+      <w:tblPr>
+        <w:tblStyle w:val="GridTable1Light-Accent1"/>
+        <w:tblW w:w="0" w:type="auto"/>
+        <w:tblLook w:val="04A0" w:firstRow="1" w:lastRow="0" w:firstColumn="1" w:lastColumn="0" w:noHBand="0" w:noVBand="1"/>
+      </w:tblPr>
+      <w:tblGrid>
+        <w:gridCol w:w="937"/>
+        <w:gridCol w:w="1719"/>
+        <w:gridCol w:w="885"/>
+        <w:gridCol w:w="886"/>
+        <w:gridCol w:w="1090"/>
+        <w:gridCol w:w="3833"/>
+      </w:tblGrid>
+      <w:tr>
+        <w:trPr>
+          <w:cnfStyle w:val="100000000000" w:firstRow="1" w:lastRow="0" w:firstColumn="0" w:lastColumn="0" w:oddVBand="0" w:evenVBand="0" w:oddHBand="0" w:evenHBand="0" w:firstRowFirstColumn="0" w:firstRowLastColumn="0" w:lastRowFirstColumn="0" w:lastRowLastColumn="0"/>
+        </w:trPr>
+        <w:tc>
+          <w:tcPr>
+            <w:cnfStyle w:val="001000000000" w:firstRow="0" w:lastRow="0" w:firstColumn="1" w:lastColumn="0" w:oddVBand="0" w:evenVBand="0" w:oddHBand="0" w:evenHBand="0" w:firstRowFirstColumn="0" w:firstRowLastColumn="0" w:lastRowFirstColumn="0" w:lastRowLastColumn="0"/>
+            <w:tcW w:w="0" w:type="auto"/>
+            <w:hideMark/>
+          </w:tcPr>
+          <w:p>
+            <w:pPr>
+              <w:suppressAutoHyphens w:val="0"/>
+              <w:jc w:val="center"/>
+              <w:rPr>
+                <w:rFonts w:ascii="Times New Roman" w:hAnsi="Times New Roman"/>
+                <w:szCs w:val="24"/>
+              </w:rPr>
+            </w:pPr>
+            <w:r>
+              <w:rPr>
+                <w:rFonts w:ascii="Times New Roman" w:hAnsi="Times New Roman"/>
+                <w:szCs w:val="24"/>
+              </w:rPr>
+              <w:t>Rail</w:t>
+            </w:r>
+          </w:p>
+        </w:tc>
+        <w:tc>
+          <w:tcPr>
+            <w:tcW w:w="1719" w:type="dxa"/>
+            <w:hideMark/>
+          </w:tcPr>
+          <w:p>
+            <w:pPr>
+              <w:suppressAutoHyphens w:val="0"/>
+              <w:jc w:val="center"/>
+              <w:cnfStyle w:val="100000000000" w:firstRow="1" w:lastRow="0" w:firstColumn="0" w:lastColumn="0" w:oddVBand="0" w:evenVBand="0" w:oddHBand="0" w:evenHBand="0" w:firstRowFirstColumn="0" w:firstRowLastColumn="0" w:lastRowFirstColumn="0" w:lastRowLastColumn="0"/>
+              <w:rPr>
+                <w:rFonts w:ascii="Times New Roman" w:hAnsi="Times New Roman"/>
+                <w:szCs w:val="24"/>
+              </w:rPr>
+            </w:pPr>
+            <w:r>
+              <w:rPr>
+                <w:rFonts w:ascii="Times New Roman" w:hAnsi="Times New Roman"/>
+                <w:szCs w:val="24"/>
+              </w:rPr>
+              <w:t>Subcomponent</w:t>
+            </w:r>
+          </w:p>
+        </w:tc>
+        <w:tc>
+          <w:tcPr>
+            <w:tcW w:w="885" w:type="dxa"/>
+            <w:hideMark/>
+          </w:tcPr>
+          <w:p>
+            <w:pPr>
+              <w:suppressAutoHyphens w:val="0"/>
+              <w:jc w:val="right"/>
+              <w:cnfStyle w:val="100000000000" w:firstRow="1" w:lastRow="0" w:firstColumn="0" w:lastColumn="0" w:oddVBand="0" w:evenVBand="0" w:oddHBand="0" w:evenHBand="0" w:firstRowFirstColumn="0" w:firstRowLastColumn="0" w:lastRowFirstColumn="0" w:lastRowLastColumn="0"/>
+              <w:rPr>
+                <w:rFonts w:ascii="Times New Roman" w:hAnsi="Times New Roman"/>
+                <w:szCs w:val="24"/>
+              </w:rPr>
+            </w:pPr>
+            <w:r>
+              <w:rPr>
+                <w:rFonts w:ascii="Times New Roman" w:hAnsi="Times New Roman"/>
+                <w:szCs w:val="24"/>
+              </w:rPr>
+              <w:t>Active current (mA)</w:t>
+            </w:r>
+          </w:p>
+        </w:tc>
+        <w:tc>
+          <w:tcPr>
+            <w:tcW w:w="0" w:type="auto"/>
+            <w:hideMark/>
+          </w:tcPr>
+          <w:p>
+            <w:pPr>
+              <w:suppressAutoHyphens w:val="0"/>
+              <w:jc w:val="right"/>
+              <w:cnfStyle w:val="100000000000" w:firstRow="1" w:lastRow="0" w:firstColumn="0" w:lastColumn="0" w:oddVBand="0" w:evenVBand="0" w:oddHBand="0" w:evenHBand="0" w:firstRowFirstColumn="0" w:firstRowLastColumn="0" w:lastRowFirstColumn="0" w:lastRowLastColumn="0"/>
+              <w:rPr>
+                <w:rFonts w:ascii="Times New Roman" w:hAnsi="Times New Roman"/>
+                <w:szCs w:val="24"/>
+              </w:rPr>
+            </w:pPr>
+            <w:r>
+              <w:rPr>
+                <w:rFonts w:ascii="Times New Roman" w:hAnsi="Times New Roman"/>
+                <w:szCs w:val="24"/>
+              </w:rPr>
+              <w:t>Idle current (mA)</w:t>
+            </w:r>
+          </w:p>
+        </w:tc>
+        <w:tc>
+          <w:tcPr>
+            <w:tcW w:w="0" w:type="auto"/>
+            <w:hideMark/>
+          </w:tcPr>
+          <w:p>
+            <w:pPr>
+              <w:suppressAutoHyphens w:val="0"/>
+              <w:jc w:val="right"/>
+              <w:cnfStyle w:val="100000000000" w:firstRow="1" w:lastRow="0" w:firstColumn="0" w:lastColumn="0" w:oddVBand="0" w:evenVBand="0" w:oddHBand="0" w:evenHBand="0" w:firstRowFirstColumn="0" w:firstRowLastColumn="0" w:lastRowFirstColumn="0" w:lastRowLastColumn="0"/>
+              <w:rPr>
+                <w:rFonts w:ascii="Times New Roman" w:hAnsi="Times New Roman"/>
+                <w:szCs w:val="24"/>
+              </w:rPr>
+            </w:pPr>
+            <w:r>
+              <w:rPr>
+                <w:rFonts w:ascii="Times New Roman" w:hAnsi="Times New Roman"/>
+                <w:szCs w:val="24"/>
+              </w:rPr>
+              <w:t>Design-check current (mA)</w:t>
+            </w:r>
+          </w:p>
+        </w:tc>
+        <w:tc>
+          <w:tcPr>
+            <w:tcW w:w="0" w:type="auto"/>
+            <w:hideMark/>
+          </w:tcPr>
+          <w:p>
+            <w:pPr>
+              <w:suppressAutoHyphens w:val="0"/>
+              <w:jc w:val="center"/>
+              <w:cnfStyle w:val="100000000000" w:firstRow="1" w:lastRow="0" w:firstColumn="0" w:lastColumn="0" w:oddVBand="0" w:evenVBand="0" w:oddHBand="0" w:evenHBand="0" w:firstRowFirstColumn="0" w:firstRowLastColumn="0" w:lastRowFirstColumn="0" w:lastRowLastColumn="0"/>
+              <w:rPr>
+                <w:rFonts w:ascii="Times New Roman" w:hAnsi="Times New Roman"/>
+                <w:szCs w:val="24"/>
+              </w:rPr>
+            </w:pPr>
+            <w:r>
+              <w:rPr>
+                <w:rFonts w:ascii="Times New Roman" w:hAnsi="Times New Roman"/>
+                <w:szCs w:val="24"/>
+              </w:rPr>
+              <w:t>Basis or calculation</w:t>
+            </w:r>
+          </w:p>
+        </w:tc>
+      </w:tr>
+      <w:tr>
+        <w:tc>
+          <w:tcPr>
+            <w:cnfStyle w:val="001000000000" w:firstRow="0" w:lastRow="0" w:firstColumn="1" w:lastColumn="0" w:oddVBand="0" w:evenVBand="0" w:oddHBand="0" w:evenHBand="0" w:firstRowFirstColumn="0" w:firstRowLastColumn="0" w:lastRowFirstColumn="0" w:lastRowLastColumn="0"/>
+            <w:tcW w:w="0" w:type="auto"/>
+            <w:hideMark/>
+          </w:tcPr>
+          <w:p>
+            <w:pPr>
+              <w:suppressAutoHyphens w:val="0"/>
+              <w:rPr>
+                <w:rFonts w:ascii="Times New Roman" w:hAnsi="Times New Roman"/>
+                <w:szCs w:val="24"/>
+              </w:rPr>
+            </w:pPr>
+            <w:r>
+              <w:rPr>
+                <w:rFonts w:ascii="Times New Roman" w:hAnsi="Times New Roman"/>
+                <w:szCs w:val="24"/>
+              </w:rPr>
+              <w:t>3.3 V</w:t>
+            </w:r>
+          </w:p>
+        </w:tc>
+        <w:tc>
+          <w:tcPr>
+            <w:tcW w:w="1719" w:type="dxa"/>
+            <w:hideMark/>
+          </w:tcPr>
+          <w:p>
+            <w:pPr>
+              <w:suppressAutoHyphens w:val="0"/>
+              <w:cnfStyle w:val="000000000000" w:firstRow="0" w:lastRow="0" w:firstColumn="0" w:lastColumn="0" w:oddVBand="0" w:evenVBand="0" w:oddHBand="0" w:evenHBand="0" w:firstRowFirstColumn="0" w:firstRowLastColumn="0" w:lastRowFirstColumn="0" w:lastRowLastColumn="0"/>
+              <w:rPr>
+                <w:rFonts w:ascii="Times New Roman" w:hAnsi="Times New Roman"/>
+                <w:szCs w:val="24"/>
+              </w:rPr>
+            </w:pPr>
+            <w:r>
+              <w:rPr>
+                <w:rFonts w:ascii="Times New Roman" w:hAnsi="Times New Roman"/>
+                <w:szCs w:val="24"/>
+              </w:rPr>
+              <w:t>uC1</w:t>
+            </w:r>
+          </w:p>
+        </w:tc>
+        <w:tc>
+          <w:tcPr>
+            <w:tcW w:w="885" w:type="dxa"/>
+            <w:hideMark/>
+          </w:tcPr>
+          <w:p>
+            <w:pPr>
+              <w:suppressAutoHyphens w:val="0"/>
+              <w:jc w:val="right"/>
+              <w:cnfStyle w:val="000000000000" w:firstRow="0" w:lastRow="0" w:firstColumn="0" w:lastColumn="0" w:oddVBand="0" w:evenVBand="0" w:oddHBand="0" w:evenHBand="0" w:firstRowFirstColumn="0" w:firstRowLastColumn="0" w:lastRowFirstColumn="0" w:lastRowLastColumn="0"/>
+              <w:rPr>
+                <w:rFonts w:ascii="Times New Roman" w:hAnsi="Times New Roman"/>
+                <w:szCs w:val="24"/>
+              </w:rPr>
+            </w:pPr>
+            <w:r>
+              <w:rPr>
+                <w:rFonts w:ascii="Times New Roman" w:hAnsi="Times New Roman"/>
+                <w:szCs w:val="24"/>
+              </w:rPr>
+              <w:t>8.1</w:t>
+            </w:r>
+          </w:p>
+        </w:tc>
+        <w:tc>
+          <w:tcPr>
+            <w:tcW w:w="0" w:type="auto"/>
+            <w:hideMark/>
+          </w:tcPr>
+          <w:p>
+            <w:pPr>
+              <w:suppressAutoHyphens w:val="0"/>
+              <w:jc w:val="right"/>
+              <w:cnfStyle w:val="000000000000" w:firstRow="0" w:lastRow="0" w:firstColumn="0" w:lastColumn="0" w:oddVBand="0" w:evenVBand="0" w:oddHBand="0" w:evenHBand="0" w:firstRowFirstColumn="0" w:firstRowLastColumn="0" w:lastRowFirstColumn="0" w:lastRowLastColumn="0"/>
+              <w:rPr>
+                <w:rFonts w:ascii="Times New Roman" w:hAnsi="Times New Roman"/>
+                <w:szCs w:val="24"/>
+              </w:rPr>
+            </w:pPr>
+            <w:r>
+              <w:rPr>
+                <w:rFonts w:ascii="Times New Roman" w:hAnsi="Times New Roman"/>
+                <w:szCs w:val="24"/>
+              </w:rPr>
+              <w:t>8.1</w:t>
+            </w:r>
+          </w:p>
+        </w:tc>
+        <w:tc>
+          <w:tcPr>
+            <w:tcW w:w="0" w:type="auto"/>
+            <w:hideMark/>
+          </w:tcPr>
+          <w:p>
+            <w:pPr>
+              <w:suppressAutoHyphens w:val="0"/>
+              <w:jc w:val="right"/>
+              <w:cnfStyle w:val="000000000000" w:firstRow="0" w:lastRow="0" w:firstColumn="0" w:lastColumn="0" w:oddVBand="0" w:evenVBand="0" w:oddHBand="0" w:evenHBand="0" w:firstRowFirstColumn="0" w:firstRowLastColumn="0" w:lastRowFirstColumn="0" w:lastRowLastColumn="0"/>
+              <w:rPr>
+                <w:rFonts w:ascii="Times New Roman" w:hAnsi="Times New Roman"/>
+                <w:szCs w:val="24"/>
+              </w:rPr>
+            </w:pPr>
+            <w:r>
+              <w:rPr>
+                <w:rFonts w:ascii="Times New Roman" w:hAnsi="Times New Roman"/>
+                <w:szCs w:val="24"/>
+              </w:rPr>
+              <w:t>12</w:t>
+            </w:r>
+          </w:p>
+        </w:tc>
+        <w:tc>
+          <w:tcPr>
+            <w:tcW w:w="0" w:type="auto"/>
+            <w:hideMark/>
+          </w:tcPr>
+          <w:p>
+            <w:pPr>
+              <w:suppressAutoHyphens w:val="0"/>
+              <w:cnfStyle w:val="000000000000" w:firstRow="0" w:lastRow="0" w:firstColumn="0" w:lastColumn="0" w:oddVBand="0" w:evenVBand="0" w:oddHBand="0" w:evenHBand="0" w:firstRowFirstColumn="0" w:firstRowLastColumn="0" w:lastRowFirstColumn="0" w:lastRowLastColumn="0"/>
+              <w:rPr>
+                <w:rFonts w:ascii="Times New Roman" w:hAnsi="Times New Roman"/>
+                <w:szCs w:val="24"/>
+              </w:rPr>
+            </w:pPr>
+            <w:r>
+              <w:rPr>
+                <w:rFonts w:ascii="Times New Roman" w:hAnsi="Times New Roman"/>
+                <w:szCs w:val="24"/>
+              </w:rPr>
+              <w:t>Active: 1 MCU x 8.1 mA = 8.1 mA, D typical reference. Idle: same RUN-current allowance = 8.1 mA, A; sleep is not established. Design: 1 x 12 mA = 12 mA, A.</w:t>
+            </w:r>
+          </w:p>
+        </w:tc>
+      </w:tr>
+      <w:tr>
+        <w:tc>
+          <w:tcPr>
+            <w:cnfStyle w:val="001000000000" w:firstRow="0" w:lastRow="0" w:firstColumn="1" w:lastColumn="0" w:oddVBand="0" w:evenVBand="0" w:oddHBand="0" w:evenHBand="0" w:firstRowFirstColumn="0" w:firstRowLastColumn="0" w:lastRowFirstColumn="0" w:lastRowLastColumn="0"/>
+            <w:tcW w:w="0" w:type="auto"/>
+            <w:hideMark/>
+          </w:tcPr>
+          <w:p>
+            <w:pPr>
+              <w:suppressAutoHyphens w:val="0"/>
+              <w:rPr>
+                <w:rFonts w:ascii="Times New Roman" w:hAnsi="Times New Roman"/>
+                <w:szCs w:val="24"/>
+              </w:rPr>
+            </w:pPr>
+            <w:r>
+              <w:rPr>
+                <w:rFonts w:ascii="Times New Roman" w:hAnsi="Times New Roman"/>
+                <w:szCs w:val="24"/>
+              </w:rPr>
+              <w:t>3.3 V</w:t>
+            </w:r>
+          </w:p>
+        </w:tc>
+        <w:tc>
+          <w:tcPr>
+            <w:tcW w:w="1719" w:type="dxa"/>
+            <w:hideMark/>
+          </w:tcPr>
+          <w:p>
+            <w:pPr>
+              <w:suppressAutoHyphens w:val="0"/>
+              <w:cnfStyle w:val="000000000000" w:firstRow="0" w:lastRow="0" w:firstColumn="0" w:lastColumn="0" w:oddVBand="0" w:evenVBand="0" w:oddHBand="0" w:evenHBand="0" w:firstRowFirstColumn="0" w:firstRowLastColumn="0" w:lastRowFirstColumn="0" w:lastRowLastColumn="0"/>
+              <w:rPr>
+                <w:rFonts w:ascii="Times New Roman" w:hAnsi="Times New Roman"/>
+                <w:szCs w:val="24"/>
+              </w:rPr>
+            </w:pPr>
+            <w:r>
+              <w:rPr>
+                <w:rFonts w:ascii="Times New Roman" w:hAnsi="Times New Roman"/>
+                <w:szCs w:val="24"/>
+              </w:rPr>
+              <w:t>uC2</w:t>
+            </w:r>
+          </w:p>
+        </w:tc>
+        <w:tc>
+          <w:tcPr>
+            <w:tcW w:w="885" w:type="dxa"/>
+            <w:hideMark/>
+          </w:tcPr>
+          <w:p>
+            <w:pPr>
+              <w:suppressAutoHyphens w:val="0"/>
+              <w:jc w:val="right"/>
+              <w:cnfStyle w:val="000000000000" w:firstRow="0" w:lastRow="0" w:firstColumn="0" w:lastColumn="0" w:oddVBand="0" w:evenVBand="0" w:oddHBand="0" w:evenHBand="0" w:firstRowFirstColumn="0" w:firstRowLastColumn="0" w:lastRowFirstColumn="0" w:lastRowLastColumn="0"/>
+              <w:rPr>
+                <w:rFonts w:ascii="Times New Roman" w:hAnsi="Times New Roman"/>
+                <w:szCs w:val="24"/>
+              </w:rPr>
+            </w:pPr>
+            <w:r>
+              <w:rPr>
+                <w:rFonts w:ascii="Times New Roman" w:hAnsi="Times New Roman"/>
+                <w:szCs w:val="24"/>
+              </w:rPr>
+              <w:t>8.1</w:t>
+            </w:r>
+          </w:p>
+        </w:tc>
+        <w:tc>
+          <w:tcPr>
+            <w:tcW w:w="0" w:type="auto"/>
+            <w:hideMark/>
+          </w:tcPr>
+          <w:p>
+            <w:pPr>
+              <w:suppressAutoHyphens w:val="0"/>
+              <w:jc w:val="right"/>
+              <w:cnfStyle w:val="000000000000" w:firstRow="0" w:lastRow="0" w:firstColumn="0" w:lastColumn="0" w:oddVBand="0" w:evenVBand="0" w:oddHBand="0" w:evenHBand="0" w:firstRowFirstColumn="0" w:firstRowLastColumn="0" w:lastRowFirstColumn="0" w:lastRowLastColumn="0"/>
+              <w:rPr>
+                <w:rFonts w:ascii="Times New Roman" w:hAnsi="Times New Roman"/>
+                <w:szCs w:val="24"/>
+              </w:rPr>
+            </w:pPr>
+            <w:r>
+              <w:rPr>
+                <w:rFonts w:ascii="Times New Roman" w:hAnsi="Times New Roman"/>
+                <w:szCs w:val="24"/>
+              </w:rPr>
+              <w:t>8.1</w:t>
+            </w:r>
+          </w:p>
+        </w:tc>
+        <w:tc>
+          <w:tcPr>
+            <w:tcW w:w="0" w:type="auto"/>
+            <w:hideMark/>
+          </w:tcPr>
+          <w:p>
+            <w:pPr>
+              <w:suppressAutoHyphens w:val="0"/>
+              <w:jc w:val="right"/>
+              <w:cnfStyle w:val="000000000000" w:firstRow="0" w:lastRow="0" w:firstColumn="0" w:lastColumn="0" w:oddVBand="0" w:evenVBand="0" w:oddHBand="0" w:evenHBand="0" w:firstRowFirstColumn="0" w:firstRowLastColumn="0" w:lastRowFirstColumn="0" w:lastRowLastColumn="0"/>
+              <w:rPr>
+                <w:rFonts w:ascii="Times New Roman" w:hAnsi="Times New Roman"/>
+                <w:szCs w:val="24"/>
+              </w:rPr>
+            </w:pPr>
+            <w:r>
+              <w:rPr>
+                <w:rFonts w:ascii="Times New Roman" w:hAnsi="Times New Roman"/>
+                <w:szCs w:val="24"/>
+              </w:rPr>
+              <w:t>12</w:t>
+            </w:r>
+          </w:p>
+        </w:tc>
+        <w:tc>
+          <w:tcPr>
+            <w:tcW w:w="0" w:type="auto"/>
+            <w:hideMark/>
+          </w:tcPr>
+          <w:p>
+            <w:pPr>
+              <w:suppressAutoHyphens w:val="0"/>
+              <w:cnfStyle w:val="000000000000" w:firstRow="0" w:lastRow="0" w:firstColumn="0" w:lastColumn="0" w:oddVBand="0" w:evenVBand="0" w:oddHBand="0" w:evenHBand="0" w:firstRowFirstColumn="0" w:firstRowLastColumn="0" w:lastRowFirstColumn="0" w:lastRowLastColumn="0"/>
+              <w:rPr>
+                <w:rFonts w:ascii="Times New Roman" w:hAnsi="Times New Roman"/>
+                <w:szCs w:val="24"/>
+              </w:rPr>
+            </w:pPr>
+            <w:r>
+              <w:rPr>
+                <w:rFonts w:ascii="Times New Roman" w:hAnsi="Times New Roman"/>
+                <w:szCs w:val="24"/>
+              </w:rPr>
+              <w:t>Active: 1 MCU x 8.1 mA = 8.1 mA, D typical reference. Idle: same RUN-current allowance = 8.1 mA, A. Design: 1 x 12 mA = 12 mA, A.</w:t>
+            </w:r>
+          </w:p>
+        </w:tc>
+      </w:tr>
+      <w:tr>
+        <w:tc>
+          <w:tcPr>
+            <w:cnfStyle w:val="001000000000" w:firstRow="0" w:lastRow="0" w:firstColumn="1" w:lastColumn="0" w:oddVBand="0" w:evenVBand="0" w:oddHBand="0" w:evenHBand="0" w:firstRowFirstColumn="0" w:firstRowLastColumn="0" w:lastRowFirstColumn="0" w:lastRowLastColumn="0"/>
+            <w:tcW w:w="0" w:type="auto"/>
+            <w:hideMark/>
+          </w:tcPr>
+          <w:p>
+            <w:pPr>
+              <w:suppressAutoHyphens w:val="0"/>
+              <w:rPr>
+                <w:rFonts w:ascii="Times New Roman" w:hAnsi="Times New Roman"/>
+                <w:szCs w:val="24"/>
+              </w:rPr>
+            </w:pPr>
+            <w:r>
+              <w:rPr>
+                <w:rFonts w:ascii="Times New Roman" w:hAnsi="Times New Roman"/>
+                <w:szCs w:val="24"/>
+              </w:rPr>
+              <w:t>3.3 V</w:t>
+            </w:r>
+          </w:p>
+        </w:tc>
+        <w:tc>
+          <w:tcPr>
+            <w:tcW w:w="1719" w:type="dxa"/>
+            <w:hideMark/>
+          </w:tcPr>
+          <w:p>
+            <w:pPr>
+              <w:suppressAutoHyphens w:val="0"/>
+              <w:cnfStyle w:val="000000000000" w:firstRow="0" w:lastRow="0" w:firstColumn="0" w:lastColumn="0" w:oddVBand="0" w:evenVBand="0" w:oddHBand="0" w:evenHBand="0" w:firstRowFirstColumn="0" w:firstRowLastColumn="0" w:lastRowFirstColumn="0" w:lastRowLastColumn="0"/>
+              <w:rPr>
+                <w:rFonts w:ascii="Times New Roman" w:hAnsi="Times New Roman"/>
+                <w:szCs w:val="24"/>
+              </w:rPr>
+            </w:pPr>
+            <w:r>
+              <w:rPr>
+                <w:rFonts w:ascii="Times New Roman" w:hAnsi="Times New Roman"/>
+                <w:szCs w:val="24"/>
+              </w:rPr>
+              <w:t>UDecoder1</w:t>
+            </w:r>
+          </w:p>
+        </w:tc>
+        <w:tc>
+          <w:tcPr>
+            <w:tcW w:w="885" w:type="dxa"/>
+            <w:hideMark/>
+          </w:tcPr>
+          <w:p>
+            <w:pPr>
+              <w:suppressAutoHyphens w:val="0"/>
+              <w:jc w:val="right"/>
+              <w:cnfStyle w:val="000000000000" w:firstRow="0" w:lastRow="0" w:firstColumn="0" w:lastColumn="0" w:oddVBand="0" w:evenVBand="0" w:oddHBand="0" w:evenHBand="0" w:firstRowFirstColumn="0" w:firstRowLastColumn="0" w:lastRowFirstColumn="0" w:lastRowLastColumn="0"/>
+              <w:rPr>
+                <w:rFonts w:ascii="Times New Roman" w:hAnsi="Times New Roman"/>
+                <w:szCs w:val="24"/>
+              </w:rPr>
+            </w:pPr>
+            <w:r>
+              <w:rPr>
+                <w:rFonts w:ascii="Times New Roman" w:hAnsi="Times New Roman"/>
+                <w:szCs w:val="24"/>
+              </w:rPr>
+              <w:t>0.100</w:t>
+            </w:r>
+          </w:p>
+        </w:tc>
+        <w:tc>
+          <w:tcPr>
+            <w:tcW w:w="0" w:type="auto"/>
+            <w:hideMark/>
+          </w:tcPr>
+          <w:p>
+            <w:pPr>
+              <w:suppressAutoHyphens w:val="0"/>
+              <w:jc w:val="right"/>
+              <w:cnfStyle w:val="000000000000" w:firstRow="0" w:lastRow="0" w:firstColumn="0" w:lastColumn="0" w:oddVBand="0" w:evenVBand="0" w:oddHBand="0" w:evenHBand="0" w:firstRowFirstColumn="0" w:firstRowLastColumn="0" w:lastRowFirstColumn="0" w:lastRowLastColumn="0"/>
+              <w:rPr>
+                <w:rFonts w:ascii="Times New Roman" w:hAnsi="Times New Roman"/>
+                <w:szCs w:val="24"/>
+              </w:rPr>
+            </w:pPr>
+            <w:r>
+              <w:rPr>
+                <w:rFonts w:ascii="Times New Roman" w:hAnsi="Times New Roman"/>
+                <w:szCs w:val="24"/>
+              </w:rPr>
+              <w:t>0.010</w:t>
+            </w:r>
+          </w:p>
+        </w:tc>
+        <w:tc>
+          <w:tcPr>
+            <w:tcW w:w="0" w:type="auto"/>
+            <w:hideMark/>
+          </w:tcPr>
+          <w:p>
+            <w:pPr>
+              <w:suppressAutoHyphens w:val="0"/>
+              <w:jc w:val="right"/>
+              <w:cnfStyle w:val="000000000000" w:firstRow="0" w:lastRow="0" w:firstColumn="0" w:lastColumn="0" w:oddVBand="0" w:evenVBand="0" w:oddHBand="0" w:evenHBand="0" w:firstRowFirstColumn="0" w:firstRowLastColumn="0" w:lastRowFirstColumn="0" w:lastRowLastColumn="0"/>
+              <w:rPr>
+                <w:rFonts w:ascii="Times New Roman" w:hAnsi="Times New Roman"/>
+                <w:szCs w:val="24"/>
+              </w:rPr>
+            </w:pPr>
+            <w:r>
+              <w:rPr>
+                <w:rFonts w:ascii="Times New Roman" w:hAnsi="Times New Roman"/>
+                <w:szCs w:val="24"/>
+              </w:rPr>
+              <w:t>1.000</w:t>
+            </w:r>
+          </w:p>
+        </w:tc>
+        <w:tc>
+          <w:tcPr>
+            <w:tcW w:w="0" w:type="auto"/>
+            <w:hideMark/>
+          </w:tcPr>
+          <w:p>
+            <w:pPr>
+              <w:suppressAutoHyphens w:val="0"/>
+              <w:cnfStyle w:val="000000000000" w:firstRow="0" w:lastRow="0" w:firstColumn="0" w:lastColumn="0" w:oddVBand="0" w:evenVBand="0" w:oddHBand="0" w:evenHBand="0" w:firstRowFirstColumn="0" w:firstRowLastColumn="0" w:lastRowFirstColumn="0" w:lastRowLastColumn="0"/>
+              <w:rPr>
+                <w:rFonts w:ascii="Times New Roman" w:hAnsi="Times New Roman"/>
+                <w:szCs w:val="24"/>
+              </w:rPr>
+            </w:pPr>
+            <w:proofErr w:type="gramStart"/>
+            <w:r>
+              <w:rPr>
+                <w:rFonts w:ascii="Times New Roman" w:hAnsi="Times New Roman"/>
+                <w:szCs w:val="24"/>
+              </w:rPr>
+              <w:t>A</w:t>
+            </w:r>
+            <w:proofErr w:type="gramEnd"/>
+            <w:r>
+              <w:rPr>
+                <w:rFonts w:ascii="Times New Roman" w:hAnsi="Times New Roman"/>
+                <w:szCs w:val="24"/>
+              </w:rPr>
+              <w:t xml:space="preserve"> allowances: active = 0.100 mA; idle = 0.010 mA; design = 1.000 mA. Current at the actual switching conditions </w:t>
+            </w:r>
+            <w:proofErr w:type="gramStart"/>
+            <w:r>
+              <w:rPr>
+                <w:rFonts w:ascii="Times New Roman" w:hAnsi="Times New Roman"/>
+                <w:szCs w:val="24"/>
+              </w:rPr>
+              <w:t>remains</w:t>
+            </w:r>
+            <w:proofErr w:type="gramEnd"/>
+            <w:r>
+              <w:rPr>
+                <w:rFonts w:ascii="Times New Roman" w:hAnsi="Times New Roman"/>
+                <w:szCs w:val="24"/>
+              </w:rPr>
+              <w:t xml:space="preserve"> unverified.</w:t>
+            </w:r>
+          </w:p>
+        </w:tc>
+      </w:tr>
+      <w:tr>
+        <w:tc>
+          <w:tcPr>
+            <w:cnfStyle w:val="001000000000" w:firstRow="0" w:lastRow="0" w:firstColumn="1" w:lastColumn="0" w:oddVBand="0" w:evenVBand="0" w:oddHBand="0" w:evenHBand="0" w:firstRowFirstColumn="0" w:firstRowLastColumn="0" w:lastRowFirstColumn="0" w:lastRowLastColumn="0"/>
+            <w:tcW w:w="0" w:type="auto"/>
+            <w:hideMark/>
+          </w:tcPr>
+          <w:p>
+            <w:pPr>
+              <w:suppressAutoHyphens w:val="0"/>
+              <w:rPr>
+                <w:rFonts w:ascii="Times New Roman" w:hAnsi="Times New Roman"/>
+                <w:szCs w:val="24"/>
+              </w:rPr>
+            </w:pPr>
+            <w:r>
+              <w:rPr>
+                <w:rFonts w:ascii="Times New Roman" w:hAnsi="Times New Roman"/>
+                <w:szCs w:val="24"/>
+              </w:rPr>
+              <w:t>3.3 V</w:t>
+            </w:r>
+          </w:p>
+        </w:tc>
+        <w:tc>
+          <w:tcPr>
+            <w:tcW w:w="1719" w:type="dxa"/>
+            <w:hideMark/>
+          </w:tcPr>
+          <w:p>
+            <w:pPr>
+              <w:suppressAutoHyphens w:val="0"/>
+              <w:cnfStyle w:val="000000000000" w:firstRow="0" w:lastRow="0" w:firstColumn="0" w:lastColumn="0" w:oddVBand="0" w:evenVBand="0" w:oddHBand="0" w:evenHBand="0" w:firstRowFirstColumn="0" w:firstRowLastColumn="0" w:lastRowFirstColumn="0" w:lastRowLastColumn="0"/>
+              <w:rPr>
+                <w:rFonts w:ascii="Times New Roman" w:hAnsi="Times New Roman"/>
+                <w:szCs w:val="24"/>
+              </w:rPr>
+            </w:pPr>
+            <w:r>
+              <w:rPr>
+                <w:rFonts w:ascii="Times New Roman" w:hAnsi="Times New Roman"/>
+                <w:szCs w:val="24"/>
+              </w:rPr>
+              <w:t>RPU1 / CH_PD input leakage</w:t>
+            </w:r>
+          </w:p>
+        </w:tc>
+        <w:tc>
+          <w:tcPr>
+            <w:tcW w:w="885" w:type="dxa"/>
+            <w:hideMark/>
+          </w:tcPr>
+          <w:p>
+            <w:pPr>
+              <w:suppressAutoHyphens w:val="0"/>
+              <w:jc w:val="right"/>
+              <w:cnfStyle w:val="000000000000" w:firstRow="0" w:lastRow="0" w:firstColumn="0" w:lastColumn="0" w:oddVBand="0" w:evenVBand="0" w:oddHBand="0" w:evenHBand="0" w:firstRowFirstColumn="0" w:firstRowLastColumn="0" w:lastRowFirstColumn="0" w:lastRowLastColumn="0"/>
+              <w:rPr>
+                <w:rFonts w:ascii="Times New Roman" w:hAnsi="Times New Roman"/>
+                <w:szCs w:val="24"/>
+              </w:rPr>
+            </w:pPr>
+            <w:r>
+              <w:rPr>
+                <w:rFonts w:ascii="Times New Roman" w:hAnsi="Times New Roman"/>
+                <w:szCs w:val="24"/>
+              </w:rPr>
+              <w:t>0.001</w:t>
+            </w:r>
+          </w:p>
+        </w:tc>
+        <w:tc>
+          <w:tcPr>
+            <w:tcW w:w="0" w:type="auto"/>
+            <w:hideMark/>
+          </w:tcPr>
+          <w:p>
+            <w:pPr>
+              <w:suppressAutoHyphens w:val="0"/>
+              <w:jc w:val="right"/>
+              <w:cnfStyle w:val="000000000000" w:firstRow="0" w:lastRow="0" w:firstColumn="0" w:lastColumn="0" w:oddVBand="0" w:evenVBand="0" w:oddHBand="0" w:evenHBand="0" w:firstRowFirstColumn="0" w:firstRowLastColumn="0" w:lastRowFirstColumn="0" w:lastRowLastColumn="0"/>
+              <w:rPr>
+                <w:rFonts w:ascii="Times New Roman" w:hAnsi="Times New Roman"/>
+                <w:szCs w:val="24"/>
+              </w:rPr>
+            </w:pPr>
+            <w:r>
+              <w:rPr>
+                <w:rFonts w:ascii="Times New Roman" w:hAnsi="Times New Roman"/>
+                <w:szCs w:val="24"/>
+              </w:rPr>
+              <w:t>0.001</w:t>
+            </w:r>
+          </w:p>
+        </w:tc>
+        <w:tc>
+          <w:tcPr>
+            <w:tcW w:w="0" w:type="auto"/>
+            <w:hideMark/>
+          </w:tcPr>
+          <w:p>
+            <w:pPr>
+              <w:suppressAutoHyphens w:val="0"/>
+              <w:jc w:val="right"/>
+              <w:cnfStyle w:val="000000000000" w:firstRow="0" w:lastRow="0" w:firstColumn="0" w:lastColumn="0" w:oddVBand="0" w:evenVBand="0" w:oddHBand="0" w:evenHBand="0" w:firstRowFirstColumn="0" w:firstRowLastColumn="0" w:lastRowFirstColumn="0" w:lastRowLastColumn="0"/>
+              <w:rPr>
+                <w:rFonts w:ascii="Times New Roman" w:hAnsi="Times New Roman"/>
+                <w:szCs w:val="24"/>
+              </w:rPr>
+            </w:pPr>
+            <w:r>
+              <w:rPr>
+                <w:rFonts w:ascii="Times New Roman" w:hAnsi="Times New Roman"/>
+                <w:szCs w:val="24"/>
+              </w:rPr>
+              <w:t>0.010</w:t>
+            </w:r>
+          </w:p>
+        </w:tc>
+        <w:tc>
+          <w:tcPr>
+            <w:tcW w:w="0" w:type="auto"/>
+            <w:hideMark/>
+          </w:tcPr>
+          <w:p>
+            <w:pPr>
+              <w:suppressAutoHyphens w:val="0"/>
+              <w:cnfStyle w:val="000000000000" w:firstRow="0" w:lastRow="0" w:firstColumn="0" w:lastColumn="0" w:oddVBand="0" w:evenVBand="0" w:oddHBand="0" w:evenHBand="0" w:firstRowFirstColumn="0" w:firstRowLastColumn="0" w:lastRowFirstColumn="0" w:lastRowLastColumn="0"/>
+              <w:rPr>
+                <w:rFonts w:ascii="Times New Roman" w:hAnsi="Times New Roman"/>
+                <w:szCs w:val="24"/>
+              </w:rPr>
+            </w:pPr>
+            <w:r>
+              <w:rPr>
+                <w:rFonts w:ascii="Times New Roman" w:hAnsi="Times New Roman"/>
+                <w:szCs w:val="24"/>
+              </w:rPr>
+              <w:t xml:space="preserve">A leakage: active and idle = 1 </w:t>
+            </w:r>
+            <w:proofErr w:type="spellStart"/>
+            <w:r>
+              <w:rPr>
+                <w:rFonts w:ascii="Times New Roman" w:hAnsi="Times New Roman"/>
+                <w:szCs w:val="24"/>
+              </w:rPr>
+              <w:t>uA</w:t>
+            </w:r>
+            <w:proofErr w:type="spellEnd"/>
+            <w:r>
+              <w:rPr>
+                <w:rFonts w:ascii="Times New Roman" w:hAnsi="Times New Roman"/>
+                <w:szCs w:val="24"/>
+              </w:rPr>
+              <w:t xml:space="preserve"> / 1000 = 0.001 mA. Design = 10 </w:t>
+            </w:r>
+            <w:proofErr w:type="spellStart"/>
+            <w:r>
+              <w:rPr>
+                <w:rFonts w:ascii="Times New Roman" w:hAnsi="Times New Roman"/>
+                <w:szCs w:val="24"/>
+              </w:rPr>
+              <w:t>uA</w:t>
+            </w:r>
+            <w:proofErr w:type="spellEnd"/>
+            <w:r>
+              <w:rPr>
+                <w:rFonts w:ascii="Times New Roman" w:hAnsi="Times New Roman"/>
+                <w:szCs w:val="24"/>
+              </w:rPr>
+              <w:t xml:space="preserve"> / 1000 = 0.010 mA. The pull-up does not continuously draw 3.3 V / 10 </w:t>
+            </w:r>
+            <w:proofErr w:type="spellStart"/>
+            <w:r>
+              <w:rPr>
+                <w:rFonts w:ascii="Times New Roman" w:hAnsi="Times New Roman"/>
+                <w:szCs w:val="24"/>
+              </w:rPr>
+              <w:t>kOhm</w:t>
+            </w:r>
+            <w:proofErr w:type="spellEnd"/>
+            <w:r>
+              <w:rPr>
+                <w:rFonts w:ascii="Times New Roman" w:hAnsi="Times New Roman"/>
+                <w:szCs w:val="24"/>
+              </w:rPr>
+              <w:t xml:space="preserve"> when its input is high.</w:t>
+            </w:r>
+          </w:p>
+        </w:tc>
+      </w:tr>
+      <w:tr>
+        <w:tc>
+          <w:tcPr>
+            <w:cnfStyle w:val="001000000000" w:firstRow="0" w:lastRow="0" w:firstColumn="1" w:lastColumn="0" w:oddVBand="0" w:evenVBand="0" w:oddHBand="0" w:evenHBand="0" w:firstRowFirstColumn="0" w:firstRowLastColumn="0" w:lastRowFirstColumn="0" w:lastRowLastColumn="0"/>
+            <w:tcW w:w="0" w:type="auto"/>
+            <w:hideMark/>
+          </w:tcPr>
+          <w:p>
+            <w:pPr>
+              <w:suppressAutoHyphens w:val="0"/>
+              <w:rPr>
+                <w:rFonts w:ascii="Times New Roman" w:hAnsi="Times New Roman"/>
+                <w:szCs w:val="24"/>
+              </w:rPr>
+            </w:pPr>
+            <w:r>
+              <w:rPr>
+                <w:rFonts w:ascii="Times New Roman" w:hAnsi="Times New Roman"/>
+                <w:szCs w:val="24"/>
+              </w:rPr>
+              <w:t>3.3 V</w:t>
+            </w:r>
+          </w:p>
+        </w:tc>
+        <w:tc>
+          <w:tcPr>
+            <w:tcW w:w="1719" w:type="dxa"/>
+            <w:hideMark/>
+          </w:tcPr>
+          <w:p>
+            <w:pPr>
+              <w:suppressAutoHyphens w:val="0"/>
+              <w:cnfStyle w:val="000000000000" w:firstRow="0" w:lastRow="0" w:firstColumn="0" w:lastColumn="0" w:oddVBand="0" w:evenVBand="0" w:oddHBand="0" w:evenHBand="0" w:firstRowFirstColumn="0" w:firstRowLastColumn="0" w:lastRowFirstColumn="0" w:lastRowLastColumn="0"/>
+              <w:rPr>
+                <w:rFonts w:ascii="Times New Roman" w:hAnsi="Times New Roman"/>
+                <w:szCs w:val="24"/>
+              </w:rPr>
+            </w:pPr>
+            <w:r>
+              <w:rPr>
+                <w:rFonts w:ascii="Times New Roman" w:hAnsi="Times New Roman"/>
+                <w:szCs w:val="24"/>
+              </w:rPr>
+              <w:t>RPU2</w:t>
+            </w:r>
+          </w:p>
+        </w:tc>
+        <w:tc>
+          <w:tcPr>
+            <w:tcW w:w="885" w:type="dxa"/>
+            <w:hideMark/>
+          </w:tcPr>
+          <w:p>
+            <w:pPr>
+              <w:suppressAutoHyphens w:val="0"/>
+              <w:jc w:val="right"/>
+              <w:cnfStyle w:val="000000000000" w:firstRow="0" w:lastRow="0" w:firstColumn="0" w:lastColumn="0" w:oddVBand="0" w:evenVBand="0" w:oddHBand="0" w:evenHBand="0" w:firstRowFirstColumn="0" w:firstRowLastColumn="0" w:lastRowFirstColumn="0" w:lastRowLastColumn="0"/>
+              <w:rPr>
+                <w:rFonts w:ascii="Times New Roman" w:hAnsi="Times New Roman"/>
+                <w:szCs w:val="24"/>
+              </w:rPr>
+            </w:pPr>
+            <w:r>
+              <w:rPr>
+                <w:rFonts w:ascii="Times New Roman" w:hAnsi="Times New Roman"/>
+                <w:szCs w:val="24"/>
+              </w:rPr>
+              <w:t>0.165</w:t>
+            </w:r>
+          </w:p>
+        </w:tc>
+        <w:tc>
+          <w:tcPr>
+            <w:tcW w:w="0" w:type="auto"/>
+            <w:hideMark/>
+          </w:tcPr>
+          <w:p>
+            <w:pPr>
+              <w:suppressAutoHyphens w:val="0"/>
+              <w:jc w:val="right"/>
+              <w:cnfStyle w:val="000000000000" w:firstRow="0" w:lastRow="0" w:firstColumn="0" w:lastColumn="0" w:oddVBand="0" w:evenVBand="0" w:oddHBand="0" w:evenHBand="0" w:firstRowFirstColumn="0" w:firstRowLastColumn="0" w:lastRowFirstColumn="0" w:lastRowLastColumn="0"/>
+              <w:rPr>
+                <w:rFonts w:ascii="Times New Roman" w:hAnsi="Times New Roman"/>
+                <w:szCs w:val="24"/>
+              </w:rPr>
+            </w:pPr>
+            <w:r>
+              <w:rPr>
+                <w:rFonts w:ascii="Times New Roman" w:hAnsi="Times New Roman"/>
+                <w:szCs w:val="24"/>
+              </w:rPr>
+              <w:t>0</w:t>
+            </w:r>
+          </w:p>
+        </w:tc>
+        <w:tc>
+          <w:tcPr>
+            <w:tcW w:w="0" w:type="auto"/>
+            <w:hideMark/>
+          </w:tcPr>
+          <w:p>
+            <w:pPr>
+              <w:suppressAutoHyphens w:val="0"/>
+              <w:jc w:val="right"/>
+              <w:cnfStyle w:val="000000000000" w:firstRow="0" w:lastRow="0" w:firstColumn="0" w:lastColumn="0" w:oddVBand="0" w:evenVBand="0" w:oddHBand="0" w:evenHBand="0" w:firstRowFirstColumn="0" w:firstRowLastColumn="0" w:lastRowFirstColumn="0" w:lastRowLastColumn="0"/>
+              <w:rPr>
+                <w:rFonts w:ascii="Times New Roman" w:hAnsi="Times New Roman"/>
+                <w:szCs w:val="24"/>
+              </w:rPr>
+            </w:pPr>
+            <w:r>
+              <w:rPr>
+                <w:rFonts w:ascii="Times New Roman" w:hAnsi="Times New Roman"/>
+                <w:szCs w:val="24"/>
+              </w:rPr>
+              <w:t>0.330</w:t>
+            </w:r>
+          </w:p>
+        </w:tc>
+        <w:tc>
+          <w:tcPr>
+            <w:tcW w:w="0" w:type="auto"/>
+            <w:hideMark/>
+          </w:tcPr>
+          <w:p>
+            <w:pPr>
+              <w:suppressAutoHyphens w:val="0"/>
+              <w:cnfStyle w:val="000000000000" w:firstRow="0" w:lastRow="0" w:firstColumn="0" w:lastColumn="0" w:oddVBand="0" w:evenVBand="0" w:oddHBand="0" w:evenHBand="0" w:firstRowFirstColumn="0" w:firstRowLastColumn="0" w:lastRowFirstColumn="0" w:lastRowLastColumn="0"/>
+              <w:rPr>
+                <w:rFonts w:ascii="Times New Roman" w:hAnsi="Times New Roman"/>
+                <w:szCs w:val="24"/>
+              </w:rPr>
+            </w:pPr>
+            <w:r>
+              <w:rPr>
+                <w:rFonts w:ascii="Times New Roman" w:hAnsi="Times New Roman"/>
+                <w:szCs w:val="24"/>
+              </w:rPr>
+              <w:t xml:space="preserve">Low-state current = (3.3 V - 0 V) / 10 </w:t>
+            </w:r>
+            <w:proofErr w:type="spellStart"/>
+            <w:r>
+              <w:rPr>
+                <w:rFonts w:ascii="Times New Roman" w:hAnsi="Times New Roman"/>
+                <w:szCs w:val="24"/>
+              </w:rPr>
+              <w:t>kOhm</w:t>
+            </w:r>
+            <w:proofErr w:type="spellEnd"/>
+            <w:r>
+              <w:rPr>
+                <w:rFonts w:ascii="Times New Roman" w:hAnsi="Times New Roman"/>
+                <w:szCs w:val="24"/>
+              </w:rPr>
+              <w:t xml:space="preserve"> = 0.330 mA. Active: 0.330 mA x 0.50 low-state fraction = 0.165 mA, A duty. Idle: (3.3 V - 3.3 V) / 10 </w:t>
+            </w:r>
+            <w:proofErr w:type="spellStart"/>
+            <w:r>
+              <w:rPr>
+                <w:rFonts w:ascii="Times New Roman" w:hAnsi="Times New Roman"/>
+                <w:szCs w:val="24"/>
+              </w:rPr>
+              <w:t>kOhm</w:t>
+            </w:r>
+            <w:proofErr w:type="spellEnd"/>
+            <w:r>
+              <w:rPr>
+                <w:rFonts w:ascii="Times New Roman" w:hAnsi="Times New Roman"/>
+                <w:szCs w:val="24"/>
+              </w:rPr>
+              <w:t xml:space="preserve"> = 0 mA. Design: 0.330 mA x 1 = 0.330 mA.</w:t>
+            </w:r>
+          </w:p>
+        </w:tc>
+      </w:tr>
+      <w:tr>
+        <w:tc>
+          <w:tcPr>
+            <w:cnfStyle w:val="001000000000" w:firstRow="0" w:lastRow="0" w:firstColumn="1" w:lastColumn="0" w:oddVBand="0" w:evenVBand="0" w:oddHBand="0" w:evenHBand="0" w:firstRowFirstColumn="0" w:firstRowLastColumn="0" w:lastRowFirstColumn="0" w:lastRowLastColumn="0"/>
+            <w:tcW w:w="0" w:type="auto"/>
+            <w:hideMark/>
+          </w:tcPr>
+          <w:p>
+            <w:pPr>
+              <w:suppressAutoHyphens w:val="0"/>
+              <w:rPr>
+                <w:rFonts w:ascii="Times New Roman" w:hAnsi="Times New Roman"/>
+                <w:szCs w:val="24"/>
+              </w:rPr>
+            </w:pPr>
+            <w:r>
+              <w:rPr>
+                <w:rFonts w:ascii="Times New Roman" w:hAnsi="Times New Roman"/>
+                <w:szCs w:val="24"/>
+              </w:rPr>
+              <w:t>3.3 V</w:t>
+            </w:r>
+          </w:p>
+        </w:tc>
+        <w:tc>
+          <w:tcPr>
+            <w:tcW w:w="1719" w:type="dxa"/>
+            <w:hideMark/>
+          </w:tcPr>
+          <w:p>
+            <w:pPr>
+              <w:suppressAutoHyphens w:val="0"/>
+              <w:cnfStyle w:val="000000000000" w:firstRow="0" w:lastRow="0" w:firstColumn="0" w:lastColumn="0" w:oddVBand="0" w:evenVBand="0" w:oddHBand="0" w:evenHBand="0" w:firstRowFirstColumn="0" w:firstRowLastColumn="0" w:lastRowFirstColumn="0" w:lastRowLastColumn="0"/>
+              <w:rPr>
+                <w:rFonts w:ascii="Times New Roman" w:hAnsi="Times New Roman"/>
+                <w:szCs w:val="24"/>
+              </w:rPr>
+            </w:pPr>
+            <w:r>
+              <w:rPr>
+                <w:rFonts w:ascii="Times New Roman" w:hAnsi="Times New Roman"/>
+                <w:szCs w:val="24"/>
+              </w:rPr>
+              <w:t>ESP8266 module</w:t>
+            </w:r>
+          </w:p>
+        </w:tc>
+        <w:tc>
+          <w:tcPr>
+            <w:tcW w:w="885" w:type="dxa"/>
+            <w:hideMark/>
+          </w:tcPr>
+          <w:p>
+            <w:pPr>
+              <w:suppressAutoHyphens w:val="0"/>
+              <w:jc w:val="right"/>
+              <w:cnfStyle w:val="000000000000" w:firstRow="0" w:lastRow="0" w:firstColumn="0" w:lastColumn="0" w:oddVBand="0" w:evenVBand="0" w:oddHBand="0" w:evenHBand="0" w:firstRowFirstColumn="0" w:firstRowLastColumn="0" w:lastRowFirstColumn="0" w:lastRowLastColumn="0"/>
+              <w:rPr>
+                <w:rFonts w:ascii="Times New Roman" w:hAnsi="Times New Roman"/>
+                <w:szCs w:val="24"/>
+              </w:rPr>
+            </w:pPr>
+            <w:r>
+              <w:rPr>
+                <w:rFonts w:ascii="Times New Roman" w:hAnsi="Times New Roman"/>
+                <w:szCs w:val="24"/>
+              </w:rPr>
+              <w:t>80</w:t>
+            </w:r>
+          </w:p>
+        </w:tc>
+        <w:tc>
+          <w:tcPr>
+            <w:tcW w:w="0" w:type="auto"/>
+            <w:hideMark/>
+          </w:tcPr>
+          <w:p>
+            <w:pPr>
+              <w:suppressAutoHyphens w:val="0"/>
+              <w:jc w:val="right"/>
+              <w:cnfStyle w:val="000000000000" w:firstRow="0" w:lastRow="0" w:firstColumn="0" w:lastColumn="0" w:oddVBand="0" w:evenVBand="0" w:oddHBand="0" w:evenHBand="0" w:firstRowFirstColumn="0" w:firstRowLastColumn="0" w:lastRowFirstColumn="0" w:lastRowLastColumn="0"/>
+              <w:rPr>
+                <w:rFonts w:ascii="Times New Roman" w:hAnsi="Times New Roman"/>
+                <w:szCs w:val="24"/>
+              </w:rPr>
+            </w:pPr>
+            <w:r>
+              <w:rPr>
+                <w:rFonts w:ascii="Times New Roman" w:hAnsi="Times New Roman"/>
+                <w:szCs w:val="24"/>
+              </w:rPr>
+              <w:t>50</w:t>
+            </w:r>
+          </w:p>
+        </w:tc>
+        <w:tc>
+          <w:tcPr>
+            <w:tcW w:w="0" w:type="auto"/>
+            <w:hideMark/>
+          </w:tcPr>
+          <w:p>
+            <w:pPr>
+              <w:suppressAutoHyphens w:val="0"/>
+              <w:jc w:val="right"/>
+              <w:cnfStyle w:val="000000000000" w:firstRow="0" w:lastRow="0" w:firstColumn="0" w:lastColumn="0" w:oddVBand="0" w:evenVBand="0" w:oddHBand="0" w:evenHBand="0" w:firstRowFirstColumn="0" w:firstRowLastColumn="0" w:lastRowFirstColumn="0" w:lastRowLastColumn="0"/>
+              <w:rPr>
+                <w:rFonts w:ascii="Times New Roman" w:hAnsi="Times New Roman"/>
+                <w:szCs w:val="24"/>
+              </w:rPr>
+            </w:pPr>
+            <w:r>
+              <w:rPr>
+                <w:rFonts w:ascii="Times New Roman" w:hAnsi="Times New Roman"/>
+                <w:szCs w:val="24"/>
+              </w:rPr>
+              <w:t>300</w:t>
+            </w:r>
+          </w:p>
+        </w:tc>
+        <w:tc>
+          <w:tcPr>
+            <w:tcW w:w="0" w:type="auto"/>
+            <w:hideMark/>
+          </w:tcPr>
+          <w:p>
+            <w:pPr>
+              <w:suppressAutoHyphens w:val="0"/>
+              <w:cnfStyle w:val="000000000000" w:firstRow="0" w:lastRow="0" w:firstColumn="0" w:lastColumn="0" w:oddVBand="0" w:evenVBand="0" w:oddHBand="0" w:evenHBand="0" w:firstRowFirstColumn="0" w:firstRowLastColumn="0" w:lastRowFirstColumn="0" w:lastRowLastColumn="0"/>
+              <w:rPr>
+                <w:rFonts w:ascii="Times New Roman" w:hAnsi="Times New Roman"/>
+                <w:szCs w:val="24"/>
+              </w:rPr>
+            </w:pPr>
+            <w:r>
+              <w:rPr>
+                <w:rFonts w:ascii="Times New Roman" w:hAnsi="Times New Roman"/>
+                <w:szCs w:val="24"/>
+              </w:rPr>
+              <w:t>Active: 1 x 80 mA = 80 mA, C average applied to the module. Idle: 1 x 50 mA = 50 mA, A. Design burst: 1 x 300 mA = 300 mA, A.</w:t>
+            </w:r>
+          </w:p>
+        </w:tc>
+      </w:tr>
+      <w:tr>
+        <w:tc>
+          <w:tcPr>
+            <w:cnfStyle w:val="001000000000" w:firstRow="0" w:lastRow="0" w:firstColumn="1" w:lastColumn="0" w:oddVBand="0" w:evenVBand="0" w:oddHBand="0" w:evenHBand="0" w:firstRowFirstColumn="0" w:firstRowLastColumn="0" w:lastRowFirstColumn="0" w:lastRowLastColumn="0"/>
+            <w:tcW w:w="0" w:type="auto"/>
+            <w:hideMark/>
+          </w:tcPr>
+          <w:p>
+            <w:pPr>
+              <w:suppressAutoHyphens w:val="0"/>
+              <w:rPr>
+                <w:rFonts w:ascii="Times New Roman" w:hAnsi="Times New Roman"/>
+                <w:szCs w:val="24"/>
+              </w:rPr>
+            </w:pPr>
+            <w:r>
+              <w:rPr>
+                <w:rFonts w:ascii="Times New Roman" w:hAnsi="Times New Roman"/>
+                <w:szCs w:val="24"/>
+              </w:rPr>
+              <w:t>3.3 V</w:t>
+            </w:r>
+          </w:p>
+        </w:tc>
+        <w:tc>
+          <w:tcPr>
+            <w:tcW w:w="1719" w:type="dxa"/>
+            <w:hideMark/>
+          </w:tcPr>
+          <w:p>
+            <w:pPr>
+              <w:suppressAutoHyphens w:val="0"/>
+              <w:cnfStyle w:val="000000000000" w:firstRow="0" w:lastRow="0" w:firstColumn="0" w:lastColumn="0" w:oddVBand="0" w:evenVBand="0" w:oddHBand="0" w:evenHBand="0" w:firstRowFirstColumn="0" w:firstRowLastColumn="0" w:lastRowFirstColumn="0" w:lastRowLastColumn="0"/>
+              <w:rPr>
+                <w:rFonts w:ascii="Times New Roman" w:hAnsi="Times New Roman"/>
+                <w:szCs w:val="24"/>
+              </w:rPr>
+            </w:pPr>
+            <w:r>
+              <w:rPr>
+                <w:rFonts w:ascii="Times New Roman" w:hAnsi="Times New Roman"/>
+                <w:szCs w:val="24"/>
+              </w:rPr>
+              <w:t>TFT1, including backlight</w:t>
+            </w:r>
+          </w:p>
+        </w:tc>
+        <w:tc>
+          <w:tcPr>
+            <w:tcW w:w="885" w:type="dxa"/>
+            <w:hideMark/>
+          </w:tcPr>
+          <w:p>
+            <w:pPr>
+              <w:suppressAutoHyphens w:val="0"/>
+              <w:jc w:val="right"/>
+              <w:cnfStyle w:val="000000000000" w:firstRow="0" w:lastRow="0" w:firstColumn="0" w:lastColumn="0" w:oddVBand="0" w:evenVBand="0" w:oddHBand="0" w:evenHBand="0" w:firstRowFirstColumn="0" w:firstRowLastColumn="0" w:lastRowFirstColumn="0" w:lastRowLastColumn="0"/>
+              <w:rPr>
+                <w:rFonts w:ascii="Times New Roman" w:hAnsi="Times New Roman"/>
+                <w:szCs w:val="24"/>
+              </w:rPr>
+            </w:pPr>
+            <w:r>
+              <w:rPr>
+                <w:rFonts w:ascii="Times New Roman" w:hAnsi="Times New Roman"/>
+                <w:szCs w:val="24"/>
+              </w:rPr>
+              <w:t>50</w:t>
+            </w:r>
+          </w:p>
+        </w:tc>
+        <w:tc>
+          <w:tcPr>
+            <w:tcW w:w="0" w:type="auto"/>
+            <w:hideMark/>
+          </w:tcPr>
+          <w:p>
+            <w:pPr>
+              <w:suppressAutoHyphens w:val="0"/>
+              <w:jc w:val="right"/>
+              <w:cnfStyle w:val="000000000000" w:firstRow="0" w:lastRow="0" w:firstColumn="0" w:lastColumn="0" w:oddVBand="0" w:evenVBand="0" w:oddHBand="0" w:evenHBand="0" w:firstRowFirstColumn="0" w:firstRowLastColumn="0" w:lastRowFirstColumn="0" w:lastRowLastColumn="0"/>
+              <w:rPr>
+                <w:rFonts w:ascii="Times New Roman" w:hAnsi="Times New Roman"/>
+                <w:szCs w:val="24"/>
+              </w:rPr>
+            </w:pPr>
+            <w:r>
+              <w:rPr>
+                <w:rFonts w:ascii="Times New Roman" w:hAnsi="Times New Roman"/>
+                <w:szCs w:val="24"/>
+              </w:rPr>
+              <w:t>50</w:t>
+            </w:r>
+          </w:p>
+        </w:tc>
+        <w:tc>
+          <w:tcPr>
+            <w:tcW w:w="0" w:type="auto"/>
+            <w:hideMark/>
+          </w:tcPr>
+          <w:p>
+            <w:pPr>
+              <w:suppressAutoHyphens w:val="0"/>
+              <w:jc w:val="right"/>
+              <w:cnfStyle w:val="000000000000" w:firstRow="0" w:lastRow="0" w:firstColumn="0" w:lastColumn="0" w:oddVBand="0" w:evenVBand="0" w:oddHBand="0" w:evenHBand="0" w:firstRowFirstColumn="0" w:firstRowLastColumn="0" w:lastRowFirstColumn="0" w:lastRowLastColumn="0"/>
+              <w:rPr>
+                <w:rFonts w:ascii="Times New Roman" w:hAnsi="Times New Roman"/>
+                <w:szCs w:val="24"/>
+              </w:rPr>
+            </w:pPr>
+            <w:r>
+              <w:rPr>
+                <w:rFonts w:ascii="Times New Roman" w:hAnsi="Times New Roman"/>
+                <w:szCs w:val="24"/>
+              </w:rPr>
+              <w:t>60</w:t>
+            </w:r>
+          </w:p>
+        </w:tc>
+        <w:tc>
+          <w:tcPr>
+            <w:tcW w:w="0" w:type="auto"/>
+            <w:hideMark/>
+          </w:tcPr>
+          <w:p>
+            <w:pPr>
+              <w:suppressAutoHyphens w:val="0"/>
+              <w:cnfStyle w:val="000000000000" w:firstRow="0" w:lastRow="0" w:firstColumn="0" w:lastColumn="0" w:oddVBand="0" w:evenVBand="0" w:oddHBand="0" w:evenHBand="0" w:firstRowFirstColumn="0" w:firstRowLastColumn="0" w:lastRowFirstColumn="0" w:lastRowLastColumn="0"/>
+              <w:rPr>
+                <w:rFonts w:ascii="Times New Roman" w:hAnsi="Times New Roman"/>
+                <w:szCs w:val="24"/>
+              </w:rPr>
+            </w:pPr>
+            <w:r>
+              <w:rPr>
+                <w:rFonts w:ascii="Times New Roman" w:hAnsi="Times New Roman"/>
+                <w:szCs w:val="24"/>
+              </w:rPr>
+              <w:t xml:space="preserve">Active: approximately 50 mA with full backlight, D manufacturer reference. Idle: backlight remains on, so 1 x 50 mA = 50 mA, </w:t>
+            </w:r>
+            <w:proofErr w:type="spellStart"/>
+            <w:r>
+              <w:rPr>
+                <w:rFonts w:ascii="Times New Roman" w:hAnsi="Times New Roman"/>
+                <w:szCs w:val="24"/>
+              </w:rPr>
+              <w:t>A</w:t>
+            </w:r>
+            <w:proofErr w:type="spellEnd"/>
+            <w:r>
+              <w:rPr>
+                <w:rFonts w:ascii="Times New Roman" w:hAnsi="Times New Roman"/>
+                <w:szCs w:val="24"/>
+              </w:rPr>
+              <w:t xml:space="preserve"> application. Design: 1 x 60 mA = 60 mA, A.</w:t>
+            </w:r>
+          </w:p>
+        </w:tc>
+      </w:tr>
+      <w:tr>
+        <w:tc>
+          <w:tcPr>
+            <w:cnfStyle w:val="001000000000" w:firstRow="0" w:lastRow="0" w:firstColumn="1" w:lastColumn="0" w:oddVBand="0" w:evenVBand="0" w:oddHBand="0" w:evenHBand="0" w:firstRowFirstColumn="0" w:firstRowLastColumn="0" w:lastRowFirstColumn="0" w:lastRowLastColumn="0"/>
+            <w:tcW w:w="0" w:type="auto"/>
+            <w:hideMark/>
+          </w:tcPr>
+          <w:p>
+            <w:pPr>
+              <w:suppressAutoHyphens w:val="0"/>
+              <w:rPr>
+                <w:rFonts w:ascii="Times New Roman" w:hAnsi="Times New Roman"/>
+                <w:szCs w:val="24"/>
+              </w:rPr>
+            </w:pPr>
+            <w:r>
+              <w:rPr>
+                <w:rFonts w:ascii="Times New Roman" w:hAnsi="Times New Roman"/>
+                <w:szCs w:val="24"/>
+              </w:rPr>
+              <w:t>3.3 V</w:t>
+            </w:r>
+          </w:p>
+        </w:tc>
+        <w:tc>
+          <w:tcPr>
+            <w:tcW w:w="1719" w:type="dxa"/>
+            <w:hideMark/>
+          </w:tcPr>
+          <w:p>
+            <w:pPr>
+              <w:suppressAutoHyphens w:val="0"/>
+              <w:cnfStyle w:val="000000000000" w:firstRow="0" w:lastRow="0" w:firstColumn="0" w:lastColumn="0" w:oddVBand="0" w:evenVBand="0" w:oddHBand="0" w:evenHBand="0" w:firstRowFirstColumn="0" w:firstRowLastColumn="0" w:lastRowFirstColumn="0" w:lastRowLastColumn="0"/>
+              <w:rPr>
+                <w:rFonts w:ascii="Times New Roman" w:hAnsi="Times New Roman"/>
+                <w:szCs w:val="24"/>
+              </w:rPr>
+            </w:pPr>
+            <w:r>
+              <w:rPr>
+                <w:rFonts w:ascii="Times New Roman" w:hAnsi="Times New Roman"/>
+                <w:szCs w:val="24"/>
+              </w:rPr>
+              <w:t>TFT2, including backlight</w:t>
+            </w:r>
+          </w:p>
+        </w:tc>
+        <w:tc>
+          <w:tcPr>
+            <w:tcW w:w="885" w:type="dxa"/>
+            <w:hideMark/>
+          </w:tcPr>
+          <w:p>
+            <w:pPr>
+              <w:suppressAutoHyphens w:val="0"/>
+              <w:jc w:val="right"/>
+              <w:cnfStyle w:val="000000000000" w:firstRow="0" w:lastRow="0" w:firstColumn="0" w:lastColumn="0" w:oddVBand="0" w:evenVBand="0" w:oddHBand="0" w:evenHBand="0" w:firstRowFirstColumn="0" w:firstRowLastColumn="0" w:lastRowFirstColumn="0" w:lastRowLastColumn="0"/>
+              <w:rPr>
+                <w:rFonts w:ascii="Times New Roman" w:hAnsi="Times New Roman"/>
+                <w:szCs w:val="24"/>
+              </w:rPr>
+            </w:pPr>
+            <w:r>
+              <w:rPr>
+                <w:rFonts w:ascii="Times New Roman" w:hAnsi="Times New Roman"/>
+                <w:szCs w:val="24"/>
+              </w:rPr>
+              <w:t>50</w:t>
+            </w:r>
+          </w:p>
+        </w:tc>
+        <w:tc>
+          <w:tcPr>
+            <w:tcW w:w="0" w:type="auto"/>
+            <w:hideMark/>
+          </w:tcPr>
+          <w:p>
+            <w:pPr>
+              <w:suppressAutoHyphens w:val="0"/>
+              <w:jc w:val="right"/>
+              <w:cnfStyle w:val="000000000000" w:firstRow="0" w:lastRow="0" w:firstColumn="0" w:lastColumn="0" w:oddVBand="0" w:evenVBand="0" w:oddHBand="0" w:evenHBand="0" w:firstRowFirstColumn="0" w:firstRowLastColumn="0" w:lastRowFirstColumn="0" w:lastRowLastColumn="0"/>
+              <w:rPr>
+                <w:rFonts w:ascii="Times New Roman" w:hAnsi="Times New Roman"/>
+                <w:szCs w:val="24"/>
+              </w:rPr>
+            </w:pPr>
+            <w:r>
+              <w:rPr>
+                <w:rFonts w:ascii="Times New Roman" w:hAnsi="Times New Roman"/>
+                <w:szCs w:val="24"/>
+              </w:rPr>
+              <w:t>50</w:t>
+            </w:r>
+          </w:p>
+        </w:tc>
+        <w:tc>
+          <w:tcPr>
+            <w:tcW w:w="0" w:type="auto"/>
+            <w:hideMark/>
+          </w:tcPr>
+          <w:p>
+            <w:pPr>
+              <w:suppressAutoHyphens w:val="0"/>
+              <w:jc w:val="right"/>
+              <w:cnfStyle w:val="000000000000" w:firstRow="0" w:lastRow="0" w:firstColumn="0" w:lastColumn="0" w:oddVBand="0" w:evenVBand="0" w:oddHBand="0" w:evenHBand="0" w:firstRowFirstColumn="0" w:firstRowLastColumn="0" w:lastRowFirstColumn="0" w:lastRowLastColumn="0"/>
+              <w:rPr>
+                <w:rFonts w:ascii="Times New Roman" w:hAnsi="Times New Roman"/>
+                <w:szCs w:val="24"/>
+              </w:rPr>
+            </w:pPr>
+            <w:r>
+              <w:rPr>
+                <w:rFonts w:ascii="Times New Roman" w:hAnsi="Times New Roman"/>
+                <w:szCs w:val="24"/>
+              </w:rPr>
+              <w:t>80</w:t>
+            </w:r>
+          </w:p>
+        </w:tc>
+        <w:tc>
+          <w:tcPr>
+            <w:tcW w:w="0" w:type="auto"/>
+            <w:hideMark/>
+          </w:tcPr>
+          <w:p>
+            <w:pPr>
+              <w:suppressAutoHyphens w:val="0"/>
+              <w:cnfStyle w:val="000000000000" w:firstRow="0" w:lastRow="0" w:firstColumn="0" w:lastColumn="0" w:oddVBand="0" w:evenVBand="0" w:oddHBand="0" w:evenHBand="0" w:firstRowFirstColumn="0" w:firstRowLastColumn="0" w:lastRowFirstColumn="0" w:lastRowLastColumn="0"/>
+              <w:rPr>
+                <w:rFonts w:ascii="Times New Roman" w:hAnsi="Times New Roman"/>
+                <w:szCs w:val="24"/>
+              </w:rPr>
+            </w:pPr>
+            <w:r>
+              <w:rPr>
+                <w:rFonts w:ascii="Times New Roman" w:hAnsi="Times New Roman"/>
+                <w:szCs w:val="24"/>
+              </w:rPr>
+              <w:t xml:space="preserve">A </w:t>
+            </w:r>
+            <w:proofErr w:type="gramStart"/>
+            <w:r>
+              <w:rPr>
+                <w:rFonts w:ascii="Times New Roman" w:hAnsi="Times New Roman"/>
+                <w:szCs w:val="24"/>
+              </w:rPr>
+              <w:t>similar-display</w:t>
+            </w:r>
+            <w:proofErr w:type="gramEnd"/>
+            <w:r>
+              <w:rPr>
+                <w:rFonts w:ascii="Times New Roman" w:hAnsi="Times New Roman"/>
+                <w:szCs w:val="24"/>
+              </w:rPr>
+              <w:t xml:space="preserve"> allowances: active = 1 x 50 mA = 50 mA; idle with backlight on = 50 mA; design = 1 x 80 mA = 80 mA.</w:t>
+            </w:r>
+          </w:p>
+        </w:tc>
+      </w:tr>
+      <w:tr>
+        <w:tc>
+          <w:tcPr>
+            <w:cnfStyle w:val="001000000000" w:firstRow="0" w:lastRow="0" w:firstColumn="1" w:lastColumn="0" w:oddVBand="0" w:evenVBand="0" w:oddHBand="0" w:evenHBand="0" w:firstRowFirstColumn="0" w:firstRowLastColumn="0" w:lastRowFirstColumn="0" w:lastRowLastColumn="0"/>
+            <w:tcW w:w="0" w:type="auto"/>
+            <w:hideMark/>
+          </w:tcPr>
+          <w:p>
+            <w:pPr>
+              <w:suppressAutoHyphens w:val="0"/>
+              <w:rPr>
+                <w:rFonts w:ascii="Times New Roman" w:hAnsi="Times New Roman"/>
+                <w:szCs w:val="24"/>
+              </w:rPr>
+            </w:pPr>
+            <w:r>
+              <w:rPr>
+                <w:rFonts w:ascii="Times New Roman" w:hAnsi="Times New Roman"/>
+                <w:szCs w:val="24"/>
+              </w:rPr>
+              <w:t>3.3 V</w:t>
+            </w:r>
+          </w:p>
+        </w:tc>
+        <w:tc>
+          <w:tcPr>
+            <w:tcW w:w="1719" w:type="dxa"/>
+            <w:hideMark/>
+          </w:tcPr>
+          <w:p>
+            <w:pPr>
+              <w:suppressAutoHyphens w:val="0"/>
+              <w:cnfStyle w:val="000000000000" w:firstRow="0" w:lastRow="0" w:firstColumn="0" w:lastColumn="0" w:oddVBand="0" w:evenVBand="0" w:oddHBand="0" w:evenHBand="0" w:firstRowFirstColumn="0" w:firstRowLastColumn="0" w:lastRowFirstColumn="0" w:lastRowLastColumn="0"/>
+              <w:rPr>
+                <w:rFonts w:ascii="Times New Roman" w:hAnsi="Times New Roman"/>
+                <w:szCs w:val="24"/>
+              </w:rPr>
+            </w:pPr>
+            <w:r>
+              <w:rPr>
+                <w:rFonts w:ascii="Times New Roman" w:hAnsi="Times New Roman"/>
+                <w:szCs w:val="24"/>
+              </w:rPr>
+              <w:t>One SD card</w:t>
+            </w:r>
+          </w:p>
+        </w:tc>
+        <w:tc>
+          <w:tcPr>
+            <w:tcW w:w="885" w:type="dxa"/>
+            <w:hideMark/>
+          </w:tcPr>
+          <w:p>
+            <w:pPr>
+              <w:suppressAutoHyphens w:val="0"/>
+              <w:jc w:val="right"/>
+              <w:cnfStyle w:val="000000000000" w:firstRow="0" w:lastRow="0" w:firstColumn="0" w:lastColumn="0" w:oddVBand="0" w:evenVBand="0" w:oddHBand="0" w:evenHBand="0" w:firstRowFirstColumn="0" w:firstRowLastColumn="0" w:lastRowFirstColumn="0" w:lastRowLastColumn="0"/>
+              <w:rPr>
+                <w:rFonts w:ascii="Times New Roman" w:hAnsi="Times New Roman"/>
+                <w:szCs w:val="24"/>
+              </w:rPr>
+            </w:pPr>
+            <w:r>
+              <w:rPr>
+                <w:rFonts w:ascii="Times New Roman" w:hAnsi="Times New Roman"/>
+                <w:szCs w:val="24"/>
+              </w:rPr>
+              <w:t>10.9</w:t>
+            </w:r>
+          </w:p>
+        </w:tc>
+        <w:tc>
+          <w:tcPr>
+            <w:tcW w:w="0" w:type="auto"/>
+            <w:hideMark/>
+          </w:tcPr>
+          <w:p>
+            <w:pPr>
+              <w:suppressAutoHyphens w:val="0"/>
+              <w:jc w:val="right"/>
+              <w:cnfStyle w:val="000000000000" w:firstRow="0" w:lastRow="0" w:firstColumn="0" w:lastColumn="0" w:oddVBand="0" w:evenVBand="0" w:oddHBand="0" w:evenHBand="0" w:firstRowFirstColumn="0" w:firstRowLastColumn="0" w:lastRowFirstColumn="0" w:lastRowLastColumn="0"/>
+              <w:rPr>
+                <w:rFonts w:ascii="Times New Roman" w:hAnsi="Times New Roman"/>
+                <w:szCs w:val="24"/>
+              </w:rPr>
+            </w:pPr>
+            <w:r>
+              <w:rPr>
+                <w:rFonts w:ascii="Times New Roman" w:hAnsi="Times New Roman"/>
+                <w:szCs w:val="24"/>
+              </w:rPr>
+              <w:t>1</w:t>
+            </w:r>
+          </w:p>
+        </w:tc>
+        <w:tc>
+          <w:tcPr>
+            <w:tcW w:w="0" w:type="auto"/>
+            <w:hideMark/>
+          </w:tcPr>
+          <w:p>
+            <w:pPr>
+              <w:suppressAutoHyphens w:val="0"/>
+              <w:jc w:val="right"/>
+              <w:cnfStyle w:val="000000000000" w:firstRow="0" w:lastRow="0" w:firstColumn="0" w:lastColumn="0" w:oddVBand="0" w:evenVBand="0" w:oddHBand="0" w:evenHBand="0" w:firstRowFirstColumn="0" w:firstRowLastColumn="0" w:lastRowFirstColumn="0" w:lastRowLastColumn="0"/>
+              <w:rPr>
+                <w:rFonts w:ascii="Times New Roman" w:hAnsi="Times New Roman"/>
+                <w:szCs w:val="24"/>
+              </w:rPr>
+            </w:pPr>
+            <w:r>
+              <w:rPr>
+                <w:rFonts w:ascii="Times New Roman" w:hAnsi="Times New Roman"/>
+                <w:szCs w:val="24"/>
+              </w:rPr>
+              <w:t>100</w:t>
+            </w:r>
+          </w:p>
+        </w:tc>
+        <w:tc>
+          <w:tcPr>
+            <w:tcW w:w="0" w:type="auto"/>
+            <w:hideMark/>
+          </w:tcPr>
+          <w:p>
+            <w:pPr>
+              <w:suppressAutoHyphens w:val="0"/>
+              <w:cnfStyle w:val="000000000000" w:firstRow="0" w:lastRow="0" w:firstColumn="0" w:lastColumn="0" w:oddVBand="0" w:evenVBand="0" w:oddHBand="0" w:evenHBand="0" w:firstRowFirstColumn="0" w:firstRowLastColumn="0" w:lastRowFirstColumn="0" w:lastRowLastColumn="0"/>
+              <w:rPr>
+                <w:rFonts w:ascii="Times New Roman" w:hAnsi="Times New Roman"/>
+                <w:szCs w:val="24"/>
+              </w:rPr>
+            </w:pPr>
+            <w:r>
+              <w:rPr>
+                <w:rFonts w:ascii="Times New Roman" w:hAnsi="Times New Roman"/>
+                <w:szCs w:val="24"/>
+              </w:rPr>
+              <w:t xml:space="preserve">All A. Active average = (0.10 x 100 mA) + (0.90 x 1 mA) = 10.9 mA. Idle = 1 mA. Design access current = </w:t>
+            </w:r>
+            <w:r>
+              <w:rPr>
+                <w:rFonts w:ascii="Times New Roman" w:hAnsi="Times New Roman"/>
+                <w:szCs w:val="24"/>
+              </w:rPr>
+              <w:lastRenderedPageBreak/>
+              <w:t>100 mA. Subtract this row if no card is installed.</w:t>
+            </w:r>
+          </w:p>
+        </w:tc>
+      </w:tr>
+      <w:tr>
+        <w:tc>
+          <w:tcPr>
+            <w:cnfStyle w:val="001000000000" w:firstRow="0" w:lastRow="0" w:firstColumn="1" w:lastColumn="0" w:oddVBand="0" w:evenVBand="0" w:oddHBand="0" w:evenHBand="0" w:firstRowFirstColumn="0" w:firstRowLastColumn="0" w:lastRowFirstColumn="0" w:lastRowLastColumn="0"/>
+            <w:tcW w:w="0" w:type="auto"/>
+            <w:hideMark/>
+          </w:tcPr>
+          <w:p>
+            <w:pPr>
+              <w:suppressAutoHyphens w:val="0"/>
+              <w:rPr>
+                <w:rFonts w:ascii="Times New Roman" w:hAnsi="Times New Roman"/>
+                <w:szCs w:val="24"/>
+              </w:rPr>
+            </w:pPr>
+            <w:r>
+              <w:rPr>
+                <w:rFonts w:ascii="Times New Roman" w:hAnsi="Times New Roman"/>
+                <w:szCs w:val="24"/>
+              </w:rPr>
+              <w:lastRenderedPageBreak/>
+              <w:t>3.3 V</w:t>
+            </w:r>
+          </w:p>
+        </w:tc>
+        <w:tc>
+          <w:tcPr>
+            <w:tcW w:w="1719" w:type="dxa"/>
+            <w:hideMark/>
+          </w:tcPr>
+          <w:p>
+            <w:pPr>
+              <w:suppressAutoHyphens w:val="0"/>
+              <w:cnfStyle w:val="000000000000" w:firstRow="0" w:lastRow="0" w:firstColumn="0" w:lastColumn="0" w:oddVBand="0" w:evenVBand="0" w:oddHBand="0" w:evenHBand="0" w:firstRowFirstColumn="0" w:firstRowLastColumn="0" w:lastRowFirstColumn="0" w:lastRowLastColumn="0"/>
+              <w:rPr>
+                <w:rFonts w:ascii="Times New Roman" w:hAnsi="Times New Roman"/>
+                <w:szCs w:val="24"/>
+              </w:rPr>
+            </w:pPr>
+            <w:r>
+              <w:rPr>
+                <w:rFonts w:ascii="Times New Roman" w:hAnsi="Times New Roman"/>
+                <w:szCs w:val="24"/>
+              </w:rPr>
+              <w:t>LS1 through Q16</w:t>
+            </w:r>
+          </w:p>
+        </w:tc>
+        <w:tc>
+          <w:tcPr>
+            <w:tcW w:w="885" w:type="dxa"/>
+            <w:hideMark/>
+          </w:tcPr>
+          <w:p>
+            <w:pPr>
+              <w:suppressAutoHyphens w:val="0"/>
+              <w:jc w:val="right"/>
+              <w:cnfStyle w:val="000000000000" w:firstRow="0" w:lastRow="0" w:firstColumn="0" w:lastColumn="0" w:oddVBand="0" w:evenVBand="0" w:oddHBand="0" w:evenHBand="0" w:firstRowFirstColumn="0" w:firstRowLastColumn="0" w:lastRowFirstColumn="0" w:lastRowLastColumn="0"/>
+              <w:rPr>
+                <w:rFonts w:ascii="Times New Roman" w:hAnsi="Times New Roman"/>
+                <w:szCs w:val="24"/>
+              </w:rPr>
+            </w:pPr>
+            <w:r>
+              <w:rPr>
+                <w:rFonts w:ascii="Times New Roman" w:hAnsi="Times New Roman"/>
+                <w:szCs w:val="24"/>
+              </w:rPr>
+              <w:t>20.625</w:t>
+            </w:r>
+          </w:p>
+        </w:tc>
+        <w:tc>
+          <w:tcPr>
+            <w:tcW w:w="0" w:type="auto"/>
+            <w:hideMark/>
+          </w:tcPr>
+          <w:p>
+            <w:pPr>
+              <w:suppressAutoHyphens w:val="0"/>
+              <w:jc w:val="right"/>
+              <w:cnfStyle w:val="000000000000" w:firstRow="0" w:lastRow="0" w:firstColumn="0" w:lastColumn="0" w:oddVBand="0" w:evenVBand="0" w:oddHBand="0" w:evenHBand="0" w:firstRowFirstColumn="0" w:firstRowLastColumn="0" w:lastRowFirstColumn="0" w:lastRowLastColumn="0"/>
+              <w:rPr>
+                <w:rFonts w:ascii="Times New Roman" w:hAnsi="Times New Roman"/>
+                <w:szCs w:val="24"/>
+              </w:rPr>
+            </w:pPr>
+            <w:r>
+              <w:rPr>
+                <w:rFonts w:ascii="Times New Roman" w:hAnsi="Times New Roman"/>
+                <w:szCs w:val="24"/>
+              </w:rPr>
+              <w:t>0</w:t>
+            </w:r>
+          </w:p>
+        </w:tc>
+        <w:tc>
+          <w:tcPr>
+            <w:tcW w:w="0" w:type="auto"/>
+            <w:hideMark/>
+          </w:tcPr>
+          <w:p>
+            <w:pPr>
+              <w:suppressAutoHyphens w:val="0"/>
+              <w:jc w:val="right"/>
+              <w:cnfStyle w:val="000000000000" w:firstRow="0" w:lastRow="0" w:firstColumn="0" w:lastColumn="0" w:oddVBand="0" w:evenVBand="0" w:oddHBand="0" w:evenHBand="0" w:firstRowFirstColumn="0" w:firstRowLastColumn="0" w:lastRowFirstColumn="0" w:lastRowLastColumn="0"/>
+              <w:rPr>
+                <w:rFonts w:ascii="Times New Roman" w:hAnsi="Times New Roman"/>
+                <w:szCs w:val="24"/>
+              </w:rPr>
+            </w:pPr>
+            <w:r>
+              <w:rPr>
+                <w:rFonts w:ascii="Times New Roman" w:hAnsi="Times New Roman"/>
+                <w:szCs w:val="24"/>
+              </w:rPr>
+              <w:t>412.5</w:t>
+            </w:r>
+          </w:p>
+        </w:tc>
+        <w:tc>
+          <w:tcPr>
+            <w:tcW w:w="0" w:type="auto"/>
+            <w:hideMark/>
+          </w:tcPr>
+          <w:p>
+            <w:pPr>
+              <w:suppressAutoHyphens w:val="0"/>
+              <w:cnfStyle w:val="000000000000" w:firstRow="0" w:lastRow="0" w:firstColumn="0" w:lastColumn="0" w:oddVBand="0" w:evenVBand="0" w:oddHBand="0" w:evenHBand="0" w:firstRowFirstColumn="0" w:firstRowLastColumn="0" w:lastRowFirstColumn="0" w:lastRowLastColumn="0"/>
+              <w:rPr>
+                <w:rFonts w:ascii="Times New Roman" w:hAnsi="Times New Roman"/>
+                <w:szCs w:val="24"/>
+              </w:rPr>
+            </w:pPr>
+            <w:r>
+              <w:rPr>
+                <w:rFonts w:ascii="Times New Roman" w:hAnsi="Times New Roman"/>
+                <w:szCs w:val="24"/>
+              </w:rPr>
+              <w:t>Conditional A model: on-current = (3.3 V - 0 V) / 8 Ohm = 0.4125 A = 412.5 mA. Active average = 412.5 mA x 0.50 tone duty x 0.10 audio occupancy = 20.625 mA. Idle = 0. Design continuous-on case = 412.5 mA.</w:t>
+            </w:r>
+          </w:p>
+        </w:tc>
+      </w:tr>
+      <w:tr>
+        <w:tc>
+          <w:tcPr>
+            <w:cnfStyle w:val="001000000000" w:firstRow="0" w:lastRow="0" w:firstColumn="1" w:lastColumn="0" w:oddVBand="0" w:evenVBand="0" w:oddHBand="0" w:evenHBand="0" w:firstRowFirstColumn="0" w:firstRowLastColumn="0" w:lastRowFirstColumn="0" w:lastRowLastColumn="0"/>
+            <w:tcW w:w="0" w:type="auto"/>
+            <w:hideMark/>
+          </w:tcPr>
+          <w:p>
+            <w:pPr>
+              <w:suppressAutoHyphens w:val="0"/>
+              <w:rPr>
+                <w:rFonts w:ascii="Times New Roman" w:hAnsi="Times New Roman"/>
+                <w:szCs w:val="24"/>
+              </w:rPr>
+            </w:pPr>
+            <w:r>
+              <w:rPr>
+                <w:rFonts w:ascii="Times New Roman" w:hAnsi="Times New Roman"/>
+                <w:szCs w:val="24"/>
+              </w:rPr>
+              <w:t>3.3 V</w:t>
+            </w:r>
+          </w:p>
+        </w:tc>
+        <w:tc>
+          <w:tcPr>
+            <w:tcW w:w="1719" w:type="dxa"/>
+            <w:hideMark/>
+          </w:tcPr>
+          <w:p>
+            <w:pPr>
+              <w:suppressAutoHyphens w:val="0"/>
+              <w:cnfStyle w:val="000000000000" w:firstRow="0" w:lastRow="0" w:firstColumn="0" w:lastColumn="0" w:oddVBand="0" w:evenVBand="0" w:oddHBand="0" w:evenHBand="0" w:firstRowFirstColumn="0" w:firstRowLastColumn="0" w:lastRowFirstColumn="0" w:lastRowLastColumn="0"/>
+              <w:rPr>
+                <w:rFonts w:ascii="Times New Roman" w:hAnsi="Times New Roman"/>
+                <w:szCs w:val="24"/>
+              </w:rPr>
+            </w:pPr>
+            <w:r>
+              <w:rPr>
+                <w:rFonts w:ascii="Times New Roman" w:hAnsi="Times New Roman"/>
+                <w:szCs w:val="24"/>
+              </w:rPr>
+              <w:t>LS2 through Q17</w:t>
+            </w:r>
+          </w:p>
+        </w:tc>
+        <w:tc>
+          <w:tcPr>
+            <w:tcW w:w="885" w:type="dxa"/>
+            <w:hideMark/>
+          </w:tcPr>
+          <w:p>
+            <w:pPr>
+              <w:suppressAutoHyphens w:val="0"/>
+              <w:jc w:val="right"/>
+              <w:cnfStyle w:val="000000000000" w:firstRow="0" w:lastRow="0" w:firstColumn="0" w:lastColumn="0" w:oddVBand="0" w:evenVBand="0" w:oddHBand="0" w:evenHBand="0" w:firstRowFirstColumn="0" w:firstRowLastColumn="0" w:lastRowFirstColumn="0" w:lastRowLastColumn="0"/>
+              <w:rPr>
+                <w:rFonts w:ascii="Times New Roman" w:hAnsi="Times New Roman"/>
+                <w:szCs w:val="24"/>
+              </w:rPr>
+            </w:pPr>
+            <w:r>
+              <w:rPr>
+                <w:rFonts w:ascii="Times New Roman" w:hAnsi="Times New Roman"/>
+                <w:szCs w:val="24"/>
+              </w:rPr>
+              <w:t>20.625</w:t>
+            </w:r>
+          </w:p>
+        </w:tc>
+        <w:tc>
+          <w:tcPr>
+            <w:tcW w:w="0" w:type="auto"/>
+            <w:hideMark/>
+          </w:tcPr>
+          <w:p>
+            <w:pPr>
+              <w:suppressAutoHyphens w:val="0"/>
+              <w:jc w:val="right"/>
+              <w:cnfStyle w:val="000000000000" w:firstRow="0" w:lastRow="0" w:firstColumn="0" w:lastColumn="0" w:oddVBand="0" w:evenVBand="0" w:oddHBand="0" w:evenHBand="0" w:firstRowFirstColumn="0" w:firstRowLastColumn="0" w:lastRowFirstColumn="0" w:lastRowLastColumn="0"/>
+              <w:rPr>
+                <w:rFonts w:ascii="Times New Roman" w:hAnsi="Times New Roman"/>
+                <w:szCs w:val="24"/>
+              </w:rPr>
+            </w:pPr>
+            <w:r>
+              <w:rPr>
+                <w:rFonts w:ascii="Times New Roman" w:hAnsi="Times New Roman"/>
+                <w:szCs w:val="24"/>
+              </w:rPr>
+              <w:t>0</w:t>
+            </w:r>
+          </w:p>
+        </w:tc>
+        <w:tc>
+          <w:tcPr>
+            <w:tcW w:w="0" w:type="auto"/>
+            <w:hideMark/>
+          </w:tcPr>
+          <w:p>
+            <w:pPr>
+              <w:suppressAutoHyphens w:val="0"/>
+              <w:jc w:val="right"/>
+              <w:cnfStyle w:val="000000000000" w:firstRow="0" w:lastRow="0" w:firstColumn="0" w:lastColumn="0" w:oddVBand="0" w:evenVBand="0" w:oddHBand="0" w:evenHBand="0" w:firstRowFirstColumn="0" w:firstRowLastColumn="0" w:lastRowFirstColumn="0" w:lastRowLastColumn="0"/>
+              <w:rPr>
+                <w:rFonts w:ascii="Times New Roman" w:hAnsi="Times New Roman"/>
+                <w:szCs w:val="24"/>
+              </w:rPr>
+            </w:pPr>
+            <w:r>
+              <w:rPr>
+                <w:rFonts w:ascii="Times New Roman" w:hAnsi="Times New Roman"/>
+                <w:szCs w:val="24"/>
+              </w:rPr>
+              <w:t>412.5</w:t>
+            </w:r>
+          </w:p>
+        </w:tc>
+        <w:tc>
+          <w:tcPr>
+            <w:tcW w:w="0" w:type="auto"/>
+            <w:hideMark/>
+          </w:tcPr>
+          <w:p>
+            <w:pPr>
+              <w:suppressAutoHyphens w:val="0"/>
+              <w:cnfStyle w:val="000000000000" w:firstRow="0" w:lastRow="0" w:firstColumn="0" w:lastColumn="0" w:oddVBand="0" w:evenVBand="0" w:oddHBand="0" w:evenHBand="0" w:firstRowFirstColumn="0" w:firstRowLastColumn="0" w:lastRowFirstColumn="0" w:lastRowLastColumn="0"/>
+              <w:rPr>
+                <w:rFonts w:ascii="Times New Roman" w:hAnsi="Times New Roman"/>
+                <w:szCs w:val="24"/>
+              </w:rPr>
+            </w:pPr>
+            <w:r>
+              <w:rPr>
+                <w:rFonts w:ascii="Times New Roman" w:hAnsi="Times New Roman"/>
+                <w:szCs w:val="24"/>
+              </w:rPr>
+              <w:t>Conditional A model: on-current = (3.3 V - 0 V) / 8 Ohm = 412.5 mA. Active average = 412.5 mA x 0.50 x 0.10 = 20.625 mA. Idle = 0. Design continuous-on case = 412.5 mA.</w:t>
+            </w:r>
+          </w:p>
+        </w:tc>
+      </w:tr>
+      <w:tr>
+        <w:tc>
+          <w:tcPr>
+            <w:cnfStyle w:val="001000000000" w:firstRow="0" w:lastRow="0" w:firstColumn="1" w:lastColumn="0" w:oddVBand="0" w:evenVBand="0" w:oddHBand="0" w:evenHBand="0" w:firstRowFirstColumn="0" w:firstRowLastColumn="0" w:lastRowFirstColumn="0" w:lastRowLastColumn="0"/>
+            <w:tcW w:w="0" w:type="auto"/>
+            <w:hideMark/>
+          </w:tcPr>
+          <w:p>
+            <w:pPr>
+              <w:suppressAutoHyphens w:val="0"/>
+              <w:rPr>
+                <w:rFonts w:ascii="Times New Roman" w:hAnsi="Times New Roman"/>
+                <w:szCs w:val="24"/>
+              </w:rPr>
+            </w:pPr>
+            <w:r>
+              <w:rPr>
+                <w:rFonts w:ascii="Times New Roman" w:hAnsi="Times New Roman"/>
+                <w:szCs w:val="24"/>
+              </w:rPr>
+              <w:t>3.3 V, provisional</w:t>
+            </w:r>
+          </w:p>
+        </w:tc>
+        <w:tc>
+          <w:tcPr>
+            <w:tcW w:w="1719" w:type="dxa"/>
+            <w:hideMark/>
+          </w:tcPr>
+          <w:p>
+            <w:pPr>
+              <w:suppressAutoHyphens w:val="0"/>
+              <w:cnfStyle w:val="000000000000" w:firstRow="0" w:lastRow="0" w:firstColumn="0" w:lastColumn="0" w:oddVBand="0" w:evenVBand="0" w:oddHBand="0" w:evenHBand="0" w:firstRowFirstColumn="0" w:firstRowLastColumn="0" w:lastRowFirstColumn="0" w:lastRowLastColumn="0"/>
+              <w:rPr>
+                <w:rFonts w:ascii="Times New Roman" w:hAnsi="Times New Roman"/>
+                <w:szCs w:val="24"/>
+              </w:rPr>
+            </w:pPr>
+            <w:r>
+              <w:rPr>
+                <w:rFonts w:ascii="Times New Roman" w:hAnsi="Times New Roman"/>
+                <w:szCs w:val="24"/>
+              </w:rPr>
+              <w:t>Atomizer1</w:t>
+            </w:r>
+          </w:p>
+        </w:tc>
+        <w:tc>
+          <w:tcPr>
+            <w:tcW w:w="885" w:type="dxa"/>
+            <w:hideMark/>
+          </w:tcPr>
+          <w:p>
+            <w:pPr>
+              <w:suppressAutoHyphens w:val="0"/>
+              <w:jc w:val="right"/>
+              <w:cnfStyle w:val="000000000000" w:firstRow="0" w:lastRow="0" w:firstColumn="0" w:lastColumn="0" w:oddVBand="0" w:evenVBand="0" w:oddHBand="0" w:evenHBand="0" w:firstRowFirstColumn="0" w:firstRowLastColumn="0" w:lastRowFirstColumn="0" w:lastRowLastColumn="0"/>
+              <w:rPr>
+                <w:rFonts w:ascii="Times New Roman" w:hAnsi="Times New Roman"/>
+                <w:szCs w:val="24"/>
+              </w:rPr>
+            </w:pPr>
+            <w:r>
+              <w:rPr>
+                <w:rFonts w:ascii="Times New Roman" w:hAnsi="Times New Roman"/>
+                <w:szCs w:val="24"/>
+              </w:rPr>
+              <w:t>150</w:t>
+            </w:r>
+          </w:p>
+        </w:tc>
+        <w:tc>
+          <w:tcPr>
+            <w:tcW w:w="0" w:type="auto"/>
+            <w:hideMark/>
+          </w:tcPr>
+          <w:p>
+            <w:pPr>
+              <w:suppressAutoHyphens w:val="0"/>
+              <w:jc w:val="right"/>
+              <w:cnfStyle w:val="000000000000" w:firstRow="0" w:lastRow="0" w:firstColumn="0" w:lastColumn="0" w:oddVBand="0" w:evenVBand="0" w:oddHBand="0" w:evenHBand="0" w:firstRowFirstColumn="0" w:firstRowLastColumn="0" w:lastRowFirstColumn="0" w:lastRowLastColumn="0"/>
+              <w:rPr>
+                <w:rFonts w:ascii="Times New Roman" w:hAnsi="Times New Roman"/>
+                <w:szCs w:val="24"/>
+              </w:rPr>
+            </w:pPr>
+            <w:r>
+              <w:rPr>
+                <w:rFonts w:ascii="Times New Roman" w:hAnsi="Times New Roman"/>
+                <w:szCs w:val="24"/>
+              </w:rPr>
+              <w:t>1</w:t>
+            </w:r>
+          </w:p>
+        </w:tc>
+        <w:tc>
+          <w:tcPr>
+            <w:tcW w:w="0" w:type="auto"/>
+            <w:hideMark/>
+          </w:tcPr>
+          <w:p>
+            <w:pPr>
+              <w:suppressAutoHyphens w:val="0"/>
+              <w:jc w:val="right"/>
+              <w:cnfStyle w:val="000000000000" w:firstRow="0" w:lastRow="0" w:firstColumn="0" w:lastColumn="0" w:oddVBand="0" w:evenVBand="0" w:oddHBand="0" w:evenHBand="0" w:firstRowFirstColumn="0" w:firstRowLastColumn="0" w:lastRowFirstColumn="0" w:lastRowLastColumn="0"/>
+              <w:rPr>
+                <w:rFonts w:ascii="Times New Roman" w:hAnsi="Times New Roman"/>
+                <w:szCs w:val="24"/>
+              </w:rPr>
+            </w:pPr>
+            <w:r>
+              <w:rPr>
+                <w:rFonts w:ascii="Times New Roman" w:hAnsi="Times New Roman"/>
+                <w:szCs w:val="24"/>
+              </w:rPr>
+              <w:t>300</w:t>
+            </w:r>
+          </w:p>
+        </w:tc>
+        <w:tc>
+          <w:tcPr>
+            <w:tcW w:w="0" w:type="auto"/>
+            <w:hideMark/>
+          </w:tcPr>
+          <w:p>
+            <w:pPr>
+              <w:suppressAutoHyphens w:val="0"/>
+              <w:cnfStyle w:val="000000000000" w:firstRow="0" w:lastRow="0" w:firstColumn="0" w:lastColumn="0" w:oddVBand="0" w:evenVBand="0" w:oddHBand="0" w:evenHBand="0" w:firstRowFirstColumn="0" w:firstRowLastColumn="0" w:lastRowFirstColumn="0" w:lastRowLastColumn="0"/>
+              <w:rPr>
+                <w:rFonts w:ascii="Times New Roman" w:hAnsi="Times New Roman"/>
+                <w:szCs w:val="24"/>
+              </w:rPr>
+            </w:pPr>
+            <w:r>
+              <w:rPr>
+                <w:rFonts w:ascii="Times New Roman" w:hAnsi="Times New Roman"/>
+                <w:szCs w:val="24"/>
+              </w:rPr>
+              <w:t>A module allowances: active = 1 x 150 mA = 150 mA; disabled idle = 1 mA; design = 300 mA. Actual module voltage and current remain unverified.</w:t>
+            </w:r>
+          </w:p>
+        </w:tc>
+      </w:tr>
+      <w:tr>
+        <w:tc>
+          <w:tcPr>
+            <w:cnfStyle w:val="001000000000" w:firstRow="0" w:lastRow="0" w:firstColumn="1" w:lastColumn="0" w:oddVBand="0" w:evenVBand="0" w:oddHBand="0" w:evenHBand="0" w:firstRowFirstColumn="0" w:firstRowLastColumn="0" w:lastRowFirstColumn="0" w:lastRowLastColumn="0"/>
+            <w:tcW w:w="0" w:type="auto"/>
+            <w:hideMark/>
+          </w:tcPr>
+          <w:p>
+            <w:pPr>
+              <w:suppressAutoHyphens w:val="0"/>
+              <w:rPr>
+                <w:rFonts w:ascii="Times New Roman" w:hAnsi="Times New Roman"/>
+                <w:szCs w:val="24"/>
+              </w:rPr>
+            </w:pPr>
+            <w:r>
+              <w:rPr>
+                <w:rFonts w:ascii="Times New Roman" w:hAnsi="Times New Roman"/>
+                <w:szCs w:val="24"/>
+              </w:rPr>
+              <w:t>3.3 V, provisional</w:t>
+            </w:r>
+          </w:p>
+        </w:tc>
+        <w:tc>
+          <w:tcPr>
+            <w:tcW w:w="1719" w:type="dxa"/>
+            <w:hideMark/>
+          </w:tcPr>
+          <w:p>
+            <w:pPr>
+              <w:suppressAutoHyphens w:val="0"/>
+              <w:cnfStyle w:val="000000000000" w:firstRow="0" w:lastRow="0" w:firstColumn="0" w:lastColumn="0" w:oddVBand="0" w:evenVBand="0" w:oddHBand="0" w:evenHBand="0" w:firstRowFirstColumn="0" w:firstRowLastColumn="0" w:lastRowFirstColumn="0" w:lastRowLastColumn="0"/>
+              <w:rPr>
+                <w:rFonts w:ascii="Times New Roman" w:hAnsi="Times New Roman"/>
+                <w:szCs w:val="24"/>
+              </w:rPr>
+            </w:pPr>
+            <w:r>
+              <w:rPr>
+                <w:rFonts w:ascii="Times New Roman" w:hAnsi="Times New Roman"/>
+                <w:szCs w:val="24"/>
+              </w:rPr>
+              <w:t>Atomizer2</w:t>
+            </w:r>
+          </w:p>
+        </w:tc>
+        <w:tc>
+          <w:tcPr>
+            <w:tcW w:w="885" w:type="dxa"/>
+            <w:hideMark/>
+          </w:tcPr>
+          <w:p>
+            <w:pPr>
+              <w:suppressAutoHyphens w:val="0"/>
+              <w:jc w:val="right"/>
+              <w:cnfStyle w:val="000000000000" w:firstRow="0" w:lastRow="0" w:firstColumn="0" w:lastColumn="0" w:oddVBand="0" w:evenVBand="0" w:oddHBand="0" w:evenHBand="0" w:firstRowFirstColumn="0" w:firstRowLastColumn="0" w:lastRowFirstColumn="0" w:lastRowLastColumn="0"/>
+              <w:rPr>
+                <w:rFonts w:ascii="Times New Roman" w:hAnsi="Times New Roman"/>
+                <w:szCs w:val="24"/>
+              </w:rPr>
+            </w:pPr>
+            <w:r>
+              <w:rPr>
+                <w:rFonts w:ascii="Times New Roman" w:hAnsi="Times New Roman"/>
+                <w:szCs w:val="24"/>
+              </w:rPr>
+              <w:t>150</w:t>
+            </w:r>
+          </w:p>
+        </w:tc>
+        <w:tc>
+          <w:tcPr>
+            <w:tcW w:w="0" w:type="auto"/>
+            <w:hideMark/>
+          </w:tcPr>
+          <w:p>
+            <w:pPr>
+              <w:suppressAutoHyphens w:val="0"/>
+              <w:jc w:val="right"/>
+              <w:cnfStyle w:val="000000000000" w:firstRow="0" w:lastRow="0" w:firstColumn="0" w:lastColumn="0" w:oddVBand="0" w:evenVBand="0" w:oddHBand="0" w:evenHBand="0" w:firstRowFirstColumn="0" w:firstRowLastColumn="0" w:lastRowFirstColumn="0" w:lastRowLastColumn="0"/>
+              <w:rPr>
+                <w:rFonts w:ascii="Times New Roman" w:hAnsi="Times New Roman"/>
+                <w:szCs w:val="24"/>
+              </w:rPr>
+            </w:pPr>
+            <w:r>
+              <w:rPr>
+                <w:rFonts w:ascii="Times New Roman" w:hAnsi="Times New Roman"/>
+                <w:szCs w:val="24"/>
+              </w:rPr>
+              <w:t>1</w:t>
+            </w:r>
+          </w:p>
+        </w:tc>
+        <w:tc>
+          <w:tcPr>
+            <w:tcW w:w="0" w:type="auto"/>
+            <w:hideMark/>
+          </w:tcPr>
+          <w:p>
+            <w:pPr>
+              <w:suppressAutoHyphens w:val="0"/>
+              <w:jc w:val="right"/>
+              <w:cnfStyle w:val="000000000000" w:firstRow="0" w:lastRow="0" w:firstColumn="0" w:lastColumn="0" w:oddVBand="0" w:evenVBand="0" w:oddHBand="0" w:evenHBand="0" w:firstRowFirstColumn="0" w:firstRowLastColumn="0" w:lastRowFirstColumn="0" w:lastRowLastColumn="0"/>
+              <w:rPr>
+                <w:rFonts w:ascii="Times New Roman" w:hAnsi="Times New Roman"/>
+                <w:szCs w:val="24"/>
+              </w:rPr>
+            </w:pPr>
+            <w:r>
+              <w:rPr>
+                <w:rFonts w:ascii="Times New Roman" w:hAnsi="Times New Roman"/>
+                <w:szCs w:val="24"/>
+              </w:rPr>
+              <w:t>300</w:t>
+            </w:r>
+          </w:p>
+        </w:tc>
+        <w:tc>
+          <w:tcPr>
+            <w:tcW w:w="0" w:type="auto"/>
+            <w:hideMark/>
+          </w:tcPr>
+          <w:p>
+            <w:pPr>
+              <w:suppressAutoHyphens w:val="0"/>
+              <w:cnfStyle w:val="000000000000" w:firstRow="0" w:lastRow="0" w:firstColumn="0" w:lastColumn="0" w:oddVBand="0" w:evenVBand="0" w:oddHBand="0" w:evenHBand="0" w:firstRowFirstColumn="0" w:firstRowLastColumn="0" w:lastRowFirstColumn="0" w:lastRowLastColumn="0"/>
+              <w:rPr>
+                <w:rFonts w:ascii="Times New Roman" w:hAnsi="Times New Roman"/>
+                <w:szCs w:val="24"/>
+              </w:rPr>
+            </w:pPr>
+            <w:r>
+              <w:rPr>
+                <w:rFonts w:ascii="Times New Roman" w:hAnsi="Times New Roman"/>
+                <w:szCs w:val="24"/>
+              </w:rPr>
+              <w:t>A module allowances: active = 1 x 150 mA = 150 mA; disabled idle = 1 mA; design = 300 mA. Actual module voltage and current remain unverified.</w:t>
+            </w:r>
+          </w:p>
+        </w:tc>
+      </w:tr>
+      <w:tr>
+        <w:tc>
+          <w:tcPr>
+            <w:cnfStyle w:val="001000000000" w:firstRow="0" w:lastRow="0" w:firstColumn="1" w:lastColumn="0" w:oddVBand="0" w:evenVBand="0" w:oddHBand="0" w:evenHBand="0" w:firstRowFirstColumn="0" w:firstRowLastColumn="0" w:lastRowFirstColumn="0" w:lastRowLastColumn="0"/>
+            <w:tcW w:w="0" w:type="auto"/>
+            <w:hideMark/>
+          </w:tcPr>
+          <w:p>
+            <w:pPr>
+              <w:suppressAutoHyphens w:val="0"/>
+              <w:rPr>
+                <w:rFonts w:ascii="Times New Roman" w:hAnsi="Times New Roman"/>
+                <w:szCs w:val="24"/>
+              </w:rPr>
+            </w:pPr>
+            <w:r>
+              <w:rPr>
+                <w:rFonts w:ascii="Times New Roman" w:hAnsi="Times New Roman"/>
+                <w:szCs w:val="24"/>
+              </w:rPr>
+              <w:t>3.3 V</w:t>
+            </w:r>
+          </w:p>
+        </w:tc>
+        <w:tc>
+          <w:tcPr>
+            <w:tcW w:w="1719" w:type="dxa"/>
+            <w:hideMark/>
+          </w:tcPr>
+          <w:p>
+            <w:pPr>
+              <w:suppressAutoHyphens w:val="0"/>
+              <w:cnfStyle w:val="000000000000" w:firstRow="0" w:lastRow="0" w:firstColumn="0" w:lastColumn="0" w:oddVBand="0" w:evenVBand="0" w:oddHBand="0" w:evenHBand="0" w:firstRowFirstColumn="0" w:firstRowLastColumn="0" w:lastRowFirstColumn="0" w:lastRowLastColumn="0"/>
+              <w:rPr>
+                <w:rFonts w:ascii="Times New Roman" w:hAnsi="Times New Roman"/>
+                <w:szCs w:val="24"/>
+              </w:rPr>
+            </w:pPr>
+            <w:r>
+              <w:rPr>
+                <w:rFonts w:ascii="Times New Roman" w:hAnsi="Times New Roman"/>
+                <w:szCs w:val="24"/>
+              </w:rPr>
+              <w:t>ID reader</w:t>
+            </w:r>
+          </w:p>
+        </w:tc>
+        <w:tc>
+          <w:tcPr>
+            <w:tcW w:w="885" w:type="dxa"/>
+            <w:hideMark/>
+          </w:tcPr>
+          <w:p>
+            <w:pPr>
+              <w:suppressAutoHyphens w:val="0"/>
+              <w:jc w:val="right"/>
+              <w:cnfStyle w:val="000000000000" w:firstRow="0" w:lastRow="0" w:firstColumn="0" w:lastColumn="0" w:oddVBand="0" w:evenVBand="0" w:oddHBand="0" w:evenHBand="0" w:firstRowFirstColumn="0" w:firstRowLastColumn="0" w:lastRowFirstColumn="0" w:lastRowLastColumn="0"/>
+              <w:rPr>
+                <w:rFonts w:ascii="Times New Roman" w:hAnsi="Times New Roman"/>
+                <w:szCs w:val="24"/>
+              </w:rPr>
+            </w:pPr>
+            <w:r>
+              <w:rPr>
+                <w:rFonts w:ascii="Times New Roman" w:hAnsi="Times New Roman"/>
+                <w:szCs w:val="24"/>
+              </w:rPr>
+              <w:t>190</w:t>
+            </w:r>
+          </w:p>
+        </w:tc>
+        <w:tc>
+          <w:tcPr>
+            <w:tcW w:w="0" w:type="auto"/>
+            <w:hideMark/>
+          </w:tcPr>
+          <w:p>
+            <w:pPr>
+              <w:suppressAutoHyphens w:val="0"/>
+              <w:jc w:val="right"/>
+              <w:cnfStyle w:val="000000000000" w:firstRow="0" w:lastRow="0" w:firstColumn="0" w:lastColumn="0" w:oddVBand="0" w:evenVBand="0" w:oddHBand="0" w:evenHBand="0" w:firstRowFirstColumn="0" w:firstRowLastColumn="0" w:lastRowFirstColumn="0" w:lastRowLastColumn="0"/>
+              <w:rPr>
+                <w:rFonts w:ascii="Times New Roman" w:hAnsi="Times New Roman"/>
+                <w:szCs w:val="24"/>
+              </w:rPr>
+            </w:pPr>
+            <w:r>
+              <w:rPr>
+                <w:rFonts w:ascii="Times New Roman" w:hAnsi="Times New Roman"/>
+                <w:szCs w:val="24"/>
+              </w:rPr>
+              <w:t>20</w:t>
+            </w:r>
+          </w:p>
+        </w:tc>
+        <w:tc>
+          <w:tcPr>
+            <w:tcW w:w="0" w:type="auto"/>
+            <w:hideMark/>
+          </w:tcPr>
+          <w:p>
+            <w:pPr>
+              <w:suppressAutoHyphens w:val="0"/>
+              <w:jc w:val="right"/>
+              <w:cnfStyle w:val="000000000000" w:firstRow="0" w:lastRow="0" w:firstColumn="0" w:lastColumn="0" w:oddVBand="0" w:evenVBand="0" w:oddHBand="0" w:evenHBand="0" w:firstRowFirstColumn="0" w:firstRowLastColumn="0" w:lastRowFirstColumn="0" w:lastRowLastColumn="0"/>
+              <w:rPr>
+                <w:rFonts w:ascii="Times New Roman" w:hAnsi="Times New Roman"/>
+                <w:szCs w:val="24"/>
+              </w:rPr>
+            </w:pPr>
+            <w:r>
+              <w:rPr>
+                <w:rFonts w:ascii="Times New Roman" w:hAnsi="Times New Roman"/>
+                <w:szCs w:val="24"/>
+              </w:rPr>
+              <w:t>250</w:t>
+            </w:r>
+          </w:p>
+        </w:tc>
+        <w:tc>
+          <w:tcPr>
+            <w:tcW w:w="0" w:type="auto"/>
+            <w:hideMark/>
+          </w:tcPr>
+          <w:p>
+            <w:pPr>
+              <w:suppressAutoHyphens w:val="0"/>
+              <w:cnfStyle w:val="000000000000" w:firstRow="0" w:lastRow="0" w:firstColumn="0" w:lastColumn="0" w:oddVBand="0" w:evenVBand="0" w:oddHBand="0" w:evenHBand="0" w:firstRowFirstColumn="0" w:firstRowLastColumn="0" w:lastRowFirstColumn="0" w:lastRowLastColumn="0"/>
+              <w:rPr>
+                <w:rFonts w:ascii="Times New Roman" w:hAnsi="Times New Roman"/>
+                <w:szCs w:val="24"/>
+              </w:rPr>
+            </w:pPr>
+            <w:r>
+              <w:rPr>
+                <w:rFonts w:ascii="Times New Roman" w:hAnsi="Times New Roman"/>
+                <w:szCs w:val="24"/>
+              </w:rPr>
+              <w:t>Active allowance = 1 x 190 mA = 190 mA, A proxy based on a representative reader. Idle = 20 mA, A. Design = 250 mA, A. Your exact reader has not been identified.</w:t>
+            </w:r>
+          </w:p>
+        </w:tc>
+      </w:tr>
+      <w:tr>
+        <w:tc>
+          <w:tcPr>
+            <w:cnfStyle w:val="001000000000" w:firstRow="0" w:lastRow="0" w:firstColumn="1" w:lastColumn="0" w:oddVBand="0" w:evenVBand="0" w:oddHBand="0" w:evenHBand="0" w:firstRowFirstColumn="0" w:firstRowLastColumn="0" w:lastRowFirstColumn="0" w:lastRowLastColumn="0"/>
+            <w:tcW w:w="0" w:type="auto"/>
+            <w:hideMark/>
+          </w:tcPr>
+          <w:p>
+            <w:pPr>
+              <w:suppressAutoHyphens w:val="0"/>
+              <w:rPr>
+                <w:rFonts w:ascii="Times New Roman" w:hAnsi="Times New Roman"/>
+                <w:szCs w:val="24"/>
+              </w:rPr>
+            </w:pPr>
+            <w:r>
+              <w:rPr>
+                <w:rFonts w:ascii="Times New Roman" w:hAnsi="Times New Roman"/>
+                <w:szCs w:val="24"/>
+              </w:rPr>
+              <w:t>3.3 V</w:t>
+            </w:r>
+          </w:p>
+        </w:tc>
+        <w:tc>
+          <w:tcPr>
+            <w:tcW w:w="1719" w:type="dxa"/>
+            <w:hideMark/>
+          </w:tcPr>
+          <w:p>
+            <w:pPr>
+              <w:suppressAutoHyphens w:val="0"/>
+              <w:cnfStyle w:val="000000000000" w:firstRow="0" w:lastRow="0" w:firstColumn="0" w:lastColumn="0" w:oddVBand="0" w:evenVBand="0" w:oddHBand="0" w:evenHBand="0" w:firstRowFirstColumn="0" w:firstRowLastColumn="0" w:lastRowFirstColumn="0" w:lastRowLastColumn="0"/>
+              <w:rPr>
+                <w:rFonts w:ascii="Times New Roman" w:hAnsi="Times New Roman"/>
+                <w:szCs w:val="24"/>
+              </w:rPr>
+            </w:pPr>
+            <w:r>
+              <w:rPr>
+                <w:rFonts w:ascii="Times New Roman" w:hAnsi="Times New Roman"/>
+                <w:szCs w:val="24"/>
+              </w:rPr>
+              <w:t>LED branch 1</w:t>
+            </w:r>
+          </w:p>
+        </w:tc>
+        <w:tc>
+          <w:tcPr>
+            <w:tcW w:w="885" w:type="dxa"/>
+            <w:hideMark/>
+          </w:tcPr>
+          <w:p>
+            <w:pPr>
+              <w:suppressAutoHyphens w:val="0"/>
+              <w:jc w:val="right"/>
+              <w:cnfStyle w:val="000000000000" w:firstRow="0" w:lastRow="0" w:firstColumn="0" w:lastColumn="0" w:oddVBand="0" w:evenVBand="0" w:oddHBand="0" w:evenHBand="0" w:firstRowFirstColumn="0" w:firstRowLastColumn="0" w:lastRowFirstColumn="0" w:lastRowLastColumn="0"/>
+              <w:rPr>
+                <w:rFonts w:ascii="Times New Roman" w:hAnsi="Times New Roman"/>
+                <w:szCs w:val="24"/>
+              </w:rPr>
+            </w:pPr>
+            <w:r>
+              <w:rPr>
+                <w:rFonts w:ascii="Times New Roman" w:hAnsi="Times New Roman"/>
+                <w:szCs w:val="24"/>
+              </w:rPr>
+              <w:t>23.334</w:t>
+            </w:r>
+          </w:p>
+        </w:tc>
+        <w:tc>
+          <w:tcPr>
+            <w:tcW w:w="0" w:type="auto"/>
+            <w:hideMark/>
+          </w:tcPr>
+          <w:p>
+            <w:pPr>
+              <w:suppressAutoHyphens w:val="0"/>
+              <w:jc w:val="right"/>
+              <w:cnfStyle w:val="000000000000" w:firstRow="0" w:lastRow="0" w:firstColumn="0" w:lastColumn="0" w:oddVBand="0" w:evenVBand="0" w:oddHBand="0" w:evenHBand="0" w:firstRowFirstColumn="0" w:firstRowLastColumn="0" w:lastRowFirstColumn="0" w:lastRowLastColumn="0"/>
+              <w:rPr>
+                <w:rFonts w:ascii="Times New Roman" w:hAnsi="Times New Roman"/>
+                <w:szCs w:val="24"/>
+              </w:rPr>
+            </w:pPr>
+            <w:r>
+              <w:rPr>
+                <w:rFonts w:ascii="Times New Roman" w:hAnsi="Times New Roman"/>
+                <w:szCs w:val="24"/>
+              </w:rPr>
+              <w:t>0</w:t>
+            </w:r>
+          </w:p>
+        </w:tc>
+        <w:tc>
+          <w:tcPr>
+            <w:tcW w:w="0" w:type="auto"/>
+            <w:hideMark/>
+          </w:tcPr>
+          <w:p>
+            <w:pPr>
+              <w:suppressAutoHyphens w:val="0"/>
+              <w:jc w:val="right"/>
+              <w:cnfStyle w:val="000000000000" w:firstRow="0" w:lastRow="0" w:firstColumn="0" w:lastColumn="0" w:oddVBand="0" w:evenVBand="0" w:oddHBand="0" w:evenHBand="0" w:firstRowFirstColumn="0" w:firstRowLastColumn="0" w:lastRowFirstColumn="0" w:lastRowLastColumn="0"/>
+              <w:rPr>
+                <w:rFonts w:ascii="Times New Roman" w:hAnsi="Times New Roman"/>
+                <w:szCs w:val="24"/>
+              </w:rPr>
+            </w:pPr>
+            <w:r>
+              <w:rPr>
+                <w:rFonts w:ascii="Times New Roman" w:hAnsi="Times New Roman"/>
+                <w:szCs w:val="24"/>
+              </w:rPr>
+              <w:t>30.801</w:t>
+            </w:r>
+          </w:p>
+        </w:tc>
+        <w:tc>
+          <w:tcPr>
+            <w:tcW w:w="0" w:type="auto"/>
+            <w:hideMark/>
+          </w:tcPr>
+          <w:p>
+            <w:pPr>
+              <w:suppressAutoHyphens w:val="0"/>
+              <w:cnfStyle w:val="000000000000" w:firstRow="0" w:lastRow="0" w:firstColumn="0" w:lastColumn="0" w:oddVBand="0" w:evenVBand="0" w:oddHBand="0" w:evenHBand="0" w:firstRowFirstColumn="0" w:firstRowLastColumn="0" w:lastRowFirstColumn="0" w:lastRowLastColumn="0"/>
+              <w:rPr>
+                <w:rFonts w:ascii="Times New Roman" w:hAnsi="Times New Roman"/>
+                <w:szCs w:val="24"/>
+              </w:rPr>
+            </w:pPr>
+            <w:r>
+              <w:rPr>
+                <w:rFonts w:ascii="Times New Roman" w:hAnsi="Times New Roman"/>
+                <w:szCs w:val="24"/>
+              </w:rPr>
+              <w:t xml:space="preserve">A: R = 53.57 Ohm from the schematic note; nominal </w:t>
+            </w:r>
+            <w:proofErr w:type="spellStart"/>
+            <w:r>
+              <w:rPr>
+                <w:rFonts w:ascii="Times New Roman" w:hAnsi="Times New Roman"/>
+                <w:szCs w:val="24"/>
+              </w:rPr>
+              <w:t>Vf</w:t>
+            </w:r>
+            <w:proofErr w:type="spellEnd"/>
+            <w:r>
+              <w:rPr>
+                <w:rFonts w:ascii="Times New Roman" w:hAnsi="Times New Roman"/>
+                <w:szCs w:val="24"/>
+              </w:rPr>
+              <w:t xml:space="preserve"> = 2.0 V; </w:t>
+            </w:r>
+            <w:proofErr w:type="spellStart"/>
+            <w:r>
+              <w:rPr>
+                <w:rFonts w:ascii="Times New Roman" w:hAnsi="Times New Roman"/>
+                <w:szCs w:val="24"/>
+              </w:rPr>
+              <w:t>Vds</w:t>
+            </w:r>
+            <w:proofErr w:type="spellEnd"/>
+            <w:r>
+              <w:rPr>
+                <w:rFonts w:ascii="Times New Roman" w:hAnsi="Times New Roman"/>
+                <w:szCs w:val="24"/>
+              </w:rPr>
+              <w:t xml:space="preserve"> = 0.05 V. Active = (3.3 V - 2.0 V - 0.05 V) / 53.57 Ohm = 23.334 mA. Idle = 0. Design with </w:t>
+            </w:r>
+            <w:proofErr w:type="spellStart"/>
+            <w:r>
+              <w:rPr>
+                <w:rFonts w:ascii="Times New Roman" w:hAnsi="Times New Roman"/>
+                <w:szCs w:val="24"/>
+              </w:rPr>
+              <w:t>Vf</w:t>
+            </w:r>
+            <w:proofErr w:type="spellEnd"/>
+            <w:r>
+              <w:rPr>
+                <w:rFonts w:ascii="Times New Roman" w:hAnsi="Times New Roman"/>
+                <w:szCs w:val="24"/>
+              </w:rPr>
+              <w:t xml:space="preserve"> = 1.6 V: (3.3 - 1.6 - 0.05) V / 53.57 Ohm = 30.801 mA.</w:t>
+            </w:r>
+          </w:p>
+        </w:tc>
+      </w:tr>
+      <w:tr>
+        <w:tc>
+          <w:tcPr>
+            <w:cnfStyle w:val="001000000000" w:firstRow="0" w:lastRow="0" w:firstColumn="1" w:lastColumn="0" w:oddVBand="0" w:evenVBand="0" w:oddHBand="0" w:evenHBand="0" w:firstRowFirstColumn="0" w:firstRowLastColumn="0" w:lastRowFirstColumn="0" w:lastRowLastColumn="0"/>
+            <w:tcW w:w="0" w:type="auto"/>
+            <w:hideMark/>
+          </w:tcPr>
+          <w:p>
+            <w:pPr>
+              <w:suppressAutoHyphens w:val="0"/>
+              <w:rPr>
+                <w:rFonts w:ascii="Times New Roman" w:hAnsi="Times New Roman"/>
+                <w:szCs w:val="24"/>
+              </w:rPr>
+            </w:pPr>
+            <w:r>
+              <w:rPr>
+                <w:rFonts w:ascii="Times New Roman" w:hAnsi="Times New Roman"/>
+                <w:szCs w:val="24"/>
+              </w:rPr>
+              <w:t>3.3 V</w:t>
+            </w:r>
+          </w:p>
+        </w:tc>
+        <w:tc>
+          <w:tcPr>
+            <w:tcW w:w="1719" w:type="dxa"/>
+            <w:hideMark/>
+          </w:tcPr>
+          <w:p>
+            <w:pPr>
+              <w:suppressAutoHyphens w:val="0"/>
+              <w:cnfStyle w:val="000000000000" w:firstRow="0" w:lastRow="0" w:firstColumn="0" w:lastColumn="0" w:oddVBand="0" w:evenVBand="0" w:oddHBand="0" w:evenHBand="0" w:firstRowFirstColumn="0" w:firstRowLastColumn="0" w:lastRowFirstColumn="0" w:lastRowLastColumn="0"/>
+              <w:rPr>
+                <w:rFonts w:ascii="Times New Roman" w:hAnsi="Times New Roman"/>
+                <w:szCs w:val="24"/>
+              </w:rPr>
+            </w:pPr>
+            <w:r>
+              <w:rPr>
+                <w:rFonts w:ascii="Times New Roman" w:hAnsi="Times New Roman"/>
+                <w:szCs w:val="24"/>
+              </w:rPr>
+              <w:t>LED branch 2</w:t>
+            </w:r>
+          </w:p>
+        </w:tc>
+        <w:tc>
+          <w:tcPr>
+            <w:tcW w:w="885" w:type="dxa"/>
+            <w:hideMark/>
+          </w:tcPr>
+          <w:p>
+            <w:pPr>
+              <w:suppressAutoHyphens w:val="0"/>
+              <w:jc w:val="right"/>
+              <w:cnfStyle w:val="000000000000" w:firstRow="0" w:lastRow="0" w:firstColumn="0" w:lastColumn="0" w:oddVBand="0" w:evenVBand="0" w:oddHBand="0" w:evenHBand="0" w:firstRowFirstColumn="0" w:firstRowLastColumn="0" w:lastRowFirstColumn="0" w:lastRowLastColumn="0"/>
+              <w:rPr>
+                <w:rFonts w:ascii="Times New Roman" w:hAnsi="Times New Roman"/>
+                <w:szCs w:val="24"/>
+              </w:rPr>
+            </w:pPr>
+            <w:r>
+              <w:rPr>
+                <w:rFonts w:ascii="Times New Roman" w:hAnsi="Times New Roman"/>
+                <w:szCs w:val="24"/>
+              </w:rPr>
+              <w:t>0</w:t>
+            </w:r>
+          </w:p>
+        </w:tc>
+        <w:tc>
+          <w:tcPr>
+            <w:tcW w:w="0" w:type="auto"/>
+            <w:hideMark/>
+          </w:tcPr>
+          <w:p>
+            <w:pPr>
+              <w:suppressAutoHyphens w:val="0"/>
+              <w:jc w:val="right"/>
+              <w:cnfStyle w:val="000000000000" w:firstRow="0" w:lastRow="0" w:firstColumn="0" w:lastColumn="0" w:oddVBand="0" w:evenVBand="0" w:oddHBand="0" w:evenHBand="0" w:firstRowFirstColumn="0" w:firstRowLastColumn="0" w:lastRowFirstColumn="0" w:lastRowLastColumn="0"/>
+              <w:rPr>
+                <w:rFonts w:ascii="Times New Roman" w:hAnsi="Times New Roman"/>
+                <w:szCs w:val="24"/>
+              </w:rPr>
+            </w:pPr>
+            <w:r>
+              <w:rPr>
+                <w:rFonts w:ascii="Times New Roman" w:hAnsi="Times New Roman"/>
+                <w:szCs w:val="24"/>
+              </w:rPr>
+              <w:t>0</w:t>
+            </w:r>
+          </w:p>
+        </w:tc>
+        <w:tc>
+          <w:tcPr>
+            <w:tcW w:w="0" w:type="auto"/>
+            <w:hideMark/>
+          </w:tcPr>
+          <w:p>
+            <w:pPr>
+              <w:suppressAutoHyphens w:val="0"/>
+              <w:jc w:val="right"/>
+              <w:cnfStyle w:val="000000000000" w:firstRow="0" w:lastRow="0" w:firstColumn="0" w:lastColumn="0" w:oddVBand="0" w:evenVBand="0" w:oddHBand="0" w:evenHBand="0" w:firstRowFirstColumn="0" w:firstRowLastColumn="0" w:lastRowFirstColumn="0" w:lastRowLastColumn="0"/>
+              <w:rPr>
+                <w:rFonts w:ascii="Times New Roman" w:hAnsi="Times New Roman"/>
+                <w:szCs w:val="24"/>
+              </w:rPr>
+            </w:pPr>
+            <w:r>
+              <w:rPr>
+                <w:rFonts w:ascii="Times New Roman" w:hAnsi="Times New Roman"/>
+                <w:szCs w:val="24"/>
+              </w:rPr>
+              <w:t>30.801</w:t>
+            </w:r>
+          </w:p>
+        </w:tc>
+        <w:tc>
+          <w:tcPr>
+            <w:tcW w:w="0" w:type="auto"/>
+            <w:hideMark/>
+          </w:tcPr>
+          <w:p>
+            <w:pPr>
+              <w:suppressAutoHyphens w:val="0"/>
+              <w:cnfStyle w:val="000000000000" w:firstRow="0" w:lastRow="0" w:firstColumn="0" w:lastColumn="0" w:oddVBand="0" w:evenVBand="0" w:oddHBand="0" w:evenHBand="0" w:firstRowFirstColumn="0" w:firstRowLastColumn="0" w:lastRowFirstColumn="0" w:lastRowLastColumn="0"/>
+              <w:rPr>
+                <w:rFonts w:ascii="Times New Roman" w:hAnsi="Times New Roman"/>
+                <w:szCs w:val="24"/>
+              </w:rPr>
+            </w:pPr>
+            <w:proofErr w:type="gramStart"/>
+            <w:r>
+              <w:rPr>
+                <w:rFonts w:ascii="Times New Roman" w:hAnsi="Times New Roman"/>
+                <w:szCs w:val="24"/>
+              </w:rPr>
+              <w:t>A</w:t>
+            </w:r>
+            <w:proofErr w:type="gramEnd"/>
+            <w:r>
+              <w:rPr>
+                <w:rFonts w:ascii="Times New Roman" w:hAnsi="Times New Roman"/>
+                <w:szCs w:val="24"/>
+              </w:rPr>
+              <w:t xml:space="preserve"> operating state: active and idle = 0 because this LED is off. Design: (3.3 V - 1.6 V - 0.05 V) / 53.57 Ohm = 30.801 mA.</w:t>
+            </w:r>
+          </w:p>
+        </w:tc>
+      </w:tr>
+      <w:tr>
+        <w:tc>
+          <w:tcPr>
+            <w:cnfStyle w:val="001000000000" w:firstRow="0" w:lastRow="0" w:firstColumn="1" w:lastColumn="0" w:oddVBand="0" w:evenVBand="0" w:oddHBand="0" w:evenHBand="0" w:firstRowFirstColumn="0" w:firstRowLastColumn="0" w:lastRowFirstColumn="0" w:lastRowLastColumn="0"/>
+            <w:tcW w:w="0" w:type="auto"/>
+            <w:hideMark/>
+          </w:tcPr>
+          <w:p>
+            <w:pPr>
+              <w:suppressAutoHyphens w:val="0"/>
+              <w:rPr>
+                <w:rFonts w:ascii="Times New Roman" w:hAnsi="Times New Roman"/>
+                <w:szCs w:val="24"/>
+              </w:rPr>
+            </w:pPr>
+            <w:r>
+              <w:rPr>
+                <w:rFonts w:ascii="Times New Roman" w:hAnsi="Times New Roman"/>
+                <w:szCs w:val="24"/>
+              </w:rPr>
+              <w:t>3.3 V</w:t>
+            </w:r>
+          </w:p>
+        </w:tc>
+        <w:tc>
+          <w:tcPr>
+            <w:tcW w:w="1719" w:type="dxa"/>
+            <w:hideMark/>
+          </w:tcPr>
+          <w:p>
+            <w:pPr>
+              <w:suppressAutoHyphens w:val="0"/>
+              <w:cnfStyle w:val="000000000000" w:firstRow="0" w:lastRow="0" w:firstColumn="0" w:lastColumn="0" w:oddVBand="0" w:evenVBand="0" w:oddHBand="0" w:evenHBand="0" w:firstRowFirstColumn="0" w:firstRowLastColumn="0" w:lastRowFirstColumn="0" w:lastRowLastColumn="0"/>
+              <w:rPr>
+                <w:rFonts w:ascii="Times New Roman" w:hAnsi="Times New Roman"/>
+                <w:szCs w:val="24"/>
+              </w:rPr>
+            </w:pPr>
+            <w:r>
+              <w:rPr>
+                <w:rFonts w:ascii="Times New Roman" w:hAnsi="Times New Roman"/>
+                <w:szCs w:val="24"/>
+              </w:rPr>
+              <w:t>LED branch 3</w:t>
+            </w:r>
+          </w:p>
+        </w:tc>
+        <w:tc>
+          <w:tcPr>
+            <w:tcW w:w="885" w:type="dxa"/>
+            <w:hideMark/>
+          </w:tcPr>
+          <w:p>
+            <w:pPr>
+              <w:suppressAutoHyphens w:val="0"/>
+              <w:jc w:val="right"/>
+              <w:cnfStyle w:val="000000000000" w:firstRow="0" w:lastRow="0" w:firstColumn="0" w:lastColumn="0" w:oddVBand="0" w:evenVBand="0" w:oddHBand="0" w:evenHBand="0" w:firstRowFirstColumn="0" w:firstRowLastColumn="0" w:lastRowFirstColumn="0" w:lastRowLastColumn="0"/>
+              <w:rPr>
+                <w:rFonts w:ascii="Times New Roman" w:hAnsi="Times New Roman"/>
+                <w:szCs w:val="24"/>
+              </w:rPr>
+            </w:pPr>
+            <w:r>
+              <w:rPr>
+                <w:rFonts w:ascii="Times New Roman" w:hAnsi="Times New Roman"/>
+                <w:szCs w:val="24"/>
+              </w:rPr>
+              <w:t>0</w:t>
+            </w:r>
+          </w:p>
+        </w:tc>
+        <w:tc>
+          <w:tcPr>
+            <w:tcW w:w="0" w:type="auto"/>
+            <w:hideMark/>
+          </w:tcPr>
+          <w:p>
+            <w:pPr>
+              <w:suppressAutoHyphens w:val="0"/>
+              <w:jc w:val="right"/>
+              <w:cnfStyle w:val="000000000000" w:firstRow="0" w:lastRow="0" w:firstColumn="0" w:lastColumn="0" w:oddVBand="0" w:evenVBand="0" w:oddHBand="0" w:evenHBand="0" w:firstRowFirstColumn="0" w:firstRowLastColumn="0" w:lastRowFirstColumn="0" w:lastRowLastColumn="0"/>
+              <w:rPr>
+                <w:rFonts w:ascii="Times New Roman" w:hAnsi="Times New Roman"/>
+                <w:szCs w:val="24"/>
+              </w:rPr>
+            </w:pPr>
+            <w:r>
+              <w:rPr>
+                <w:rFonts w:ascii="Times New Roman" w:hAnsi="Times New Roman"/>
+                <w:szCs w:val="24"/>
+              </w:rPr>
+              <w:t>0</w:t>
+            </w:r>
+          </w:p>
+        </w:tc>
+        <w:tc>
+          <w:tcPr>
+            <w:tcW w:w="0" w:type="auto"/>
+            <w:hideMark/>
+          </w:tcPr>
+          <w:p>
+            <w:pPr>
+              <w:suppressAutoHyphens w:val="0"/>
+              <w:jc w:val="right"/>
+              <w:cnfStyle w:val="000000000000" w:firstRow="0" w:lastRow="0" w:firstColumn="0" w:lastColumn="0" w:oddVBand="0" w:evenVBand="0" w:oddHBand="0" w:evenHBand="0" w:firstRowFirstColumn="0" w:firstRowLastColumn="0" w:lastRowFirstColumn="0" w:lastRowLastColumn="0"/>
+              <w:rPr>
+                <w:rFonts w:ascii="Times New Roman" w:hAnsi="Times New Roman"/>
+                <w:szCs w:val="24"/>
+              </w:rPr>
+            </w:pPr>
+            <w:r>
+              <w:rPr>
+                <w:rFonts w:ascii="Times New Roman" w:hAnsi="Times New Roman"/>
+                <w:szCs w:val="24"/>
+              </w:rPr>
+              <w:t>30.801</w:t>
+            </w:r>
+          </w:p>
+        </w:tc>
+        <w:tc>
+          <w:tcPr>
+            <w:tcW w:w="0" w:type="auto"/>
+            <w:hideMark/>
+          </w:tcPr>
+          <w:p>
+            <w:pPr>
+              <w:suppressAutoHyphens w:val="0"/>
+              <w:cnfStyle w:val="000000000000" w:firstRow="0" w:lastRow="0" w:firstColumn="0" w:lastColumn="0" w:oddVBand="0" w:evenVBand="0" w:oddHBand="0" w:evenHBand="0" w:firstRowFirstColumn="0" w:firstRowLastColumn="0" w:lastRowFirstColumn="0" w:lastRowLastColumn="0"/>
+              <w:rPr>
+                <w:rFonts w:ascii="Times New Roman" w:hAnsi="Times New Roman"/>
+                <w:szCs w:val="24"/>
+              </w:rPr>
+            </w:pPr>
+            <w:proofErr w:type="gramStart"/>
+            <w:r>
+              <w:rPr>
+                <w:rFonts w:ascii="Times New Roman" w:hAnsi="Times New Roman"/>
+                <w:szCs w:val="24"/>
+              </w:rPr>
+              <w:t>A</w:t>
+            </w:r>
+            <w:proofErr w:type="gramEnd"/>
+            <w:r>
+              <w:rPr>
+                <w:rFonts w:ascii="Times New Roman" w:hAnsi="Times New Roman"/>
+                <w:szCs w:val="24"/>
+              </w:rPr>
+              <w:t xml:space="preserve"> operating state: active and idle = 0 because this LED is off. Design: (3.3 V - 1.6 V - 0.05 V) / 53.57 Ohm = 30.801 mA.</w:t>
+            </w:r>
+          </w:p>
+        </w:tc>
+      </w:tr>
+      <w:tr>
+        <w:tc>
+          <w:tcPr>
+            <w:cnfStyle w:val="001000000000" w:firstRow="0" w:lastRow="0" w:firstColumn="1" w:lastColumn="0" w:oddVBand="0" w:evenVBand="0" w:oddHBand="0" w:evenHBand="0" w:firstRowFirstColumn="0" w:firstRowLastColumn="0" w:lastRowFirstColumn="0" w:lastRowLastColumn="0"/>
+            <w:tcW w:w="0" w:type="auto"/>
+            <w:hideMark/>
+          </w:tcPr>
+          <w:p>
+            <w:pPr>
+              <w:suppressAutoHyphens w:val="0"/>
+              <w:rPr>
+                <w:rFonts w:ascii="Times New Roman" w:hAnsi="Times New Roman"/>
+                <w:szCs w:val="24"/>
+              </w:rPr>
+            </w:pPr>
+            <w:r>
+              <w:rPr>
+                <w:rFonts w:ascii="Times New Roman" w:hAnsi="Times New Roman"/>
+                <w:szCs w:val="24"/>
+              </w:rPr>
+              <w:t>3.3 V</w:t>
+            </w:r>
+          </w:p>
+        </w:tc>
+        <w:tc>
+          <w:tcPr>
+            <w:tcW w:w="1719" w:type="dxa"/>
+            <w:hideMark/>
+          </w:tcPr>
+          <w:p>
+            <w:pPr>
+              <w:suppressAutoHyphens w:val="0"/>
+              <w:cnfStyle w:val="000000000000" w:firstRow="0" w:lastRow="0" w:firstColumn="0" w:lastColumn="0" w:oddVBand="0" w:evenVBand="0" w:oddHBand="0" w:evenHBand="0" w:firstRowFirstColumn="0" w:firstRowLastColumn="0" w:lastRowFirstColumn="0" w:lastRowLastColumn="0"/>
+              <w:rPr>
+                <w:rFonts w:ascii="Times New Roman" w:hAnsi="Times New Roman"/>
+                <w:szCs w:val="24"/>
+              </w:rPr>
+            </w:pPr>
+            <w:r>
+              <w:rPr>
+                <w:rFonts w:ascii="Times New Roman" w:hAnsi="Times New Roman"/>
+                <w:szCs w:val="24"/>
+              </w:rPr>
+              <w:t>Keypad pull currents</w:t>
+            </w:r>
+          </w:p>
+        </w:tc>
+        <w:tc>
+          <w:tcPr>
+            <w:tcW w:w="885" w:type="dxa"/>
+            <w:hideMark/>
+          </w:tcPr>
+          <w:p>
+            <w:pPr>
+              <w:suppressAutoHyphens w:val="0"/>
+              <w:jc w:val="right"/>
+              <w:cnfStyle w:val="000000000000" w:firstRow="0" w:lastRow="0" w:firstColumn="0" w:lastColumn="0" w:oddVBand="0" w:evenVBand="0" w:oddHBand="0" w:evenHBand="0" w:firstRowFirstColumn="0" w:firstRowLastColumn="0" w:lastRowFirstColumn="0" w:lastRowLastColumn="0"/>
+              <w:rPr>
+                <w:rFonts w:ascii="Times New Roman" w:hAnsi="Times New Roman"/>
+                <w:szCs w:val="24"/>
+              </w:rPr>
+            </w:pPr>
+            <w:r>
+              <w:rPr>
+                <w:rFonts w:ascii="Times New Roman" w:hAnsi="Times New Roman"/>
+                <w:szCs w:val="24"/>
+              </w:rPr>
+              <w:t>0.0825</w:t>
+            </w:r>
+          </w:p>
+        </w:tc>
+        <w:tc>
+          <w:tcPr>
+            <w:tcW w:w="0" w:type="auto"/>
+            <w:hideMark/>
+          </w:tcPr>
+          <w:p>
+            <w:pPr>
+              <w:suppressAutoHyphens w:val="0"/>
+              <w:jc w:val="right"/>
+              <w:cnfStyle w:val="000000000000" w:firstRow="0" w:lastRow="0" w:firstColumn="0" w:lastColumn="0" w:oddVBand="0" w:evenVBand="0" w:oddHBand="0" w:evenHBand="0" w:firstRowFirstColumn="0" w:firstRowLastColumn="0" w:lastRowFirstColumn="0" w:lastRowLastColumn="0"/>
+              <w:rPr>
+                <w:rFonts w:ascii="Times New Roman" w:hAnsi="Times New Roman"/>
+                <w:szCs w:val="24"/>
+              </w:rPr>
+            </w:pPr>
+            <w:r>
+              <w:rPr>
+                <w:rFonts w:ascii="Times New Roman" w:hAnsi="Times New Roman"/>
+                <w:szCs w:val="24"/>
+              </w:rPr>
+              <w:t>0</w:t>
+            </w:r>
+          </w:p>
+        </w:tc>
+        <w:tc>
+          <w:tcPr>
+            <w:tcW w:w="0" w:type="auto"/>
+            <w:hideMark/>
+          </w:tcPr>
+          <w:p>
+            <w:pPr>
+              <w:suppressAutoHyphens w:val="0"/>
+              <w:jc w:val="right"/>
+              <w:cnfStyle w:val="000000000000" w:firstRow="0" w:lastRow="0" w:firstColumn="0" w:lastColumn="0" w:oddVBand="0" w:evenVBand="0" w:oddHBand="0" w:evenHBand="0" w:firstRowFirstColumn="0" w:firstRowLastColumn="0" w:lastRowFirstColumn="0" w:lastRowLastColumn="0"/>
+              <w:rPr>
+                <w:rFonts w:ascii="Times New Roman" w:hAnsi="Times New Roman"/>
+                <w:szCs w:val="24"/>
+              </w:rPr>
+            </w:pPr>
+            <w:r>
+              <w:rPr>
+                <w:rFonts w:ascii="Times New Roman" w:hAnsi="Times New Roman"/>
+                <w:szCs w:val="24"/>
+              </w:rPr>
+              <w:t>1.320</w:t>
+            </w:r>
+          </w:p>
+        </w:tc>
+        <w:tc>
+          <w:tcPr>
+            <w:tcW w:w="0" w:type="auto"/>
+            <w:hideMark/>
+          </w:tcPr>
+          <w:p>
+            <w:pPr>
+              <w:suppressAutoHyphens w:val="0"/>
+              <w:cnfStyle w:val="000000000000" w:firstRow="0" w:lastRow="0" w:firstColumn="0" w:lastColumn="0" w:oddVBand="0" w:evenVBand="0" w:oddHBand="0" w:evenHBand="0" w:firstRowFirstColumn="0" w:firstRowLastColumn="0" w:lastRowFirstColumn="0" w:lastRowLastColumn="0"/>
+              <w:rPr>
+                <w:rFonts w:ascii="Times New Roman" w:hAnsi="Times New Roman"/>
+                <w:szCs w:val="24"/>
+              </w:rPr>
+            </w:pPr>
+            <w:proofErr w:type="gramStart"/>
+            <w:r>
+              <w:rPr>
+                <w:rFonts w:ascii="Times New Roman" w:hAnsi="Times New Roman"/>
+                <w:szCs w:val="24"/>
+              </w:rPr>
+              <w:t>A</w:t>
+            </w:r>
+            <w:proofErr w:type="gramEnd"/>
+            <w:r>
+              <w:rPr>
+                <w:rFonts w:ascii="Times New Roman" w:hAnsi="Times New Roman"/>
+                <w:szCs w:val="24"/>
+              </w:rPr>
+              <w:t xml:space="preserve"> equivalent pulls and scan duty. Active = (3.3 V / 10 </w:t>
+            </w:r>
+            <w:proofErr w:type="spellStart"/>
+            <w:r>
+              <w:rPr>
+                <w:rFonts w:ascii="Times New Roman" w:hAnsi="Times New Roman"/>
+                <w:szCs w:val="24"/>
+              </w:rPr>
+              <w:t>kOhm</w:t>
+            </w:r>
+            <w:proofErr w:type="spellEnd"/>
+            <w:r>
+              <w:rPr>
+                <w:rFonts w:ascii="Times New Roman" w:hAnsi="Times New Roman"/>
+                <w:szCs w:val="24"/>
+              </w:rPr>
+              <w:t xml:space="preserve">) x 0.25 = 0.0825 mA. Idle assumes no </w:t>
+            </w:r>
+            <w:r>
+              <w:rPr>
+                <w:rFonts w:ascii="Times New Roman" w:hAnsi="Times New Roman"/>
+                <w:szCs w:val="24"/>
+              </w:rPr>
+              <w:lastRenderedPageBreak/>
+              <w:t xml:space="preserve">conducting pull path = 0. Design = 4 conducting paths x (3.3 V / 10 </w:t>
+            </w:r>
+            <w:proofErr w:type="spellStart"/>
+            <w:r>
+              <w:rPr>
+                <w:rFonts w:ascii="Times New Roman" w:hAnsi="Times New Roman"/>
+                <w:szCs w:val="24"/>
+              </w:rPr>
+              <w:t>kOhm</w:t>
+            </w:r>
+            <w:proofErr w:type="spellEnd"/>
+            <w:r>
+              <w:rPr>
+                <w:rFonts w:ascii="Times New Roman" w:hAnsi="Times New Roman"/>
+                <w:szCs w:val="24"/>
+              </w:rPr>
+              <w:t>) = 1.320 mA.</w:t>
+            </w:r>
+          </w:p>
+        </w:tc>
+      </w:tr>
+      <w:tr>
+        <w:tc>
+          <w:tcPr>
+            <w:cnfStyle w:val="001000000000" w:firstRow="0" w:lastRow="0" w:firstColumn="1" w:lastColumn="0" w:oddVBand="0" w:evenVBand="0" w:oddHBand="0" w:evenHBand="0" w:firstRowFirstColumn="0" w:firstRowLastColumn="0" w:lastRowFirstColumn="0" w:lastRowLastColumn="0"/>
+            <w:tcW w:w="0" w:type="auto"/>
+            <w:hideMark/>
+          </w:tcPr>
+          <w:p>
+            <w:pPr>
+              <w:suppressAutoHyphens w:val="0"/>
+              <w:rPr>
+                <w:rFonts w:ascii="Times New Roman" w:hAnsi="Times New Roman"/>
+                <w:szCs w:val="24"/>
+              </w:rPr>
+            </w:pPr>
+            <w:r>
+              <w:rPr>
+                <w:rFonts w:ascii="Times New Roman" w:hAnsi="Times New Roman"/>
+                <w:szCs w:val="24"/>
+              </w:rPr>
+              <w:lastRenderedPageBreak/>
+              <w:t>3.3 V</w:t>
+            </w:r>
+          </w:p>
+        </w:tc>
+        <w:tc>
+          <w:tcPr>
+            <w:tcW w:w="1719" w:type="dxa"/>
+            <w:hideMark/>
+          </w:tcPr>
+          <w:p>
+            <w:pPr>
+              <w:suppressAutoHyphens w:val="0"/>
+              <w:cnfStyle w:val="000000000000" w:firstRow="0" w:lastRow="0" w:firstColumn="0" w:lastColumn="0" w:oddVBand="0" w:evenVBand="0" w:oddHBand="0" w:evenHBand="0" w:firstRowFirstColumn="0" w:firstRowLastColumn="0" w:lastRowFirstColumn="0" w:lastRowLastColumn="0"/>
+              <w:rPr>
+                <w:rFonts w:ascii="Times New Roman" w:hAnsi="Times New Roman"/>
+                <w:szCs w:val="24"/>
+              </w:rPr>
+            </w:pPr>
+            <w:r>
+              <w:rPr>
+                <w:rFonts w:ascii="Times New Roman" w:hAnsi="Times New Roman"/>
+                <w:szCs w:val="24"/>
+              </w:rPr>
+              <w:t>External MOSFET gate charging</w:t>
+            </w:r>
+          </w:p>
+        </w:tc>
+        <w:tc>
+          <w:tcPr>
+            <w:tcW w:w="885" w:type="dxa"/>
+            <w:hideMark/>
+          </w:tcPr>
+          <w:p>
+            <w:pPr>
+              <w:suppressAutoHyphens w:val="0"/>
+              <w:jc w:val="right"/>
+              <w:cnfStyle w:val="000000000000" w:firstRow="0" w:lastRow="0" w:firstColumn="0" w:lastColumn="0" w:oddVBand="0" w:evenVBand="0" w:oddHBand="0" w:evenHBand="0" w:firstRowFirstColumn="0" w:firstRowLastColumn="0" w:lastRowFirstColumn="0" w:lastRowLastColumn="0"/>
+              <w:rPr>
+                <w:rFonts w:ascii="Times New Roman" w:hAnsi="Times New Roman"/>
+                <w:szCs w:val="24"/>
+              </w:rPr>
+            </w:pPr>
+            <w:r>
+              <w:rPr>
+                <w:rFonts w:ascii="Times New Roman" w:hAnsi="Times New Roman"/>
+                <w:szCs w:val="24"/>
+              </w:rPr>
+              <w:t>0.0144</w:t>
+            </w:r>
+          </w:p>
+        </w:tc>
+        <w:tc>
+          <w:tcPr>
+            <w:tcW w:w="0" w:type="auto"/>
+            <w:hideMark/>
+          </w:tcPr>
+          <w:p>
+            <w:pPr>
+              <w:suppressAutoHyphens w:val="0"/>
+              <w:jc w:val="right"/>
+              <w:cnfStyle w:val="000000000000" w:firstRow="0" w:lastRow="0" w:firstColumn="0" w:lastColumn="0" w:oddVBand="0" w:evenVBand="0" w:oddHBand="0" w:evenHBand="0" w:firstRowFirstColumn="0" w:firstRowLastColumn="0" w:lastRowFirstColumn="0" w:lastRowLastColumn="0"/>
+              <w:rPr>
+                <w:rFonts w:ascii="Times New Roman" w:hAnsi="Times New Roman"/>
+                <w:szCs w:val="24"/>
+              </w:rPr>
+            </w:pPr>
+            <w:r>
+              <w:rPr>
+                <w:rFonts w:ascii="Times New Roman" w:hAnsi="Times New Roman"/>
+                <w:szCs w:val="24"/>
+              </w:rPr>
+              <w:t>0</w:t>
+            </w:r>
+          </w:p>
+        </w:tc>
+        <w:tc>
+          <w:tcPr>
+            <w:tcW w:w="0" w:type="auto"/>
+            <w:hideMark/>
+          </w:tcPr>
+          <w:p>
+            <w:pPr>
+              <w:suppressAutoHyphens w:val="0"/>
+              <w:jc w:val="right"/>
+              <w:cnfStyle w:val="000000000000" w:firstRow="0" w:lastRow="0" w:firstColumn="0" w:lastColumn="0" w:oddVBand="0" w:evenVBand="0" w:oddHBand="0" w:evenHBand="0" w:firstRowFirstColumn="0" w:firstRowLastColumn="0" w:lastRowFirstColumn="0" w:lastRowLastColumn="0"/>
+              <w:rPr>
+                <w:rFonts w:ascii="Times New Roman" w:hAnsi="Times New Roman"/>
+                <w:szCs w:val="24"/>
+              </w:rPr>
+            </w:pPr>
+            <w:r>
+              <w:rPr>
+                <w:rFonts w:ascii="Times New Roman" w:hAnsi="Times New Roman"/>
+                <w:szCs w:val="24"/>
+              </w:rPr>
+              <w:t>0.048</w:t>
+            </w:r>
+          </w:p>
+        </w:tc>
+        <w:tc>
+          <w:tcPr>
+            <w:tcW w:w="0" w:type="auto"/>
+            <w:hideMark/>
+          </w:tcPr>
+          <w:p>
+            <w:pPr>
+              <w:suppressAutoHyphens w:val="0"/>
+              <w:cnfStyle w:val="000000000000" w:firstRow="0" w:lastRow="0" w:firstColumn="0" w:lastColumn="0" w:oddVBand="0" w:evenVBand="0" w:oddHBand="0" w:evenHBand="0" w:firstRowFirstColumn="0" w:firstRowLastColumn="0" w:lastRowFirstColumn="0" w:lastRowLastColumn="0"/>
+              <w:rPr>
+                <w:rFonts w:ascii="Times New Roman" w:hAnsi="Times New Roman"/>
+                <w:szCs w:val="24"/>
+              </w:rPr>
+            </w:pPr>
+            <w:proofErr w:type="spellStart"/>
+            <w:r>
+              <w:rPr>
+                <w:rFonts w:ascii="Times New Roman" w:hAnsi="Times New Roman"/>
+                <w:szCs w:val="24"/>
+              </w:rPr>
+              <w:t>Igate</w:t>
+            </w:r>
+            <w:proofErr w:type="spellEnd"/>
+            <w:r>
+              <w:rPr>
+                <w:rFonts w:ascii="Times New Roman" w:hAnsi="Times New Roman"/>
+                <w:szCs w:val="24"/>
+              </w:rPr>
+              <w:t xml:space="preserve"> = number of switching gates x </w:t>
+            </w:r>
+            <w:proofErr w:type="spellStart"/>
+            <w:r>
+              <w:rPr>
+                <w:rFonts w:ascii="Times New Roman" w:hAnsi="Times New Roman"/>
+                <w:szCs w:val="24"/>
+              </w:rPr>
+              <w:t>Qg</w:t>
+            </w:r>
+            <w:proofErr w:type="spellEnd"/>
+            <w:r>
+              <w:rPr>
+                <w:rFonts w:ascii="Times New Roman" w:hAnsi="Times New Roman"/>
+                <w:szCs w:val="24"/>
+              </w:rPr>
+              <w:t xml:space="preserve"> x frequency. Active = 3 x 2.4 </w:t>
+            </w:r>
+            <w:proofErr w:type="spellStart"/>
+            <w:r>
+              <w:rPr>
+                <w:rFonts w:ascii="Times New Roman" w:hAnsi="Times New Roman"/>
+                <w:szCs w:val="24"/>
+              </w:rPr>
+              <w:t>nC</w:t>
+            </w:r>
+            <w:proofErr w:type="spellEnd"/>
+            <w:r>
+              <w:rPr>
+                <w:rFonts w:ascii="Times New Roman" w:hAnsi="Times New Roman"/>
+                <w:szCs w:val="24"/>
+              </w:rPr>
+              <w:t xml:space="preserve"> x 2 kHz = 14.4 </w:t>
+            </w:r>
+            <w:proofErr w:type="spellStart"/>
+            <w:r>
+              <w:rPr>
+                <w:rFonts w:ascii="Times New Roman" w:hAnsi="Times New Roman"/>
+                <w:szCs w:val="24"/>
+              </w:rPr>
+              <w:t>uA</w:t>
+            </w:r>
+            <w:proofErr w:type="spellEnd"/>
+            <w:r>
+              <w:rPr>
+                <w:rFonts w:ascii="Times New Roman" w:hAnsi="Times New Roman"/>
+                <w:szCs w:val="24"/>
+              </w:rPr>
+              <w:t xml:space="preserve"> = 0.0144 mA. Idle assumes no switching = 0. Design = 4 x 6 </w:t>
+            </w:r>
+            <w:proofErr w:type="spellStart"/>
+            <w:r>
+              <w:rPr>
+                <w:rFonts w:ascii="Times New Roman" w:hAnsi="Times New Roman"/>
+                <w:szCs w:val="24"/>
+              </w:rPr>
+              <w:t>nC</w:t>
+            </w:r>
+            <w:proofErr w:type="spellEnd"/>
+            <w:r>
+              <w:rPr>
+                <w:rFonts w:ascii="Times New Roman" w:hAnsi="Times New Roman"/>
+                <w:szCs w:val="24"/>
+              </w:rPr>
+              <w:t xml:space="preserve"> x 2 kHz = 48 </w:t>
+            </w:r>
+            <w:proofErr w:type="spellStart"/>
+            <w:r>
+              <w:rPr>
+                <w:rFonts w:ascii="Times New Roman" w:hAnsi="Times New Roman"/>
+                <w:szCs w:val="24"/>
+              </w:rPr>
+              <w:t>uA</w:t>
+            </w:r>
+            <w:proofErr w:type="spellEnd"/>
+            <w:r>
+              <w:rPr>
+                <w:rFonts w:ascii="Times New Roman" w:hAnsi="Times New Roman"/>
+                <w:szCs w:val="24"/>
+              </w:rPr>
+              <w:t xml:space="preserve"> = 0.048 mA. D gate-charge references; A frequency, gate count and application to 3.3 V drive.</w:t>
+            </w:r>
+          </w:p>
+        </w:tc>
+      </w:tr>
+      <w:tr>
+        <w:tc>
+          <w:tcPr>
+            <w:cnfStyle w:val="001000000000" w:firstRow="0" w:lastRow="0" w:firstColumn="1" w:lastColumn="0" w:oddVBand="0" w:evenVBand="0" w:oddHBand="0" w:evenHBand="0" w:firstRowFirstColumn="0" w:firstRowLastColumn="0" w:lastRowFirstColumn="0" w:lastRowLastColumn="0"/>
+            <w:tcW w:w="0" w:type="auto"/>
+            <w:hideMark/>
+          </w:tcPr>
+          <w:p>
+            <w:pPr>
+              <w:suppressAutoHyphens w:val="0"/>
+              <w:rPr>
+                <w:rFonts w:ascii="Times New Roman" w:hAnsi="Times New Roman"/>
+                <w:szCs w:val="24"/>
+              </w:rPr>
+            </w:pPr>
+            <w:r>
+              <w:rPr>
+                <w:rFonts w:ascii="Times New Roman" w:hAnsi="Times New Roman"/>
+                <w:szCs w:val="24"/>
+              </w:rPr>
+              <w:t>3.3 V</w:t>
+            </w:r>
+          </w:p>
+        </w:tc>
+        <w:tc>
+          <w:tcPr>
+            <w:tcW w:w="1719" w:type="dxa"/>
+            <w:hideMark/>
+          </w:tcPr>
+          <w:p>
+            <w:pPr>
+              <w:suppressAutoHyphens w:val="0"/>
+              <w:cnfStyle w:val="000000000000" w:firstRow="0" w:lastRow="0" w:firstColumn="0" w:lastColumn="0" w:oddVBand="0" w:evenVBand="0" w:oddHBand="0" w:evenHBand="0" w:firstRowFirstColumn="0" w:firstRowLastColumn="0" w:lastRowFirstColumn="0" w:lastRowLastColumn="0"/>
+              <w:rPr>
+                <w:rFonts w:ascii="Times New Roman" w:hAnsi="Times New Roman"/>
+                <w:szCs w:val="24"/>
+              </w:rPr>
+            </w:pPr>
+            <w:r>
+              <w:rPr>
+                <w:rFonts w:ascii="Times New Roman" w:hAnsi="Times New Roman"/>
+                <w:szCs w:val="24"/>
+              </w:rPr>
+              <w:t>U1 VREF/control inputs</w:t>
+            </w:r>
+          </w:p>
+        </w:tc>
+        <w:tc>
+          <w:tcPr>
+            <w:tcW w:w="885" w:type="dxa"/>
+            <w:hideMark/>
+          </w:tcPr>
+          <w:p>
+            <w:pPr>
+              <w:suppressAutoHyphens w:val="0"/>
+              <w:jc w:val="right"/>
+              <w:cnfStyle w:val="000000000000" w:firstRow="0" w:lastRow="0" w:firstColumn="0" w:lastColumn="0" w:oddVBand="0" w:evenVBand="0" w:oddHBand="0" w:evenHBand="0" w:firstRowFirstColumn="0" w:firstRowLastColumn="0" w:lastRowFirstColumn="0" w:lastRowLastColumn="0"/>
+              <w:rPr>
+                <w:rFonts w:ascii="Times New Roman" w:hAnsi="Times New Roman"/>
+                <w:szCs w:val="24"/>
+              </w:rPr>
+            </w:pPr>
+            <w:r>
+              <w:rPr>
+                <w:rFonts w:ascii="Times New Roman" w:hAnsi="Times New Roman"/>
+                <w:szCs w:val="24"/>
+              </w:rPr>
+              <w:t>0.043</w:t>
+            </w:r>
+          </w:p>
+        </w:tc>
+        <w:tc>
+          <w:tcPr>
+            <w:tcW w:w="0" w:type="auto"/>
+            <w:hideMark/>
+          </w:tcPr>
+          <w:p>
+            <w:pPr>
+              <w:suppressAutoHyphens w:val="0"/>
+              <w:jc w:val="right"/>
+              <w:cnfStyle w:val="000000000000" w:firstRow="0" w:lastRow="0" w:firstColumn="0" w:lastColumn="0" w:oddVBand="0" w:evenVBand="0" w:oddHBand="0" w:evenHBand="0" w:firstRowFirstColumn="0" w:firstRowLastColumn="0" w:lastRowFirstColumn="0" w:lastRowLastColumn="0"/>
+              <w:rPr>
+                <w:rFonts w:ascii="Times New Roman" w:hAnsi="Times New Roman"/>
+                <w:szCs w:val="24"/>
+              </w:rPr>
+            </w:pPr>
+            <w:r>
+              <w:rPr>
+                <w:rFonts w:ascii="Times New Roman" w:hAnsi="Times New Roman"/>
+                <w:szCs w:val="24"/>
+              </w:rPr>
+              <w:t>0.010</w:t>
+            </w:r>
+          </w:p>
+        </w:tc>
+        <w:tc>
+          <w:tcPr>
+            <w:tcW w:w="0" w:type="auto"/>
+            <w:hideMark/>
+          </w:tcPr>
+          <w:p>
+            <w:pPr>
+              <w:suppressAutoHyphens w:val="0"/>
+              <w:jc w:val="right"/>
+              <w:cnfStyle w:val="000000000000" w:firstRow="0" w:lastRow="0" w:firstColumn="0" w:lastColumn="0" w:oddVBand="0" w:evenVBand="0" w:oddHBand="0" w:evenHBand="0" w:firstRowFirstColumn="0" w:firstRowLastColumn="0" w:lastRowFirstColumn="0" w:lastRowLastColumn="0"/>
+              <w:rPr>
+                <w:rFonts w:ascii="Times New Roman" w:hAnsi="Times New Roman"/>
+                <w:szCs w:val="24"/>
+              </w:rPr>
+            </w:pPr>
+            <w:r>
+              <w:rPr>
+                <w:rFonts w:ascii="Times New Roman" w:hAnsi="Times New Roman"/>
+                <w:szCs w:val="24"/>
+              </w:rPr>
+              <w:t>0.120</w:t>
+            </w:r>
+          </w:p>
+        </w:tc>
+        <w:tc>
+          <w:tcPr>
+            <w:tcW w:w="0" w:type="auto"/>
+            <w:hideMark/>
+          </w:tcPr>
+          <w:p>
+            <w:pPr>
+              <w:suppressAutoHyphens w:val="0"/>
+              <w:cnfStyle w:val="000000000000" w:firstRow="0" w:lastRow="0" w:firstColumn="0" w:lastColumn="0" w:oddVBand="0" w:evenVBand="0" w:oddHBand="0" w:evenHBand="0" w:firstRowFirstColumn="0" w:firstRowLastColumn="0" w:lastRowFirstColumn="0" w:lastRowLastColumn="0"/>
+              <w:rPr>
+                <w:rFonts w:ascii="Times New Roman" w:hAnsi="Times New Roman"/>
+                <w:szCs w:val="24"/>
+              </w:rPr>
+            </w:pPr>
+            <w:r>
+              <w:rPr>
+                <w:rFonts w:ascii="Times New Roman" w:hAnsi="Times New Roman"/>
+                <w:szCs w:val="24"/>
+              </w:rPr>
+              <w:t xml:space="preserve">Active = 10 </w:t>
+            </w:r>
+            <w:proofErr w:type="spellStart"/>
+            <w:r>
+              <w:rPr>
+                <w:rFonts w:ascii="Times New Roman" w:hAnsi="Times New Roman"/>
+                <w:szCs w:val="24"/>
+              </w:rPr>
+              <w:t>uA</w:t>
+            </w:r>
+            <w:proofErr w:type="spellEnd"/>
+            <w:r>
+              <w:rPr>
+                <w:rFonts w:ascii="Times New Roman" w:hAnsi="Times New Roman"/>
+                <w:szCs w:val="24"/>
+              </w:rPr>
+              <w:t xml:space="preserve"> assumed VREF leakage + 33 </w:t>
+            </w:r>
+            <w:proofErr w:type="spellStart"/>
+            <w:r>
+              <w:rPr>
+                <w:rFonts w:ascii="Times New Roman" w:hAnsi="Times New Roman"/>
+                <w:szCs w:val="24"/>
+              </w:rPr>
+              <w:t>uA</w:t>
+            </w:r>
+            <w:proofErr w:type="spellEnd"/>
+            <w:r>
+              <w:rPr>
+                <w:rFonts w:ascii="Times New Roman" w:hAnsi="Times New Roman"/>
+                <w:szCs w:val="24"/>
+              </w:rPr>
+              <w:t xml:space="preserve"> datasheet typical high-input current = 43 </w:t>
+            </w:r>
+            <w:proofErr w:type="spellStart"/>
+            <w:r>
+              <w:rPr>
+                <w:rFonts w:ascii="Times New Roman" w:hAnsi="Times New Roman"/>
+                <w:szCs w:val="24"/>
+              </w:rPr>
+              <w:t>uA</w:t>
+            </w:r>
+            <w:proofErr w:type="spellEnd"/>
+            <w:r>
+              <w:rPr>
+                <w:rFonts w:ascii="Times New Roman" w:hAnsi="Times New Roman"/>
+                <w:szCs w:val="24"/>
+              </w:rPr>
+              <w:t xml:space="preserve"> = 0.043 mA. Idle = 10 </w:t>
+            </w:r>
+            <w:proofErr w:type="spellStart"/>
+            <w:r>
+              <w:rPr>
+                <w:rFonts w:ascii="Times New Roman" w:hAnsi="Times New Roman"/>
+                <w:szCs w:val="24"/>
+              </w:rPr>
+              <w:t>uA</w:t>
+            </w:r>
+            <w:proofErr w:type="spellEnd"/>
+            <w:r>
+              <w:rPr>
+                <w:rFonts w:ascii="Times New Roman" w:hAnsi="Times New Roman"/>
+                <w:szCs w:val="24"/>
+              </w:rPr>
+              <w:t xml:space="preserve"> / 1000 = 0.010 mA, A. Design = 20 </w:t>
+            </w:r>
+            <w:proofErr w:type="spellStart"/>
+            <w:r>
+              <w:rPr>
+                <w:rFonts w:ascii="Times New Roman" w:hAnsi="Times New Roman"/>
+                <w:szCs w:val="24"/>
+              </w:rPr>
+              <w:t>uA</w:t>
+            </w:r>
+            <w:proofErr w:type="spellEnd"/>
+            <w:r>
+              <w:rPr>
+                <w:rFonts w:ascii="Times New Roman" w:hAnsi="Times New Roman"/>
+                <w:szCs w:val="24"/>
+              </w:rPr>
+              <w:t xml:space="preserve"> assumed VREF leakage + 100 </w:t>
+            </w:r>
+            <w:proofErr w:type="spellStart"/>
+            <w:r>
+              <w:rPr>
+                <w:rFonts w:ascii="Times New Roman" w:hAnsi="Times New Roman"/>
+                <w:szCs w:val="24"/>
+              </w:rPr>
+              <w:t>uA</w:t>
+            </w:r>
+            <w:proofErr w:type="spellEnd"/>
+            <w:r>
+              <w:rPr>
+                <w:rFonts w:ascii="Times New Roman" w:hAnsi="Times New Roman"/>
+                <w:szCs w:val="24"/>
+              </w:rPr>
+              <w:t xml:space="preserve"> datasheet maximum high-input current = 0.120 mA.</w:t>
+            </w:r>
+          </w:p>
+        </w:tc>
+      </w:tr>
+      <w:tr>
+        <w:tc>
+          <w:tcPr>
+            <w:cnfStyle w:val="001000000000" w:firstRow="0" w:lastRow="0" w:firstColumn="1" w:lastColumn="0" w:oddVBand="0" w:evenVBand="0" w:oddHBand="0" w:evenHBand="0" w:firstRowFirstColumn="0" w:firstRowLastColumn="0" w:lastRowFirstColumn="0" w:lastRowLastColumn="0"/>
+            <w:tcW w:w="0" w:type="auto"/>
+            <w:hideMark/>
+          </w:tcPr>
+          <w:p>
+            <w:pPr>
+              <w:suppressAutoHyphens w:val="0"/>
+              <w:rPr>
+                <w:rFonts w:ascii="Times New Roman" w:hAnsi="Times New Roman"/>
+                <w:szCs w:val="24"/>
+              </w:rPr>
+            </w:pPr>
+            <w:r>
+              <w:rPr>
+                <w:rFonts w:ascii="Times New Roman" w:hAnsi="Times New Roman"/>
+                <w:szCs w:val="24"/>
+              </w:rPr>
+              <w:t>3.3 V</w:t>
+            </w:r>
+          </w:p>
+        </w:tc>
+        <w:tc>
+          <w:tcPr>
+            <w:tcW w:w="1719" w:type="dxa"/>
+            <w:hideMark/>
+          </w:tcPr>
+          <w:p>
+            <w:pPr>
+              <w:suppressAutoHyphens w:val="0"/>
+              <w:cnfStyle w:val="000000000000" w:firstRow="0" w:lastRow="0" w:firstColumn="0" w:lastColumn="0" w:oddVBand="0" w:evenVBand="0" w:oddHBand="0" w:evenHBand="0" w:firstRowFirstColumn="0" w:firstRowLastColumn="0" w:lastRowFirstColumn="0" w:lastRowLastColumn="0"/>
+              <w:rPr>
+                <w:rFonts w:ascii="Times New Roman" w:hAnsi="Times New Roman"/>
+                <w:szCs w:val="24"/>
+              </w:rPr>
+            </w:pPr>
+            <w:r>
+              <w:rPr>
+                <w:rFonts w:ascii="Times New Roman" w:hAnsi="Times New Roman"/>
+                <w:szCs w:val="24"/>
+              </w:rPr>
+              <w:t>Other leakage</w:t>
+            </w:r>
+          </w:p>
+        </w:tc>
+        <w:tc>
+          <w:tcPr>
+            <w:tcW w:w="885" w:type="dxa"/>
+            <w:hideMark/>
+          </w:tcPr>
+          <w:p>
+            <w:pPr>
+              <w:suppressAutoHyphens w:val="0"/>
+              <w:jc w:val="right"/>
+              <w:cnfStyle w:val="000000000000" w:firstRow="0" w:lastRow="0" w:firstColumn="0" w:lastColumn="0" w:oddVBand="0" w:evenVBand="0" w:oddHBand="0" w:evenHBand="0" w:firstRowFirstColumn="0" w:firstRowLastColumn="0" w:lastRowFirstColumn="0" w:lastRowLastColumn="0"/>
+              <w:rPr>
+                <w:rFonts w:ascii="Times New Roman" w:hAnsi="Times New Roman"/>
+                <w:szCs w:val="24"/>
+              </w:rPr>
+            </w:pPr>
+            <w:r>
+              <w:rPr>
+                <w:rFonts w:ascii="Times New Roman" w:hAnsi="Times New Roman"/>
+                <w:szCs w:val="24"/>
+              </w:rPr>
+              <w:t>0.100</w:t>
+            </w:r>
+          </w:p>
+        </w:tc>
+        <w:tc>
+          <w:tcPr>
+            <w:tcW w:w="0" w:type="auto"/>
+            <w:hideMark/>
+          </w:tcPr>
+          <w:p>
+            <w:pPr>
+              <w:suppressAutoHyphens w:val="0"/>
+              <w:jc w:val="right"/>
+              <w:cnfStyle w:val="000000000000" w:firstRow="0" w:lastRow="0" w:firstColumn="0" w:lastColumn="0" w:oddVBand="0" w:evenVBand="0" w:oddHBand="0" w:evenHBand="0" w:firstRowFirstColumn="0" w:firstRowLastColumn="0" w:lastRowFirstColumn="0" w:lastRowLastColumn="0"/>
+              <w:rPr>
+                <w:rFonts w:ascii="Times New Roman" w:hAnsi="Times New Roman"/>
+                <w:szCs w:val="24"/>
+              </w:rPr>
+            </w:pPr>
+            <w:r>
+              <w:rPr>
+                <w:rFonts w:ascii="Times New Roman" w:hAnsi="Times New Roman"/>
+                <w:szCs w:val="24"/>
+              </w:rPr>
+              <w:t>0.100</w:t>
+            </w:r>
+          </w:p>
+        </w:tc>
+        <w:tc>
+          <w:tcPr>
+            <w:tcW w:w="0" w:type="auto"/>
+            <w:hideMark/>
+          </w:tcPr>
+          <w:p>
+            <w:pPr>
+              <w:suppressAutoHyphens w:val="0"/>
+              <w:jc w:val="right"/>
+              <w:cnfStyle w:val="000000000000" w:firstRow="0" w:lastRow="0" w:firstColumn="0" w:lastColumn="0" w:oddVBand="0" w:evenVBand="0" w:oddHBand="0" w:evenHBand="0" w:firstRowFirstColumn="0" w:firstRowLastColumn="0" w:lastRowFirstColumn="0" w:lastRowLastColumn="0"/>
+              <w:rPr>
+                <w:rFonts w:ascii="Times New Roman" w:hAnsi="Times New Roman"/>
+                <w:szCs w:val="24"/>
+              </w:rPr>
+            </w:pPr>
+            <w:r>
+              <w:rPr>
+                <w:rFonts w:ascii="Times New Roman" w:hAnsi="Times New Roman"/>
+                <w:szCs w:val="24"/>
+              </w:rPr>
+              <w:t>1.000</w:t>
+            </w:r>
+          </w:p>
+        </w:tc>
+        <w:tc>
+          <w:tcPr>
+            <w:tcW w:w="0" w:type="auto"/>
+            <w:hideMark/>
+          </w:tcPr>
+          <w:p>
+            <w:pPr>
+              <w:suppressAutoHyphens w:val="0"/>
+              <w:cnfStyle w:val="000000000000" w:firstRow="0" w:lastRow="0" w:firstColumn="0" w:lastColumn="0" w:oddVBand="0" w:evenVBand="0" w:oddHBand="0" w:evenHBand="0" w:firstRowFirstColumn="0" w:firstRowLastColumn="0" w:lastRowFirstColumn="0" w:lastRowLastColumn="0"/>
+              <w:rPr>
+                <w:rFonts w:ascii="Times New Roman" w:hAnsi="Times New Roman"/>
+                <w:szCs w:val="24"/>
+              </w:rPr>
+            </w:pPr>
+            <w:proofErr w:type="gramStart"/>
+            <w:r>
+              <w:rPr>
+                <w:rFonts w:ascii="Times New Roman" w:hAnsi="Times New Roman"/>
+                <w:szCs w:val="24"/>
+              </w:rPr>
+              <w:t>A</w:t>
+            </w:r>
+            <w:proofErr w:type="gramEnd"/>
+            <w:r>
+              <w:rPr>
+                <w:rFonts w:ascii="Times New Roman" w:hAnsi="Times New Roman"/>
+                <w:szCs w:val="24"/>
+              </w:rPr>
+              <w:t xml:space="preserve"> aggregate allowance for capacitor, protection and other small leakage: active = 0.100 mA; idle = 0.100 mA; design = 1.000 mA.</w:t>
+            </w:r>
+          </w:p>
+        </w:tc>
+      </w:tr>
+      <w:tr>
+        <w:tc>
+          <w:tcPr>
+            <w:cnfStyle w:val="001000000000" w:firstRow="0" w:lastRow="0" w:firstColumn="1" w:lastColumn="0" w:oddVBand="0" w:evenVBand="0" w:oddHBand="0" w:evenHBand="0" w:firstRowFirstColumn="0" w:firstRowLastColumn="0" w:lastRowFirstColumn="0" w:lastRowLastColumn="0"/>
+            <w:tcW w:w="0" w:type="auto"/>
+            <w:hideMark/>
+          </w:tcPr>
+          <w:p>
+            <w:pPr>
+              <w:suppressAutoHyphens w:val="0"/>
+              <w:rPr>
+                <w:rFonts w:ascii="Times New Roman" w:hAnsi="Times New Roman"/>
+                <w:szCs w:val="24"/>
+              </w:rPr>
+            </w:pPr>
+            <w:r>
+              <w:rPr>
+                <w:rFonts w:ascii="Times New Roman" w:hAnsi="Times New Roman"/>
+                <w:szCs w:val="24"/>
+              </w:rPr>
+              <w:t>5 V</w:t>
+            </w:r>
+          </w:p>
+        </w:tc>
+        <w:tc>
+          <w:tcPr>
+            <w:tcW w:w="1719" w:type="dxa"/>
+            <w:hideMark/>
+          </w:tcPr>
+          <w:p>
+            <w:pPr>
+              <w:suppressAutoHyphens w:val="0"/>
+              <w:cnfStyle w:val="000000000000" w:firstRow="0" w:lastRow="0" w:firstColumn="0" w:lastColumn="0" w:oddVBand="0" w:evenVBand="0" w:oddHBand="0" w:evenHBand="0" w:firstRowFirstColumn="0" w:firstRowLastColumn="0" w:lastRowFirstColumn="0" w:lastRowLastColumn="0"/>
+              <w:rPr>
+                <w:rFonts w:ascii="Times New Roman" w:hAnsi="Times New Roman"/>
+                <w:szCs w:val="24"/>
+              </w:rPr>
+            </w:pPr>
+            <w:r>
+              <w:rPr>
+                <w:rFonts w:ascii="Times New Roman" w:hAnsi="Times New Roman"/>
+                <w:b/>
+                <w:bCs/>
+                <w:szCs w:val="24"/>
+              </w:rPr>
+              <w:t>M1–M12, one selected N20 motor</w:t>
+            </w:r>
+          </w:p>
+        </w:tc>
+        <w:tc>
+          <w:tcPr>
+            <w:tcW w:w="885" w:type="dxa"/>
+            <w:hideMark/>
+          </w:tcPr>
+          <w:p>
+            <w:pPr>
+              <w:suppressAutoHyphens w:val="0"/>
+              <w:jc w:val="right"/>
+              <w:cnfStyle w:val="000000000000" w:firstRow="0" w:lastRow="0" w:firstColumn="0" w:lastColumn="0" w:oddVBand="0" w:evenVBand="0" w:oddHBand="0" w:evenHBand="0" w:firstRowFirstColumn="0" w:firstRowLastColumn="0" w:lastRowFirstColumn="0" w:lastRowLastColumn="0"/>
+              <w:rPr>
+                <w:rFonts w:ascii="Times New Roman" w:hAnsi="Times New Roman"/>
+                <w:szCs w:val="24"/>
+              </w:rPr>
+            </w:pPr>
+            <w:r>
+              <w:rPr>
+                <w:rFonts w:ascii="Times New Roman" w:hAnsi="Times New Roman"/>
+                <w:b/>
+                <w:bCs/>
+                <w:szCs w:val="24"/>
+              </w:rPr>
+              <w:t>98</w:t>
+            </w:r>
+          </w:p>
+        </w:tc>
+        <w:tc>
+          <w:tcPr>
+            <w:tcW w:w="0" w:type="auto"/>
+            <w:hideMark/>
+          </w:tcPr>
+          <w:p>
+            <w:pPr>
+              <w:suppressAutoHyphens w:val="0"/>
+              <w:jc w:val="right"/>
+              <w:cnfStyle w:val="000000000000" w:firstRow="0" w:lastRow="0" w:firstColumn="0" w:lastColumn="0" w:oddVBand="0" w:evenVBand="0" w:oddHBand="0" w:evenHBand="0" w:firstRowFirstColumn="0" w:firstRowLastColumn="0" w:lastRowFirstColumn="0" w:lastRowLastColumn="0"/>
+              <w:rPr>
+                <w:rFonts w:ascii="Times New Roman" w:hAnsi="Times New Roman"/>
+                <w:szCs w:val="24"/>
+              </w:rPr>
+            </w:pPr>
+            <w:r>
+              <w:rPr>
+                <w:rFonts w:ascii="Times New Roman" w:hAnsi="Times New Roman"/>
+                <w:b/>
+                <w:bCs/>
+                <w:szCs w:val="24"/>
+              </w:rPr>
+              <w:t>0</w:t>
+            </w:r>
+          </w:p>
+        </w:tc>
+        <w:tc>
+          <w:tcPr>
+            <w:tcW w:w="0" w:type="auto"/>
+            <w:hideMark/>
+          </w:tcPr>
+          <w:p>
+            <w:pPr>
+              <w:suppressAutoHyphens w:val="0"/>
+              <w:jc w:val="right"/>
+              <w:cnfStyle w:val="000000000000" w:firstRow="0" w:lastRow="0" w:firstColumn="0" w:lastColumn="0" w:oddVBand="0" w:evenVBand="0" w:oddHBand="0" w:evenHBand="0" w:firstRowFirstColumn="0" w:firstRowLastColumn="0" w:lastRowFirstColumn="0" w:lastRowLastColumn="0"/>
+              <w:rPr>
+                <w:rFonts w:ascii="Times New Roman" w:hAnsi="Times New Roman"/>
+                <w:szCs w:val="24"/>
+              </w:rPr>
+            </w:pPr>
+            <w:r>
+              <w:rPr>
+                <w:rFonts w:ascii="Times New Roman" w:hAnsi="Times New Roman"/>
+                <w:b/>
+                <w:bCs/>
+                <w:szCs w:val="24"/>
+              </w:rPr>
+              <w:t>980</w:t>
+            </w:r>
+          </w:p>
+        </w:tc>
+        <w:tc>
+          <w:tcPr>
+            <w:tcW w:w="0" w:type="auto"/>
+            <w:hideMark/>
+          </w:tcPr>
+          <w:p>
+            <w:pPr>
+              <w:suppressAutoHyphens w:val="0"/>
+              <w:cnfStyle w:val="000000000000" w:firstRow="0" w:lastRow="0" w:firstColumn="0" w:lastColumn="0" w:oddVBand="0" w:evenVBand="0" w:oddHBand="0" w:evenHBand="0" w:firstRowFirstColumn="0" w:firstRowLastColumn="0" w:lastRowFirstColumn="0" w:lastRowLastColumn="0"/>
+              <w:rPr>
+                <w:rFonts w:ascii="Times New Roman" w:hAnsi="Times New Roman"/>
+                <w:szCs w:val="24"/>
+              </w:rPr>
+            </w:pPr>
+            <w:r>
+              <w:rPr>
+                <w:rFonts w:ascii="Times New Roman" w:hAnsi="Times New Roman"/>
+                <w:szCs w:val="24"/>
+              </w:rPr>
+              <w:t xml:space="preserve">S: 35 mA at 3 V and 56 mA at 6 V, loading unspecified. </w:t>
+            </w:r>
+            <w:proofErr w:type="gramStart"/>
+            <w:r>
+              <w:rPr>
+                <w:rFonts w:ascii="Times New Roman" w:hAnsi="Times New Roman"/>
+                <w:szCs w:val="24"/>
+              </w:rPr>
+              <w:t>A</w:t>
+            </w:r>
+            <w:proofErr w:type="gramEnd"/>
+            <w:r>
+              <w:rPr>
+                <w:rFonts w:ascii="Times New Roman" w:hAnsi="Times New Roman"/>
+                <w:szCs w:val="24"/>
+              </w:rPr>
+              <w:t xml:space="preserve"> interpolation: 35 mA + [(5 V - 3 V) / (6 V - 3 V)] x (56 mA - 35 mA) = 49 mA. Active allowance = 2 x 49 mA = 98 mA. Idle = 0. Design allowance = 20 x 49 mA = 980 mA. </w:t>
+            </w:r>
+          </w:p>
+        </w:tc>
+      </w:tr>
+      <w:tr>
+        <w:tc>
+          <w:tcPr>
+            <w:cnfStyle w:val="001000000000" w:firstRow="0" w:lastRow="0" w:firstColumn="1" w:lastColumn="0" w:oddVBand="0" w:evenVBand="0" w:oddHBand="0" w:evenHBand="0" w:firstRowFirstColumn="0" w:firstRowLastColumn="0" w:lastRowFirstColumn="0" w:lastRowLastColumn="0"/>
+            <w:tcW w:w="0" w:type="auto"/>
+            <w:hideMark/>
+          </w:tcPr>
+          <w:p>
+            <w:pPr>
+              <w:suppressAutoHyphens w:val="0"/>
+              <w:rPr>
+                <w:rFonts w:ascii="Times New Roman" w:hAnsi="Times New Roman"/>
+                <w:szCs w:val="24"/>
+              </w:rPr>
+            </w:pPr>
+            <w:r>
+              <w:rPr>
+                <w:rFonts w:ascii="Times New Roman" w:hAnsi="Times New Roman"/>
+                <w:szCs w:val="24"/>
+              </w:rPr>
+              <w:t>12 V</w:t>
+            </w:r>
+          </w:p>
+        </w:tc>
+        <w:tc>
+          <w:tcPr>
+            <w:tcW w:w="1719" w:type="dxa"/>
+            <w:hideMark/>
+          </w:tcPr>
+          <w:p>
+            <w:pPr>
+              <w:suppressAutoHyphens w:val="0"/>
+              <w:cnfStyle w:val="000000000000" w:firstRow="0" w:lastRow="0" w:firstColumn="0" w:lastColumn="0" w:oddVBand="0" w:evenVBand="0" w:oddHBand="0" w:evenHBand="0" w:firstRowFirstColumn="0" w:firstRowLastColumn="0" w:lastRowFirstColumn="0" w:lastRowLastColumn="0"/>
+              <w:rPr>
+                <w:rFonts w:ascii="Times New Roman" w:hAnsi="Times New Roman"/>
+                <w:szCs w:val="24"/>
+              </w:rPr>
+            </w:pPr>
+            <w:r>
+              <w:rPr>
+                <w:rFonts w:ascii="Times New Roman" w:hAnsi="Times New Roman"/>
+                <w:szCs w:val="24"/>
+              </w:rPr>
+              <w:t>Mwinch1</w:t>
+            </w:r>
+          </w:p>
+        </w:tc>
+        <w:tc>
+          <w:tcPr>
+            <w:tcW w:w="885" w:type="dxa"/>
+            <w:hideMark/>
+          </w:tcPr>
+          <w:p>
+            <w:pPr>
+              <w:suppressAutoHyphens w:val="0"/>
+              <w:jc w:val="right"/>
+              <w:cnfStyle w:val="000000000000" w:firstRow="0" w:lastRow="0" w:firstColumn="0" w:lastColumn="0" w:oddVBand="0" w:evenVBand="0" w:oddHBand="0" w:evenHBand="0" w:firstRowFirstColumn="0" w:firstRowLastColumn="0" w:lastRowFirstColumn="0" w:lastRowLastColumn="0"/>
+              <w:rPr>
+                <w:rFonts w:ascii="Times New Roman" w:hAnsi="Times New Roman"/>
+                <w:szCs w:val="24"/>
+              </w:rPr>
+            </w:pPr>
+            <w:r>
+              <w:rPr>
+                <w:rFonts w:ascii="Times New Roman" w:hAnsi="Times New Roman"/>
+                <w:szCs w:val="24"/>
+              </w:rPr>
+              <w:t>1000</w:t>
+            </w:r>
+          </w:p>
+        </w:tc>
+        <w:tc>
+          <w:tcPr>
+            <w:tcW w:w="0" w:type="auto"/>
+            <w:hideMark/>
+          </w:tcPr>
+          <w:p>
+            <w:pPr>
+              <w:suppressAutoHyphens w:val="0"/>
+              <w:jc w:val="right"/>
+              <w:cnfStyle w:val="000000000000" w:firstRow="0" w:lastRow="0" w:firstColumn="0" w:lastColumn="0" w:oddVBand="0" w:evenVBand="0" w:oddHBand="0" w:evenHBand="0" w:firstRowFirstColumn="0" w:firstRowLastColumn="0" w:lastRowFirstColumn="0" w:lastRowLastColumn="0"/>
+              <w:rPr>
+                <w:rFonts w:ascii="Times New Roman" w:hAnsi="Times New Roman"/>
+                <w:szCs w:val="24"/>
+              </w:rPr>
+            </w:pPr>
+            <w:r>
+              <w:rPr>
+                <w:rFonts w:ascii="Times New Roman" w:hAnsi="Times New Roman"/>
+                <w:szCs w:val="24"/>
+              </w:rPr>
+              <w:t>0</w:t>
+            </w:r>
+          </w:p>
+        </w:tc>
+        <w:tc>
+          <w:tcPr>
+            <w:tcW w:w="0" w:type="auto"/>
+            <w:hideMark/>
+          </w:tcPr>
+          <w:p>
+            <w:pPr>
+              <w:suppressAutoHyphens w:val="0"/>
+              <w:jc w:val="right"/>
+              <w:cnfStyle w:val="000000000000" w:firstRow="0" w:lastRow="0" w:firstColumn="0" w:lastColumn="0" w:oddVBand="0" w:evenVBand="0" w:oddHBand="0" w:evenHBand="0" w:firstRowFirstColumn="0" w:firstRowLastColumn="0" w:lastRowFirstColumn="0" w:lastRowLastColumn="0"/>
+              <w:rPr>
+                <w:rFonts w:ascii="Times New Roman" w:hAnsi="Times New Roman"/>
+                <w:szCs w:val="24"/>
+              </w:rPr>
+            </w:pPr>
+            <w:r>
+              <w:rPr>
+                <w:rFonts w:ascii="Times New Roman" w:hAnsi="Times New Roman"/>
+                <w:szCs w:val="24"/>
+              </w:rPr>
+              <w:t>3000</w:t>
+            </w:r>
+          </w:p>
+        </w:tc>
+        <w:tc>
+          <w:tcPr>
+            <w:tcW w:w="0" w:type="auto"/>
+            <w:hideMark/>
+          </w:tcPr>
+          <w:p>
+            <w:pPr>
+              <w:suppressAutoHyphens w:val="0"/>
+              <w:cnfStyle w:val="000000000000" w:firstRow="0" w:lastRow="0" w:firstColumn="0" w:lastColumn="0" w:oddVBand="0" w:evenVBand="0" w:oddHBand="0" w:evenHBand="0" w:firstRowFirstColumn="0" w:firstRowLastColumn="0" w:lastRowFirstColumn="0" w:lastRowLastColumn="0"/>
+              <w:rPr>
+                <w:rFonts w:ascii="Times New Roman" w:hAnsi="Times New Roman"/>
+                <w:szCs w:val="24"/>
+              </w:rPr>
+            </w:pPr>
+            <w:proofErr w:type="gramStart"/>
+            <w:r>
+              <w:rPr>
+                <w:rFonts w:ascii="Times New Roman" w:hAnsi="Times New Roman"/>
+                <w:szCs w:val="24"/>
+              </w:rPr>
+              <w:t>A</w:t>
+            </w:r>
+            <w:proofErr w:type="gramEnd"/>
+            <w:r>
+              <w:rPr>
+                <w:rFonts w:ascii="Times New Roman" w:hAnsi="Times New Roman"/>
+                <w:szCs w:val="24"/>
+              </w:rPr>
+              <w:t xml:space="preserve"> allowances: running = 1 x 1.0 A = 1000 mA; idle = 0; startup/stall design allowance = 1 x 3.0 A = 3000 mA.</w:t>
+            </w:r>
+          </w:p>
+        </w:tc>
+      </w:tr>
+      <w:tr>
+        <w:tc>
+          <w:tcPr>
+            <w:cnfStyle w:val="001000000000" w:firstRow="0" w:lastRow="0" w:firstColumn="1" w:lastColumn="0" w:oddVBand="0" w:evenVBand="0" w:oddHBand="0" w:evenHBand="0" w:firstRowFirstColumn="0" w:firstRowLastColumn="0" w:lastRowFirstColumn="0" w:lastRowLastColumn="0"/>
+            <w:tcW w:w="0" w:type="auto"/>
+            <w:hideMark/>
+          </w:tcPr>
+          <w:p>
+            <w:pPr>
+              <w:suppressAutoHyphens w:val="0"/>
+              <w:rPr>
+                <w:rFonts w:ascii="Times New Roman" w:hAnsi="Times New Roman"/>
+                <w:szCs w:val="24"/>
+              </w:rPr>
+            </w:pPr>
+            <w:r>
+              <w:rPr>
+                <w:rFonts w:ascii="Times New Roman" w:hAnsi="Times New Roman"/>
+                <w:szCs w:val="24"/>
+              </w:rPr>
+              <w:t>12 V</w:t>
+            </w:r>
+          </w:p>
+        </w:tc>
+        <w:tc>
+          <w:tcPr>
+            <w:tcW w:w="1719" w:type="dxa"/>
+            <w:hideMark/>
+          </w:tcPr>
+          <w:p>
+            <w:pPr>
+              <w:suppressAutoHyphens w:val="0"/>
+              <w:cnfStyle w:val="000000000000" w:firstRow="0" w:lastRow="0" w:firstColumn="0" w:lastColumn="0" w:oddVBand="0" w:evenVBand="0" w:oddHBand="0" w:evenHBand="0" w:firstRowFirstColumn="0" w:firstRowLastColumn="0" w:lastRowFirstColumn="0" w:lastRowLastColumn="0"/>
+              <w:rPr>
+                <w:rFonts w:ascii="Times New Roman" w:hAnsi="Times New Roman"/>
+                <w:szCs w:val="24"/>
+              </w:rPr>
+            </w:pPr>
+            <w:r>
+              <w:rPr>
+                <w:rFonts w:ascii="Times New Roman" w:hAnsi="Times New Roman"/>
+                <w:szCs w:val="24"/>
+              </w:rPr>
+              <w:t>DRV8231A supply overhead</w:t>
+            </w:r>
+          </w:p>
+        </w:tc>
+        <w:tc>
+          <w:tcPr>
+            <w:tcW w:w="885" w:type="dxa"/>
+            <w:hideMark/>
+          </w:tcPr>
+          <w:p>
+            <w:pPr>
+              <w:suppressAutoHyphens w:val="0"/>
+              <w:jc w:val="right"/>
+              <w:cnfStyle w:val="000000000000" w:firstRow="0" w:lastRow="0" w:firstColumn="0" w:lastColumn="0" w:oddVBand="0" w:evenVBand="0" w:oddHBand="0" w:evenHBand="0" w:firstRowFirstColumn="0" w:firstRowLastColumn="0" w:lastRowFirstColumn="0" w:lastRowLastColumn="0"/>
+              <w:rPr>
+                <w:rFonts w:ascii="Times New Roman" w:hAnsi="Times New Roman"/>
+                <w:szCs w:val="24"/>
+              </w:rPr>
+            </w:pPr>
+            <w:r>
+              <w:rPr>
+                <w:rFonts w:ascii="Times New Roman" w:hAnsi="Times New Roman"/>
+                <w:szCs w:val="24"/>
+              </w:rPr>
+              <w:t>3</w:t>
+            </w:r>
+          </w:p>
+        </w:tc>
+        <w:tc>
+          <w:tcPr>
+            <w:tcW w:w="0" w:type="auto"/>
+            <w:hideMark/>
+          </w:tcPr>
+          <w:p>
+            <w:pPr>
+              <w:suppressAutoHyphens w:val="0"/>
+              <w:jc w:val="right"/>
+              <w:cnfStyle w:val="000000000000" w:firstRow="0" w:lastRow="0" w:firstColumn="0" w:lastColumn="0" w:oddVBand="0" w:evenVBand="0" w:oddHBand="0" w:evenHBand="0" w:firstRowFirstColumn="0" w:firstRowLastColumn="0" w:lastRowFirstColumn="0" w:lastRowLastColumn="0"/>
+              <w:rPr>
+                <w:rFonts w:ascii="Times New Roman" w:hAnsi="Times New Roman"/>
+                <w:szCs w:val="24"/>
+              </w:rPr>
+            </w:pPr>
+            <w:r>
+              <w:rPr>
+                <w:rFonts w:ascii="Times New Roman" w:hAnsi="Times New Roman"/>
+                <w:szCs w:val="24"/>
+              </w:rPr>
+              <w:t>0.001</w:t>
+            </w:r>
+          </w:p>
+        </w:tc>
+        <w:tc>
+          <w:tcPr>
+            <w:tcW w:w="0" w:type="auto"/>
+            <w:hideMark/>
+          </w:tcPr>
+          <w:p>
+            <w:pPr>
+              <w:suppressAutoHyphens w:val="0"/>
+              <w:jc w:val="right"/>
+              <w:cnfStyle w:val="000000000000" w:firstRow="0" w:lastRow="0" w:firstColumn="0" w:lastColumn="0" w:oddVBand="0" w:evenVBand="0" w:oddHBand="0" w:evenHBand="0" w:firstRowFirstColumn="0" w:firstRowLastColumn="0" w:lastRowFirstColumn="0" w:lastRowLastColumn="0"/>
+              <w:rPr>
+                <w:rFonts w:ascii="Times New Roman" w:hAnsi="Times New Roman"/>
+                <w:szCs w:val="24"/>
+              </w:rPr>
+            </w:pPr>
+            <w:r>
+              <w:rPr>
+                <w:rFonts w:ascii="Times New Roman" w:hAnsi="Times New Roman"/>
+                <w:szCs w:val="24"/>
+              </w:rPr>
+              <w:t>4</w:t>
+            </w:r>
+          </w:p>
+        </w:tc>
+        <w:tc>
+          <w:tcPr>
+            <w:tcW w:w="0" w:type="auto"/>
+            <w:hideMark/>
+          </w:tcPr>
+          <w:p>
+            <w:pPr>
+              <w:suppressAutoHyphens w:val="0"/>
+              <w:cnfStyle w:val="000000000000" w:firstRow="0" w:lastRow="0" w:firstColumn="0" w:lastColumn="0" w:oddVBand="0" w:evenVBand="0" w:oddHBand="0" w:evenHBand="0" w:firstRowFirstColumn="0" w:firstRowLastColumn="0" w:lastRowFirstColumn="0" w:lastRowLastColumn="0"/>
+              <w:rPr>
+                <w:rFonts w:ascii="Times New Roman" w:hAnsi="Times New Roman"/>
+                <w:szCs w:val="24"/>
+              </w:rPr>
+            </w:pPr>
+            <w:r>
+              <w:rPr>
+                <w:rFonts w:ascii="Times New Roman" w:hAnsi="Times New Roman"/>
+                <w:szCs w:val="24"/>
+              </w:rPr>
+              <w:t xml:space="preserve">D references at VM = 24 V: active typical = 3 mA; sleep maximum = 1 </w:t>
+            </w:r>
+            <w:proofErr w:type="spellStart"/>
+            <w:r>
+              <w:rPr>
+                <w:rFonts w:ascii="Times New Roman" w:hAnsi="Times New Roman"/>
+                <w:szCs w:val="24"/>
+              </w:rPr>
+              <w:t>uA</w:t>
+            </w:r>
+            <w:proofErr w:type="spellEnd"/>
+            <w:r>
+              <w:rPr>
+                <w:rFonts w:ascii="Times New Roman" w:hAnsi="Times New Roman"/>
+                <w:szCs w:val="24"/>
+              </w:rPr>
+              <w:t xml:space="preserve"> / 1000 = 0.001 mA; active maximum = 4 mA. Using these at 12 V is A.</w:t>
+            </w:r>
+          </w:p>
+        </w:tc>
+      </w:tr>
+      <w:tr>
+        <w:tc>
+          <w:tcPr>
+            <w:cnfStyle w:val="001000000000" w:firstRow="0" w:lastRow="0" w:firstColumn="1" w:lastColumn="0" w:oddVBand="0" w:evenVBand="0" w:oddHBand="0" w:evenHBand="0" w:firstRowFirstColumn="0" w:firstRowLastColumn="0" w:lastRowFirstColumn="0" w:lastRowLastColumn="0"/>
+            <w:tcW w:w="0" w:type="auto"/>
+            <w:hideMark/>
+          </w:tcPr>
+          <w:p>
+            <w:pPr>
+              <w:suppressAutoHyphens w:val="0"/>
+              <w:rPr>
+                <w:rFonts w:ascii="Times New Roman" w:hAnsi="Times New Roman"/>
+                <w:szCs w:val="24"/>
+              </w:rPr>
+            </w:pPr>
+            <w:r>
+              <w:rPr>
+                <w:rFonts w:ascii="Times New Roman" w:hAnsi="Times New Roman"/>
+                <w:szCs w:val="24"/>
+              </w:rPr>
+              <w:t>12 V</w:t>
+            </w:r>
+          </w:p>
+        </w:tc>
+        <w:tc>
+          <w:tcPr>
+            <w:tcW w:w="1719" w:type="dxa"/>
+            <w:hideMark/>
+          </w:tcPr>
+          <w:p>
+            <w:pPr>
+              <w:suppressAutoHyphens w:val="0"/>
+              <w:cnfStyle w:val="000000000000" w:firstRow="0" w:lastRow="0" w:firstColumn="0" w:lastColumn="0" w:oddVBand="0" w:evenVBand="0" w:oddHBand="0" w:evenHBand="0" w:firstRowFirstColumn="0" w:firstRowLastColumn="0" w:lastRowFirstColumn="0" w:lastRowLastColumn="0"/>
+              <w:rPr>
+                <w:rFonts w:ascii="Times New Roman" w:hAnsi="Times New Roman"/>
+                <w:szCs w:val="24"/>
+              </w:rPr>
+            </w:pPr>
+            <w:r>
+              <w:rPr>
+                <w:rFonts w:ascii="Times New Roman" w:hAnsi="Times New Roman"/>
+                <w:szCs w:val="24"/>
+              </w:rPr>
+              <w:t>Mfeeder1 solenoid</w:t>
+            </w:r>
+          </w:p>
+        </w:tc>
+        <w:tc>
+          <w:tcPr>
+            <w:tcW w:w="885" w:type="dxa"/>
+            <w:hideMark/>
+          </w:tcPr>
+          <w:p>
+            <w:pPr>
+              <w:suppressAutoHyphens w:val="0"/>
+              <w:jc w:val="right"/>
+              <w:cnfStyle w:val="000000000000" w:firstRow="0" w:lastRow="0" w:firstColumn="0" w:lastColumn="0" w:oddVBand="0" w:evenVBand="0" w:oddHBand="0" w:evenHBand="0" w:firstRowFirstColumn="0" w:firstRowLastColumn="0" w:lastRowFirstColumn="0" w:lastRowLastColumn="0"/>
+              <w:rPr>
+                <w:rFonts w:ascii="Times New Roman" w:hAnsi="Times New Roman"/>
+                <w:szCs w:val="24"/>
+              </w:rPr>
+            </w:pPr>
+            <w:r>
+              <w:rPr>
+                <w:rFonts w:ascii="Times New Roman" w:hAnsi="Times New Roman"/>
+                <w:szCs w:val="24"/>
+              </w:rPr>
+              <w:t>1200</w:t>
+            </w:r>
+          </w:p>
+        </w:tc>
+        <w:tc>
+          <w:tcPr>
+            <w:tcW w:w="0" w:type="auto"/>
+            <w:hideMark/>
+          </w:tcPr>
+          <w:p>
+            <w:pPr>
+              <w:suppressAutoHyphens w:val="0"/>
+              <w:jc w:val="right"/>
+              <w:cnfStyle w:val="000000000000" w:firstRow="0" w:lastRow="0" w:firstColumn="0" w:lastColumn="0" w:oddVBand="0" w:evenVBand="0" w:oddHBand="0" w:evenHBand="0" w:firstRowFirstColumn="0" w:firstRowLastColumn="0" w:lastRowFirstColumn="0" w:lastRowLastColumn="0"/>
+              <w:rPr>
+                <w:rFonts w:ascii="Times New Roman" w:hAnsi="Times New Roman"/>
+                <w:szCs w:val="24"/>
+              </w:rPr>
+            </w:pPr>
+            <w:r>
+              <w:rPr>
+                <w:rFonts w:ascii="Times New Roman" w:hAnsi="Times New Roman"/>
+                <w:szCs w:val="24"/>
+              </w:rPr>
+              <w:t>0</w:t>
+            </w:r>
+          </w:p>
+        </w:tc>
+        <w:tc>
+          <w:tcPr>
+            <w:tcW w:w="0" w:type="auto"/>
+            <w:hideMark/>
+          </w:tcPr>
+          <w:p>
+            <w:pPr>
+              <w:suppressAutoHyphens w:val="0"/>
+              <w:jc w:val="right"/>
+              <w:cnfStyle w:val="000000000000" w:firstRow="0" w:lastRow="0" w:firstColumn="0" w:lastColumn="0" w:oddVBand="0" w:evenVBand="0" w:oddHBand="0" w:evenHBand="0" w:firstRowFirstColumn="0" w:firstRowLastColumn="0" w:lastRowFirstColumn="0" w:lastRowLastColumn="0"/>
+              <w:rPr>
+                <w:rFonts w:ascii="Times New Roman" w:hAnsi="Times New Roman"/>
+                <w:szCs w:val="24"/>
+              </w:rPr>
+            </w:pPr>
+            <w:r>
+              <w:rPr>
+                <w:rFonts w:ascii="Times New Roman" w:hAnsi="Times New Roman"/>
+                <w:szCs w:val="24"/>
+              </w:rPr>
+              <w:t>1200</w:t>
+            </w:r>
+          </w:p>
+        </w:tc>
+        <w:tc>
+          <w:tcPr>
+            <w:tcW w:w="0" w:type="auto"/>
+            <w:hideMark/>
+          </w:tcPr>
+          <w:p>
+            <w:pPr>
+              <w:suppressAutoHyphens w:val="0"/>
+              <w:cnfStyle w:val="000000000000" w:firstRow="0" w:lastRow="0" w:firstColumn="0" w:lastColumn="0" w:oddVBand="0" w:evenVBand="0" w:oddHBand="0" w:evenHBand="0" w:firstRowFirstColumn="0" w:firstRowLastColumn="0" w:lastRowFirstColumn="0" w:lastRowLastColumn="0"/>
+              <w:rPr>
+                <w:rFonts w:ascii="Times New Roman" w:hAnsi="Times New Roman"/>
+                <w:szCs w:val="24"/>
+              </w:rPr>
+            </w:pPr>
+            <w:r>
+              <w:rPr>
+                <w:rFonts w:ascii="Times New Roman" w:hAnsi="Times New Roman"/>
+                <w:szCs w:val="24"/>
+              </w:rPr>
+              <w:t>S energized current: 1.2 A x 1000 = 1200 mA. Equivalent resistance = 12 V / 1.2 A = 10 Ohm. Idle = 0. Design uses the supplied 1200 mA on-current, not a verified maximum.</w:t>
+            </w:r>
+          </w:p>
+        </w:tc>
+      </w:tr>
+      <w:tr>
+        <w:tc>
+          <w:tcPr>
+            <w:cnfStyle w:val="001000000000" w:firstRow="0" w:lastRow="0" w:firstColumn="1" w:lastColumn="0" w:oddVBand="0" w:evenVBand="0" w:oddHBand="0" w:evenHBand="0" w:firstRowFirstColumn="0" w:firstRowLastColumn="0" w:lastRowFirstColumn="0" w:lastRowLastColumn="0"/>
+            <w:tcW w:w="0" w:type="auto"/>
+            <w:hideMark/>
+          </w:tcPr>
+          <w:p>
+            <w:pPr>
+              <w:suppressAutoHyphens w:val="0"/>
+              <w:rPr>
+                <w:rFonts w:ascii="Times New Roman" w:hAnsi="Times New Roman"/>
+                <w:szCs w:val="24"/>
+              </w:rPr>
+            </w:pPr>
+            <w:r>
+              <w:rPr>
+                <w:rFonts w:ascii="Times New Roman" w:hAnsi="Times New Roman"/>
+                <w:szCs w:val="24"/>
+              </w:rPr>
+              <w:t>12 V</w:t>
+            </w:r>
+          </w:p>
+        </w:tc>
+        <w:tc>
+          <w:tcPr>
+            <w:tcW w:w="1719" w:type="dxa"/>
+            <w:hideMark/>
+          </w:tcPr>
+          <w:p>
+            <w:pPr>
+              <w:suppressAutoHyphens w:val="0"/>
+              <w:cnfStyle w:val="000000000000" w:firstRow="0" w:lastRow="0" w:firstColumn="0" w:lastColumn="0" w:oddVBand="0" w:evenVBand="0" w:oddHBand="0" w:evenHBand="0" w:firstRowFirstColumn="0" w:firstRowLastColumn="0" w:lastRowFirstColumn="0" w:lastRowLastColumn="0"/>
+              <w:rPr>
+                <w:rFonts w:ascii="Times New Roman" w:hAnsi="Times New Roman"/>
+                <w:szCs w:val="24"/>
+              </w:rPr>
+            </w:pPr>
+            <w:r>
+              <w:rPr>
+                <w:rFonts w:ascii="Times New Roman" w:hAnsi="Times New Roman"/>
+                <w:szCs w:val="24"/>
+              </w:rPr>
+              <w:t>Other leakage</w:t>
+            </w:r>
+          </w:p>
+        </w:tc>
+        <w:tc>
+          <w:tcPr>
+            <w:tcW w:w="885" w:type="dxa"/>
+            <w:hideMark/>
+          </w:tcPr>
+          <w:p>
+            <w:pPr>
+              <w:suppressAutoHyphens w:val="0"/>
+              <w:jc w:val="right"/>
+              <w:cnfStyle w:val="000000000000" w:firstRow="0" w:lastRow="0" w:firstColumn="0" w:lastColumn="0" w:oddVBand="0" w:evenVBand="0" w:oddHBand="0" w:evenHBand="0" w:firstRowFirstColumn="0" w:firstRowLastColumn="0" w:lastRowFirstColumn="0" w:lastRowLastColumn="0"/>
+              <w:rPr>
+                <w:rFonts w:ascii="Times New Roman" w:hAnsi="Times New Roman"/>
+                <w:szCs w:val="24"/>
+              </w:rPr>
+            </w:pPr>
+            <w:r>
+              <w:rPr>
+                <w:rFonts w:ascii="Times New Roman" w:hAnsi="Times New Roman"/>
+                <w:szCs w:val="24"/>
+              </w:rPr>
+              <w:t>0.100</w:t>
+            </w:r>
+          </w:p>
+        </w:tc>
+        <w:tc>
+          <w:tcPr>
+            <w:tcW w:w="0" w:type="auto"/>
+            <w:hideMark/>
+          </w:tcPr>
+          <w:p>
+            <w:pPr>
+              <w:suppressAutoHyphens w:val="0"/>
+              <w:jc w:val="right"/>
+              <w:cnfStyle w:val="000000000000" w:firstRow="0" w:lastRow="0" w:firstColumn="0" w:lastColumn="0" w:oddVBand="0" w:evenVBand="0" w:oddHBand="0" w:evenHBand="0" w:firstRowFirstColumn="0" w:firstRowLastColumn="0" w:lastRowFirstColumn="0" w:lastRowLastColumn="0"/>
+              <w:rPr>
+                <w:rFonts w:ascii="Times New Roman" w:hAnsi="Times New Roman"/>
+                <w:szCs w:val="24"/>
+              </w:rPr>
+            </w:pPr>
+            <w:r>
+              <w:rPr>
+                <w:rFonts w:ascii="Times New Roman" w:hAnsi="Times New Roman"/>
+                <w:szCs w:val="24"/>
+              </w:rPr>
+              <w:t>0.100</w:t>
+            </w:r>
+          </w:p>
+        </w:tc>
+        <w:tc>
+          <w:tcPr>
+            <w:tcW w:w="0" w:type="auto"/>
+            <w:hideMark/>
+          </w:tcPr>
+          <w:p>
+            <w:pPr>
+              <w:suppressAutoHyphens w:val="0"/>
+              <w:jc w:val="right"/>
+              <w:cnfStyle w:val="000000000000" w:firstRow="0" w:lastRow="0" w:firstColumn="0" w:lastColumn="0" w:oddVBand="0" w:evenVBand="0" w:oddHBand="0" w:evenHBand="0" w:firstRowFirstColumn="0" w:firstRowLastColumn="0" w:lastRowFirstColumn="0" w:lastRowLastColumn="0"/>
+              <w:rPr>
+                <w:rFonts w:ascii="Times New Roman" w:hAnsi="Times New Roman"/>
+                <w:szCs w:val="24"/>
+              </w:rPr>
+            </w:pPr>
+            <w:r>
+              <w:rPr>
+                <w:rFonts w:ascii="Times New Roman" w:hAnsi="Times New Roman"/>
+                <w:szCs w:val="24"/>
+              </w:rPr>
+              <w:t>1.000</w:t>
+            </w:r>
+          </w:p>
+        </w:tc>
+        <w:tc>
+          <w:tcPr>
+            <w:tcW w:w="0" w:type="auto"/>
+            <w:hideMark/>
+          </w:tcPr>
+          <w:p>
+            <w:pPr>
+              <w:suppressAutoHyphens w:val="0"/>
+              <w:cnfStyle w:val="000000000000" w:firstRow="0" w:lastRow="0" w:firstColumn="0" w:lastColumn="0" w:oddVBand="0" w:evenVBand="0" w:oddHBand="0" w:evenHBand="0" w:firstRowFirstColumn="0" w:firstRowLastColumn="0" w:lastRowFirstColumn="0" w:lastRowLastColumn="0"/>
+              <w:rPr>
+                <w:rFonts w:ascii="Times New Roman" w:hAnsi="Times New Roman"/>
+                <w:szCs w:val="24"/>
+              </w:rPr>
+            </w:pPr>
+            <w:proofErr w:type="gramStart"/>
+            <w:r>
+              <w:rPr>
+                <w:rFonts w:ascii="Times New Roman" w:hAnsi="Times New Roman"/>
+                <w:szCs w:val="24"/>
+              </w:rPr>
+              <w:t>A</w:t>
+            </w:r>
+            <w:proofErr w:type="gramEnd"/>
+            <w:r>
+              <w:rPr>
+                <w:rFonts w:ascii="Times New Roman" w:hAnsi="Times New Roman"/>
+                <w:szCs w:val="24"/>
+              </w:rPr>
+              <w:t xml:space="preserve"> aggregate allowance: active = 0.100 mA; idle = 0.100 mA; design = 1.000 mA.</w:t>
+            </w:r>
+          </w:p>
+        </w:tc>
+      </w:tr>
+    </w:tbl>
+    <w:p>
+      <w:pPr>
+        <w:rPr>
+          <w:rFonts w:ascii="Times New Roman" w:hAnsi="Times New Roman"/>
+          <w:color w:val="000000"/>
+          <w:szCs w:val="24"/>
+        </w:rPr>
+      </w:pPr>
     </w:p>
     <w:p>
       <w:pPr>
@@ -1557,7 +5966,6 @@
           <w:sz w:val="24"/>
           <w:szCs w:val="24"/>
         </w:rPr>
-        <w:lastRenderedPageBreak/>
         <w:t>What</w:t>
       </w:r>
       <w:r>
@@ -4413,6 +8821,71 @@
       <w:u w:val="single"/>
     </w:rPr>
   </w:style>
+  <w:style w:type="character" w:styleId="Strong">
+    <w:name w:val="Strong"/>
+    <w:basedOn w:val="DefaultParagraphFont"/>
+    <w:uiPriority w:val="22"/>
+    <w:qFormat/>
+    <w:rsid w:val="001318E4"/>
+    <w:rPr>
+      <w:b/>
+      <w:bCs/>
+    </w:rPr>
+  </w:style>
+  <w:style w:type="table" w:styleId="GridTable1Light-Accent1">
+    <w:name w:val="Grid Table 1 Light Accent 1"/>
+    <w:basedOn w:val="TableNormal"/>
+    <w:uiPriority w:val="46"/>
+    <w:rsid w:val="001318E4"/>
+    <w:tblPr>
+      <w:tblStyleRowBandSize w:val="1"/>
+      <w:tblStyleColBandSize w:val="1"/>
+      <w:tblBorders>
+        <w:top w:val="single" w:sz="4" w:space="0" w:color="83CAEB" w:themeColor="accent1" w:themeTint="66"/>
+        <w:left w:val="single" w:sz="4" w:space="0" w:color="83CAEB" w:themeColor="accent1" w:themeTint="66"/>
+        <w:bottom w:val="single" w:sz="4" w:space="0" w:color="83CAEB" w:themeColor="accent1" w:themeTint="66"/>
+        <w:right w:val="single" w:sz="4" w:space="0" w:color="83CAEB" w:themeColor="accent1" w:themeTint="66"/>
+        <w:insideH w:val="single" w:sz="4" w:space="0" w:color="83CAEB" w:themeColor="accent1" w:themeTint="66"/>
+        <w:insideV w:val="single" w:sz="4" w:space="0" w:color="83CAEB" w:themeColor="accent1" w:themeTint="66"/>
+      </w:tblBorders>
+    </w:tblPr>
+    <w:tblStylePr w:type="firstRow">
+      <w:rPr>
+        <w:b/>
+        <w:bCs/>
+      </w:rPr>
+      <w:tblPr/>
+      <w:tcPr>
+        <w:tcBorders>
+          <w:bottom w:val="single" w:sz="12" w:space="0" w:color="45B0E1" w:themeColor="accent1" w:themeTint="99"/>
+        </w:tcBorders>
+      </w:tcPr>
+    </w:tblStylePr>
+    <w:tblStylePr w:type="lastRow">
+      <w:rPr>
+        <w:b/>
+        <w:bCs/>
+      </w:rPr>
+      <w:tblPr/>
+      <w:tcPr>
+        <w:tcBorders>
+          <w:top w:val="double" w:sz="2" w:space="0" w:color="45B0E1" w:themeColor="accent1" w:themeTint="99"/>
+        </w:tcBorders>
+      </w:tcPr>
+    </w:tblStylePr>
+    <w:tblStylePr w:type="firstCol">
+      <w:rPr>
+        <w:b/>
+        <w:bCs/>
+      </w:rPr>
+    </w:tblStylePr>
+    <w:tblStylePr w:type="lastCol">
+      <w:rPr>
+        <w:b/>
+        <w:bCs/>
+      </w:rPr>
+    </w:tblStylePr>
+  </w:style>
 </w:styles>
 </file>
 

</xml_diff>